<commit_message>
metrics: add control epochs and robust skew windows
</commit_message>
<xml_diff>
--- a/docs/SyncCinema_Engineering_Journal.docx
+++ b/docs/SyncCinema_Engineering_Journal.docx
@@ -187,7 +187,7 @@
                 <w:color w:val="1E2630"/>
                 <w:sz w:val="19"/>
               </w:rPr>
-              <w:t>当前基线提交</w:t>
+              <w:t>当前已发布提交</w:t>
             </w:r>
           </w:p>
         </w:tc>
@@ -206,7 +206,7 @@
                 <w:color w:val="1E2630"/>
                 <w:sz w:val="19"/>
               </w:rPr>
-              <w:t>02f6aba - heartbeat RTT tracking and latency measurements</w:t>
+              <w:t>2c1bf4f - pairwise playback skew analysis</w:t>
             </w:r>
           </w:p>
         </w:tc>
@@ -247,7 +247,7 @@
                 <w:color w:val="1E2630"/>
                 <w:sz w:val="19"/>
               </w:rPr>
-              <w:t>客户端间相对播放偏差测量</w:t>
+              <w:t>公网指标验证、控制 epoch 与稳健偏差窗口</w:t>
             </w:r>
           </w:p>
         </w:tc>
@@ -1077,6 +1077,65 @@
           </w:p>
         </w:tc>
       </w:tr>
+      <w:tr>
+        <w:tc>
+          <w:tcPr>
+            <w:tcW w:type="dxa" w:w="1450"/>
+          </w:tcPr>
+          <w:p>
+            <w:pPr>
+              <w:spacing w:before="0" w:after="0" w:line="276" w:lineRule="auto"/>
+              <w:jc w:val="center"/>
+            </w:pPr>
+            <w:r>
+              <w:rPr>
+                <w:rFonts w:ascii="Consolas" w:hAnsi="Consolas" w:eastAsia="Consolas"/>
+                <w:color w:val="1E2630"/>
+                <w:sz w:val="17"/>
+              </w:rPr>
+              <w:t>2c1bf4f</w:t>
+            </w:r>
+          </w:p>
+        </w:tc>
+        <w:tc>
+          <w:tcPr>
+            <w:tcW w:type="dxa" w:w="3300"/>
+          </w:tcPr>
+          <w:p>
+            <w:pPr>
+              <w:spacing w:before="0" w:after="0" w:line="276" w:lineRule="auto"/>
+              <w:jc w:val="left"/>
+            </w:pPr>
+            <w:r>
+              <w:rPr>
+                <w:rFonts w:ascii="Microsoft YaHei" w:hAnsi="Microsoft YaHei" w:eastAsia="Microsoft YaHei"/>
+                <w:color w:val="1E2630"/>
+                <w:sz w:val="18"/>
+              </w:rPr>
+              <w:t>pairwise playback skew analysis</w:t>
+            </w:r>
+          </w:p>
+        </w:tc>
+        <w:tc>
+          <w:tcPr>
+            <w:tcW w:type="dxa" w:w="4610"/>
+          </w:tcPr>
+          <w:p>
+            <w:pPr>
+              <w:spacing w:before="0" w:after="0" w:line="276" w:lineRule="auto"/>
+              <w:jc w:val="left"/>
+            </w:pPr>
+            <w:r>
+              <w:rPr>
+                <w:rFonts w:ascii="Microsoft YaHei" w:hAnsi="Microsoft YaHei" w:eastAsia="Microsoft YaHei"/>
+                <w:color w:val="1E2630"/>
+                <w:sz w:val="18"/>
+              </w:rPr>
+              <w:t>把两端上报投影到同一时刻，直接测量客户端间偏差</w:t>
+            </w:r>
+          </w:p>
+        </w:tc>
+      </w:tr>
     </w:tbl>
     <w:p>
       <w:pPr>
@@ -1739,7 +1798,7 @@
         <w:pStyle w:val="Heading2"/>
       </w:pPr>
       <w:r>
-        <w:t>3.6 验证证据</w:t>
+        <w:t>3.6 本地验证证据</w:t>
       </w:r>
     </w:p>
     <w:p>
@@ -1823,7 +1882,104 @@
         <w:pStyle w:val="Heading2"/>
       </w:pPr>
       <w:r>
-        <w:t>3.7 仍未解决的边界</w:t>
+        <w:t>3.7 公网真实播放器验证</w:t>
+      </w:r>
+    </w:p>
+    <w:p>
+      <w:pPr>
+        <w:spacing w:before="0" w:after="120" w:line="300" w:lineRule="auto"/>
+      </w:pPr>
+      <w:r>
+        <w:rPr>
+          <w:rFonts w:ascii="Microsoft YaHei" w:hAnsi="Microsoft YaHei" w:eastAsia="Microsoft YaHei"/>
+          <w:color w:val="1E2630"/>
+          <w:sz w:val="21"/>
+        </w:rPr>
+        <w:t>提交 2c1bf4f 部署到 Linux 云服务器后，使用两份真实 Windows libVLC client 播放同一个 HTTP 视频。这次验证不是只看“命令有没有广播”，而是同时观察 RTT、client-to-Room 和 pair_progress 三组指标。</w:t>
+      </w:r>
+    </w:p>
+    <w:p>
+      <w:pPr>
+        <w:pStyle w:val="ListNumber"/>
+      </w:pPr>
+      <w:r>
+        <w:rPr>
+          <w:rFonts w:ascii="Microsoft YaHei" w:hAnsi="Microsoft YaHei" w:eastAsia="Microsoft YaHei"/>
+          <w:color w:val="1E2630"/>
+          <w:sz w:val="21"/>
+        </w:rPr>
+        <w:t>两台 client 到云服务器的 RTT 稳定在约 23-28 ms，说明控制链路本身没有明显拥塞。</w:t>
+      </w:r>
+    </w:p>
+    <w:p>
+      <w:pPr>
+        <w:pStyle w:val="ListNumber"/>
+      </w:pPr>
+      <w:r>
+        <w:rPr>
+          <w:rFonts w:ascii="Microsoft YaHei" w:hAnsi="Microsoft YaHei" w:eastAsia="Microsoft YaHei"/>
+          <w:color w:val="1E2630"/>
+          <w:sz w:val="21"/>
+        </w:rPr>
+        <w:t>暂停后两端真实播放器位置分别约为 74651 ms 与 74653 ms，pair_diff 约为 -2 ms。</w:t>
+      </w:r>
+    </w:p>
+    <w:p>
+      <w:pPr>
+        <w:pStyle w:val="ListNumber"/>
+      </w:pPr>
+      <w:r>
+        <w:rPr>
+          <w:rFonts w:ascii="Microsoft YaHei" w:hAnsi="Microsoft YaHei" w:eastAsia="Microsoft YaHei"/>
+          <w:color w:val="1E2630"/>
+          <w:sz w:val="21"/>
+        </w:rPr>
+        <w:t>同一时刻 client-to-Room 仍可达到约 -939 ms，证明 Room 理论时钟的落后量不能直接代表观众间偏差。</w:t>
+      </w:r>
+    </w:p>
+    <w:p>
+      <w:pPr>
+        <w:pStyle w:val="ListNumber"/>
+      </w:pPr>
+      <w:r>
+        <w:rPr>
+          <w:rFonts w:ascii="Microsoft YaHei" w:hAnsi="Microsoft YaHei" w:eastAsia="Microsoft YaHei"/>
+          <w:color w:val="1E2630"/>
+          <w:sz w:val="21"/>
+        </w:rPr>
+        <w:t>播放过程中 pair_diff 常呈现约 250 ms 的台阶，暴露出 libVLC 时间读数粒度、异步播放和每秒上报采样的共同影响。</w:t>
+      </w:r>
+    </w:p>
+    <w:p>
+      <w:pPr>
+        <w:spacing w:before="120" w:after="160" w:line="300" w:lineRule="auto"/>
+        <w:shd w:fill="F4F6F9"/>
+        <w:ind w:left="160" w:right="160"/>
+      </w:pPr>
+      <w:r>
+        <w:rPr>
+          <w:rFonts w:ascii="Microsoft YaHei" w:hAnsi="Microsoft YaHei" w:eastAsia="Microsoft YaHei"/>
+          <w:b/>
+          <w:color w:val="1F4D78"/>
+          <w:sz w:val="21"/>
+        </w:rPr>
+        <w:t>数据结论：</w:t>
+      </w:r>
+      <w:r>
+        <w:rPr>
+          <w:rFonts w:ascii="Microsoft YaHei" w:hAnsi="Microsoft YaHei" w:eastAsia="Microsoft YaHei"/>
+          <w:color w:val="1E2630"/>
+          <w:sz w:val="21"/>
+        </w:rPr>
+        <w:t>端到端同步观感已经较好，但单条 pair_diff 仍会被采样相位和播放器读数抖动影响。因此下一阶段不应立即按单个样本 seek，而应先建立控制周期和稳健统计窗口。</w:t>
+      </w:r>
+    </w:p>
+    <w:p>
+      <w:pPr>
+        <w:pStyle w:val="Heading2"/>
+      </w:pPr>
+      <w:r>
+        <w:t>3.8 仍未解决的边界</w:t>
       </w:r>
     </w:p>
     <w:p>
@@ -1896,7 +2052,15 @@
         <w:pStyle w:val="Heading1"/>
       </w:pPr>
       <w:r>
-        <w:t>4. 面试表达模板</w:t>
+        <w:t>4. 本地阶段：控制 epoch 与稳健偏差窗口</w:t>
+      </w:r>
+    </w:p>
+    <w:p>
+      <w:pPr>
+        <w:pStyle w:val="Heading2"/>
+      </w:pPr>
+      <w:r>
+        <w:t>4.1 为什么必须划分控制周期</w:t>
       </w:r>
     </w:p>
     <w:p>
@@ -1909,7 +2073,886 @@
           <w:color w:val="1E2630"/>
           <w:sz w:val="21"/>
         </w:rPr>
-        <w:t>可以这样说明本阶段：最初我用服务器 Room 的理论时钟评估每个客户端，但公网测试发现两端都可能因 libVLC 缓冲共同落后 Room 几百毫秒，这个指标不能直接代表观众之间不同步。于是我保留 client-to-Room 指标用于诊断，另外缓存每个 client 的最近上报，结合 RTT/2 和 server steady_clock，把异步到达的进度投影到同一时刻后计算 pair_diff。同时过滤陈旧样本和状态不一致样本，并坚持先观测后控制，为后续自动纠偏建立可信数据基础。</w:t>
+        <w:t>PLAY、PAUSE、SEEK 会改变播放状态或基准位置。若 SEEK 前后的样本继续累计在同一组平均值中，旧周期的最大值、平均值和最近窗口都会污染新周期，后续自动纠偏就可能依据过期事实做决定。因此每条有效控制命令都会开启新的 playback epoch。</w:t>
+      </w:r>
+    </w:p>
+    <w:p>
+      <w:pPr>
+        <w:spacing w:before="80" w:after="160" w:line="264" w:lineRule="auto"/>
+        <w:shd w:fill="F7F8FA"/>
+        <w:ind w:left="180" w:right="180"/>
+      </w:pPr>
+      <w:r>
+        <w:rPr>
+          <w:rFonts w:ascii="Consolas" w:hAnsi="Consolas" w:eastAsia="Consolas"/>
+          <w:color w:val="1E2630"/>
+          <w:sz w:val="17"/>
+        </w:rPr>
+        <w:t>PLAY / PAUSE / SEEK accepted</w:t>
+        <w:br/>
+      </w:r>
+      <w:r>
+        <w:rPr>
+          <w:rFonts w:ascii="Consolas" w:hAnsi="Consolas" w:eastAsia="Consolas"/>
+          <w:color w:val="1E2630"/>
+          <w:sz w:val="17"/>
+        </w:rPr>
+        <w:t xml:space="preserve">  -&gt; Room applies command and broadcasts it</w:t>
+        <w:br/>
+      </w:r>
+      <w:r>
+        <w:rPr>
+          <w:rFonts w:ascii="Consolas" w:hAnsi="Consolas" w:eastAsia="Consolas"/>
+          <w:color w:val="1E2630"/>
+          <w:sz w:val="17"/>
+        </w:rPr>
+        <w:t xml:space="preserve">  -&gt; metrics.beginControlEpoch(command)</w:t>
+        <w:br/>
+      </w:r>
+      <w:r>
+        <w:rPr>
+          <w:rFonts w:ascii="Consolas" w:hAnsi="Consolas" w:eastAsia="Consolas"/>
+          <w:color w:val="1E2630"/>
+          <w:sz w:val="17"/>
+        </w:rPr>
+        <w:t xml:space="preserve">  -&gt; epoch += 1</w:t>
+        <w:br/>
+      </w:r>
+      <w:r>
+        <w:rPr>
+          <w:rFonts w:ascii="Consolas" w:hAnsi="Consolas" w:eastAsia="Consolas"/>
+          <w:color w:val="1E2630"/>
+          <w:sz w:val="17"/>
+        </w:rPr>
+        <w:t xml:space="preserve">  -&gt; clear progress and pair-window statistics</w:t>
+        <w:br/>
+      </w:r>
+      <w:r>
+        <w:rPr>
+          <w:rFonts w:ascii="Consolas" w:hAnsi="Consolas" w:eastAsia="Consolas"/>
+          <w:color w:val="1E2630"/>
+          <w:sz w:val="17"/>
+        </w:rPr>
+        <w:t xml:space="preserve">  -&gt; keep RTT statistics</w:t>
+      </w:r>
+    </w:p>
+    <w:p>
+      <w:pPr>
+        <w:pStyle w:val="ListBullet"/>
+      </w:pPr>
+      <w:r>
+        <w:rPr>
+          <w:rFonts w:ascii="Microsoft YaHei" w:hAnsi="Microsoft YaHei" w:eastAsia="Microsoft YaHei"/>
+          <w:color w:val="1E2630"/>
+          <w:sz w:val="21"/>
+        </w:rPr>
+        <w:t>RTT 描述网络链路，不会因为一次 seek 自动失效，因此跨 epoch 保留。</w:t>
+      </w:r>
+    </w:p>
+    <w:p>
+      <w:pPr>
+        <w:pStyle w:val="ListBullet"/>
+      </w:pPr>
+      <w:r>
+        <w:rPr>
+          <w:rFonts w:ascii="Microsoft YaHei" w:hAnsi="Microsoft YaHei" w:eastAsia="Microsoft YaHei"/>
+          <w:color w:val="1E2630"/>
+          <w:sz w:val="21"/>
+        </w:rPr>
+        <w:t>进度偏差描述某次控制后的播放结果，必须在新 epoch 中重新采样。</w:t>
+      </w:r>
+    </w:p>
+    <w:p>
+      <w:pPr>
+        <w:pStyle w:val="ListBullet"/>
+      </w:pPr>
+      <w:r>
+        <w:rPr>
+          <w:rFonts w:ascii="Microsoft YaHei" w:hAnsi="Microsoft YaHei" w:eastAsia="Microsoft YaHei"/>
+          <w:color w:val="1E2630"/>
+          <w:sz w:val="21"/>
+        </w:rPr>
+        <w:t>控制命令与 REPORT 共用 controlCommandMutex，避免读到“新 Room 状态 + 旧 epoch”这样的撕裂快照。</w:t>
+      </w:r>
+    </w:p>
+    <w:p>
+      <w:pPr>
+        <w:pStyle w:val="Heading2"/>
+      </w:pPr>
+      <w:r>
+        <w:t>4.2 为什么先等待 2 秒</w:t>
+      </w:r>
+    </w:p>
+    <w:p>
+      <w:pPr>
+        <w:spacing w:before="0" w:after="120" w:line="300" w:lineRule="auto"/>
+      </w:pPr>
+      <w:r>
+        <w:rPr>
+          <w:rFonts w:ascii="Microsoft YaHei" w:hAnsi="Microsoft YaHei" w:eastAsia="Microsoft YaHei"/>
+          <w:color w:val="1E2630"/>
+          <w:sz w:val="21"/>
+        </w:rPr>
+        <w:t>libVLC 的控制 API 是异步的。命令刚返回时，播放器可能仍在缓冲、解码或寻找关键帧。新 epoch 的前 2 秒被标记为 settling：日志仍然保留，便于诊断控制响应，但这些过渡样本不进入长期偏差统计和 pair 窗口。</w:t>
+      </w:r>
+    </w:p>
+    <w:p>
+      <w:pPr>
+        <w:spacing w:before="120" w:after="160" w:line="300" w:lineRule="auto"/>
+        <w:shd w:fill="F4F6F9"/>
+        <w:ind w:left="160" w:right="160"/>
+      </w:pPr>
+      <w:r>
+        <w:rPr>
+          <w:rFonts w:ascii="Microsoft YaHei" w:hAnsi="Microsoft YaHei" w:eastAsia="Microsoft YaHei"/>
+          <w:b/>
+          <w:color w:val="1F4D78"/>
+          <w:sz w:val="21"/>
+        </w:rPr>
+        <w:t>设计取舍：</w:t>
+      </w:r>
+      <w:r>
+        <w:rPr>
+          <w:rFonts w:ascii="Microsoft YaHei" w:hAnsi="Microsoft YaHei" w:eastAsia="Microsoft YaHei"/>
+          <w:color w:val="1E2630"/>
+          <w:sz w:val="21"/>
+        </w:rPr>
+        <w:t>2 秒是当前 MVP 的可配置经验值，而不是普适常量。后续应根据本地文件、HTTP 视频、不同编码格式和真实设备数据调整，或改为由播放器事件驱动稳定期结束。</w:t>
+      </w:r>
+    </w:p>
+    <w:p>
+      <w:pPr>
+        <w:pStyle w:val="Heading2"/>
+      </w:pPr>
+      <w:r>
+        <w:t>4.3 为什么选择中位数和 P95</w:t>
+      </w:r>
+    </w:p>
+    <w:p>
+      <w:pPr>
+        <w:spacing w:before="0" w:after="120" w:line="300" w:lineRule="auto"/>
+      </w:pPr>
+      <w:r>
+        <w:rPr>
+          <w:rFonts w:ascii="Microsoft YaHei" w:hAnsi="Microsoft YaHei" w:eastAsia="Microsoft YaHei"/>
+          <w:color w:val="1E2630"/>
+          <w:sz w:val="21"/>
+        </w:rPr>
+        <w:t>稳定期结束后，每对 client 保存最近 12 个相对偏差。至少积累 6 个样本后窗口才标记为 ready。单次 250/500 ms 台阶可能只是采样相位抖动，中位数对这种离群值不敏感；P95 则保留尾部风险，用来观察绝大多数样本之外是否仍有明显卡顿。</w:t>
+      </w:r>
+    </w:p>
+    <w:p>
+      <w:pPr>
+        <w:spacing w:before="80" w:after="160" w:line="264" w:lineRule="auto"/>
+        <w:shd w:fill="F7F8FA"/>
+        <w:ind w:left="180" w:right="180"/>
+      </w:pPr>
+      <w:r>
+        <w:rPr>
+          <w:rFonts w:ascii="Consolas" w:hAnsi="Consolas" w:eastAsia="Consolas"/>
+          <w:color w:val="1E2630"/>
+          <w:sz w:val="17"/>
+        </w:rPr>
+        <w:t>window_size = 12</w:t>
+        <w:br/>
+      </w:r>
+      <w:r>
+        <w:rPr>
+          <w:rFonts w:ascii="Consolas" w:hAnsi="Consolas" w:eastAsia="Consolas"/>
+          <w:color w:val="1E2630"/>
+          <w:sz w:val="17"/>
+        </w:rPr>
+        <w:t>window_ready = samples &gt;= 6</w:t>
+        <w:br/>
+      </w:r>
+      <w:r>
+        <w:rPr>
+          <w:rFonts w:ascii="Consolas" w:hAnsi="Consolas" w:eastAsia="Consolas"/>
+          <w:color w:val="1E2630"/>
+          <w:sz w:val="17"/>
+        </w:rPr>
+        <w:t>stable_skew = median(pair_diff_ms)</w:t>
+        <w:br/>
+      </w:r>
+      <w:r>
+        <w:rPr>
+          <w:rFonts w:ascii="Consolas" w:hAnsi="Consolas" w:eastAsia="Consolas"/>
+          <w:color w:val="1E2630"/>
+          <w:sz w:val="17"/>
+        </w:rPr>
+        <w:t>tail_risk = P95(abs(pair_diff_ms))</w:t>
+        <w:br/>
+      </w:r>
+      <w:r>
+        <w:rPr>
+          <w:rFonts w:ascii="Consolas" w:hAnsi="Consolas" w:eastAsia="Consolas"/>
+          <w:color w:val="1E2630"/>
+          <w:sz w:val="17"/>
+        </w:rPr>
+        <w:t>severe_streak += 1 only when abs(diff) &gt; 750 ms</w:t>
+      </w:r>
+    </w:p>
+    <w:p>
+      <w:pPr>
+        <w:pStyle w:val="ListBullet"/>
+      </w:pPr>
+      <w:r>
+        <w:rPr>
+          <w:rFonts w:ascii="Microsoft YaHei" w:hAnsi="Microsoft YaHei" w:eastAsia="Microsoft YaHei"/>
+          <w:color w:val="1E2630"/>
+          <w:sz w:val="21"/>
+        </w:rPr>
+        <w:t>median_diff_ms 保留正负方向：正数表示 client_a 领先，负数表示落后。</w:t>
+      </w:r>
+    </w:p>
+    <w:p>
+      <w:pPr>
+        <w:pStyle w:val="ListBullet"/>
+      </w:pPr>
+      <w:r>
+        <w:rPr>
+          <w:rFonts w:ascii="Microsoft YaHei" w:hAnsi="Microsoft YaHei" w:eastAsia="Microsoft YaHei"/>
+          <w:color w:val="1E2630"/>
+          <w:sz w:val="21"/>
+        </w:rPr>
+        <w:t>median_abs_diff_ms 表示典型偏差大小，可作为未来纠偏阈值的主要输入。</w:t>
+      </w:r>
+    </w:p>
+    <w:p>
+      <w:pPr>
+        <w:pStyle w:val="ListBullet"/>
+      </w:pPr>
+      <w:r>
+        <w:rPr>
+          <w:rFonts w:ascii="Microsoft YaHei" w:hAnsi="Microsoft YaHei" w:eastAsia="Microsoft YaHei"/>
+          <w:color w:val="1E2630"/>
+          <w:sz w:val="21"/>
+        </w:rPr>
+        <w:t>p95_abs_diff_ms 用于识别偶发严重抖动，不能单独决定立即 seek。</w:t>
+      </w:r>
+    </w:p>
+    <w:p>
+      <w:pPr>
+        <w:pStyle w:val="ListBullet"/>
+      </w:pPr>
+      <w:r>
+        <w:rPr>
+          <w:rFonts w:ascii="Microsoft YaHei" w:hAnsi="Microsoft YaHei" w:eastAsia="Microsoft YaHei"/>
+          <w:color w:val="1E2630"/>
+          <w:sz w:val="21"/>
+        </w:rPr>
+        <w:t>consecutive_severe 用于要求异常连续出现，防止一个坏样本触发控制振荡。</w:t>
+      </w:r>
+    </w:p>
+    <w:p>
+      <w:pPr>
+        <w:pStyle w:val="Heading2"/>
+      </w:pPr>
+      <w:r>
+        <w:t>4.4 核心修改</w:t>
+      </w:r>
+    </w:p>
+    <w:tbl>
+      <w:tblPr>
+        <w:tblW w:type="dxa" w:w="9360"/>
+        <w:jc w:val="left"/>
+        <w:tblLayout w:type="fixed"/>
+        <w:tblLook w:firstColumn="1" w:firstRow="1" w:lastColumn="0" w:lastRow="0" w:noHBand="0" w:noVBand="1" w:val="04A0"/>
+        <w:tblInd w:w="120" w:type="dxa"/>
+        <w:tblBorders>
+          <w:top w:val="single" w:sz="4" w:space="0" w:color="C8D2DE"/>
+          <w:left w:val="single" w:sz="4" w:space="0" w:color="C8D2DE"/>
+          <w:bottom w:val="single" w:sz="4" w:space="0" w:color="C8D2DE"/>
+          <w:right w:val="single" w:sz="4" w:space="0" w:color="C8D2DE"/>
+          <w:insideH w:val="single" w:sz="4" w:space="0" w:color="C8D2DE"/>
+          <w:insideV w:val="single" w:sz="4" w:space="0" w:color="C8D2DE"/>
+        </w:tblBorders>
+      </w:tblPr>
+      <w:tblGrid>
+        <w:gridCol w:w="2200"/>
+        <w:gridCol w:w="3580"/>
+        <w:gridCol w:w="3580"/>
+      </w:tblGrid>
+      <w:tr>
+        <w:trPr>
+          <w:tblHeader w:val="true"/>
+        </w:trPr>
+        <w:tc>
+          <w:tcPr>
+            <w:tcW w:type="dxa" w:w="2200"/>
+            <w:vAlign w:val="center"/>
+            <w:tcMar>
+              <w:top w:w="80" w:type="dxa"/>
+              <w:start w:w="120" w:type="dxa"/>
+              <w:bottom w:w="80" w:type="dxa"/>
+              <w:end w:w="120" w:type="dxa"/>
+            </w:tcMar>
+            <w:shd w:fill="E8EEF5"/>
+          </w:tcPr>
+          <w:p>
+            <w:pPr>
+              <w:spacing w:before="0" w:after="0" w:line="276" w:lineRule="auto"/>
+              <w:jc w:val="center"/>
+            </w:pPr>
+            <w:r>
+              <w:rPr>
+                <w:rFonts w:ascii="Microsoft YaHei" w:hAnsi="Microsoft YaHei" w:eastAsia="Microsoft YaHei"/>
+                <w:b/>
+                <w:color w:val="1F4D78"/>
+                <w:sz w:val="18"/>
+              </w:rPr>
+              <w:t>文件/模块</w:t>
+            </w:r>
+          </w:p>
+        </w:tc>
+        <w:tc>
+          <w:tcPr>
+            <w:tcW w:type="dxa" w:w="3580"/>
+            <w:vAlign w:val="center"/>
+            <w:tcMar>
+              <w:top w:w="80" w:type="dxa"/>
+              <w:start w:w="120" w:type="dxa"/>
+              <w:bottom w:w="80" w:type="dxa"/>
+              <w:end w:w="120" w:type="dxa"/>
+            </w:tcMar>
+            <w:shd w:fill="E8EEF5"/>
+          </w:tcPr>
+          <w:p>
+            <w:pPr>
+              <w:spacing w:before="0" w:after="0" w:line="276" w:lineRule="auto"/>
+              <w:jc w:val="center"/>
+            </w:pPr>
+            <w:r>
+              <w:rPr>
+                <w:rFonts w:ascii="Microsoft YaHei" w:hAnsi="Microsoft YaHei" w:eastAsia="Microsoft YaHei"/>
+                <w:b/>
+                <w:color w:val="1F4D78"/>
+                <w:sz w:val="18"/>
+              </w:rPr>
+              <w:t>核心修改</w:t>
+            </w:r>
+          </w:p>
+        </w:tc>
+        <w:tc>
+          <w:tcPr>
+            <w:tcW w:type="dxa" w:w="3580"/>
+            <w:vAlign w:val="center"/>
+            <w:tcMar>
+              <w:top w:w="80" w:type="dxa"/>
+              <w:start w:w="120" w:type="dxa"/>
+              <w:bottom w:w="80" w:type="dxa"/>
+              <w:end w:w="120" w:type="dxa"/>
+            </w:tcMar>
+            <w:shd w:fill="E8EEF5"/>
+          </w:tcPr>
+          <w:p>
+            <w:pPr>
+              <w:spacing w:before="0" w:after="0" w:line="276" w:lineRule="auto"/>
+              <w:jc w:val="center"/>
+            </w:pPr>
+            <w:r>
+              <w:rPr>
+                <w:rFonts w:ascii="Microsoft YaHei" w:hAnsi="Microsoft YaHei" w:eastAsia="Microsoft YaHei"/>
+                <w:b/>
+                <w:color w:val="1F4D78"/>
+                <w:sz w:val="18"/>
+              </w:rPr>
+              <w:t>工程价值</w:t>
+            </w:r>
+          </w:p>
+        </w:tc>
+      </w:tr>
+      <w:tr>
+        <w:tc>
+          <w:tcPr>
+            <w:tcW w:type="dxa" w:w="2200"/>
+          </w:tcPr>
+          <w:p>
+            <w:pPr>
+              <w:spacing w:before="0" w:after="0" w:line="276" w:lineRule="auto"/>
+            </w:pPr>
+            <w:r>
+              <w:rPr>
+                <w:rFonts w:ascii="Consolas" w:hAnsi="Consolas" w:eastAsia="Consolas"/>
+                <w:color w:val="1E2630"/>
+                <w:sz w:val="17"/>
+              </w:rPr>
+              <w:t>SyncServer.cpp</w:t>
+            </w:r>
+          </w:p>
+        </w:tc>
+        <w:tc>
+          <w:tcPr>
+            <w:tcW w:type="dxa" w:w="3580"/>
+          </w:tcPr>
+          <w:p>
+            <w:pPr>
+              <w:spacing w:before="0" w:after="0" w:line="276" w:lineRule="auto"/>
+            </w:pPr>
+            <w:r>
+              <w:rPr>
+                <w:rFonts w:ascii="Microsoft YaHei" w:hAnsi="Microsoft YaHei" w:eastAsia="Microsoft YaHei"/>
+                <w:color w:val="1E2630"/>
+                <w:sz w:val="18"/>
+              </w:rPr>
+              <w:t>新增 controlCommandMutex，使控制命令、Room 更新、广播、epoch 切换和 REPORT 快照严格有序。</w:t>
+            </w:r>
+          </w:p>
+        </w:tc>
+        <w:tc>
+          <w:tcPr>
+            <w:tcW w:type="dxa" w:w="3580"/>
+          </w:tcPr>
+          <w:p>
+            <w:pPr>
+              <w:spacing w:before="0" w:after="0" w:line="276" w:lineRule="auto"/>
+            </w:pPr>
+            <w:r>
+              <w:rPr>
+                <w:rFonts w:ascii="Microsoft YaHei" w:hAnsi="Microsoft YaHei" w:eastAsia="Microsoft YaHei"/>
+                <w:color w:val="1E2630"/>
+                <w:sz w:val="18"/>
+              </w:rPr>
+              <w:t>避免并发 client 产生“新状态配旧统计周期”的竞态。</w:t>
+            </w:r>
+          </w:p>
+        </w:tc>
+      </w:tr>
+      <w:tr>
+        <w:tc>
+          <w:tcPr>
+            <w:tcW w:type="dxa" w:w="2200"/>
+          </w:tcPr>
+          <w:p>
+            <w:pPr>
+              <w:spacing w:before="0" w:after="0" w:line="276" w:lineRule="auto"/>
+            </w:pPr>
+            <w:r>
+              <w:rPr>
+                <w:rFonts w:ascii="Consolas" w:hAnsi="Consolas" w:eastAsia="Consolas"/>
+                <w:color w:val="1E2630"/>
+                <w:sz w:val="17"/>
+              </w:rPr>
+              <w:t>SyncMetrics.h</w:t>
+            </w:r>
+          </w:p>
+        </w:tc>
+        <w:tc>
+          <w:tcPr>
+            <w:tcW w:type="dxa" w:w="3580"/>
+          </w:tcPr>
+          <w:p>
+            <w:pPr>
+              <w:spacing w:before="0" w:after="0" w:line="276" w:lineRule="auto"/>
+            </w:pPr>
+            <w:r>
+              <w:rPr>
+                <w:rFonts w:ascii="Microsoft YaHei" w:hAnsi="Microsoft YaHei" w:eastAsia="Microsoft YaHei"/>
+                <w:color w:val="1E2630"/>
+                <w:sz w:val="18"/>
+              </w:rPr>
+              <w:t>新增 PairWindowStats、控制 epoch 状态及 beginControlEpoch()。</w:t>
+            </w:r>
+          </w:p>
+        </w:tc>
+        <w:tc>
+          <w:tcPr>
+            <w:tcW w:type="dxa" w:w="3580"/>
+          </w:tcPr>
+          <w:p>
+            <w:pPr>
+              <w:spacing w:before="0" w:after="0" w:line="276" w:lineRule="auto"/>
+            </w:pPr>
+            <w:r>
+              <w:rPr>
+                <w:rFonts w:ascii="Microsoft YaHei" w:hAnsi="Microsoft YaHei" w:eastAsia="Microsoft YaHei"/>
+                <w:color w:val="1E2630"/>
+                <w:sz w:val="18"/>
+              </w:rPr>
+              <w:t>把网络 RTT 与播放控制周期分开管理。</w:t>
+            </w:r>
+          </w:p>
+        </w:tc>
+      </w:tr>
+      <w:tr>
+        <w:tc>
+          <w:tcPr>
+            <w:tcW w:type="dxa" w:w="2200"/>
+          </w:tcPr>
+          <w:p>
+            <w:pPr>
+              <w:spacing w:before="0" w:after="0" w:line="276" w:lineRule="auto"/>
+            </w:pPr>
+            <w:r>
+              <w:rPr>
+                <w:rFonts w:ascii="Consolas" w:hAnsi="Consolas" w:eastAsia="Consolas"/>
+                <w:color w:val="1E2630"/>
+                <w:sz w:val="17"/>
+              </w:rPr>
+              <w:t>SyncMetrics.cpp</w:t>
+            </w:r>
+          </w:p>
+        </w:tc>
+        <w:tc>
+          <w:tcPr>
+            <w:tcW w:type="dxa" w:w="3580"/>
+          </w:tcPr>
+          <w:p>
+            <w:pPr>
+              <w:spacing w:before="0" w:after="0" w:line="276" w:lineRule="auto"/>
+            </w:pPr>
+            <w:r>
+              <w:rPr>
+                <w:rFonts w:ascii="Microsoft YaHei" w:hAnsi="Microsoft YaHei" w:eastAsia="Microsoft YaHei"/>
+                <w:color w:val="1E2630"/>
+                <w:sz w:val="18"/>
+              </w:rPr>
+              <w:t>控制后保留 RTT、重置偏差；加入 2 秒稳定期、12 样本窗口、中位数、P95 和连续严重偏差计数。</w:t>
+            </w:r>
+          </w:p>
+        </w:tc>
+        <w:tc>
+          <w:tcPr>
+            <w:tcW w:type="dxa" w:w="3580"/>
+          </w:tcPr>
+          <w:p>
+            <w:pPr>
+              <w:spacing w:before="0" w:after="0" w:line="276" w:lineRule="auto"/>
+            </w:pPr>
+            <w:r>
+              <w:rPr>
+                <w:rFonts w:ascii="Microsoft YaHei" w:hAnsi="Microsoft YaHei" w:eastAsia="Microsoft YaHei"/>
+                <w:color w:val="1E2630"/>
+                <w:sz w:val="18"/>
+              </w:rPr>
+              <w:t>让后续纠偏依据稳定趋势，而不是单次量化抖动。</w:t>
+            </w:r>
+          </w:p>
+        </w:tc>
+      </w:tr>
+      <w:tr>
+        <w:tc>
+          <w:tcPr>
+            <w:tcW w:type="dxa" w:w="2200"/>
+          </w:tcPr>
+          <w:p>
+            <w:pPr>
+              <w:spacing w:before="0" w:after="0" w:line="276" w:lineRule="auto"/>
+            </w:pPr>
+            <w:r>
+              <w:rPr>
+                <w:rFonts w:ascii="Consolas" w:hAnsi="Consolas" w:eastAsia="Consolas"/>
+                <w:color w:val="1E2630"/>
+                <w:sz w:val="17"/>
+              </w:rPr>
+              <w:t>Engineering Journal</w:t>
+            </w:r>
+          </w:p>
+        </w:tc>
+        <w:tc>
+          <w:tcPr>
+            <w:tcW w:type="dxa" w:w="3580"/>
+          </w:tcPr>
+          <w:p>
+            <w:pPr>
+              <w:spacing w:before="0" w:after="0" w:line="276" w:lineRule="auto"/>
+            </w:pPr>
+            <w:r>
+              <w:rPr>
+                <w:rFonts w:ascii="Microsoft YaHei" w:hAnsi="Microsoft YaHei" w:eastAsia="Microsoft YaHei"/>
+                <w:color w:val="1E2630"/>
+                <w:sz w:val="18"/>
+              </w:rPr>
+              <w:t>补录公网验证证据、算法选择、回归结果和面试表达。</w:t>
+            </w:r>
+          </w:p>
+        </w:tc>
+        <w:tc>
+          <w:tcPr>
+            <w:tcW w:type="dxa" w:w="3580"/>
+          </w:tcPr>
+          <w:p>
+            <w:pPr>
+              <w:spacing w:before="0" w:after="0" w:line="276" w:lineRule="auto"/>
+            </w:pPr>
+            <w:r>
+              <w:rPr>
+                <w:rFonts w:ascii="Microsoft YaHei" w:hAnsi="Microsoft YaHei" w:eastAsia="Microsoft YaHei"/>
+                <w:color w:val="1E2630"/>
+                <w:sz w:val="18"/>
+              </w:rPr>
+              <w:t>保证代码推进与知识交接同步完成。</w:t>
+            </w:r>
+          </w:p>
+        </w:tc>
+      </w:tr>
+    </w:tbl>
+    <w:p>
+      <w:pPr>
+        <w:pStyle w:val="Heading2"/>
+      </w:pPr>
+      <w:r>
+        <w:t>4.5 日志字段怎么读</w:t>
+      </w:r>
+    </w:p>
+    <w:p>
+      <w:pPr>
+        <w:spacing w:before="80" w:after="160" w:line="264" w:lineRule="auto"/>
+        <w:shd w:fill="F7F8FA"/>
+        <w:ind w:left="180" w:right="180"/>
+      </w:pPr>
+      <w:r>
+        <w:rPr>
+          <w:rFonts w:ascii="Consolas" w:hAnsi="Consolas" w:eastAsia="Consolas"/>
+          <w:color w:val="1E2630"/>
+          <w:sz w:val="17"/>
+        </w:rPr>
+        <w:t>[metric] type=control_epoch epoch=2 command=SEEK settle_ms=2000</w:t>
+        <w:br/>
+      </w:r>
+      <w:r>
+        <w:rPr>
+          <w:rFonts w:ascii="Consolas" w:hAnsi="Consolas" w:eastAsia="Consolas"/>
+          <w:color w:val="1E2630"/>
+          <w:sz w:val="17"/>
+        </w:rPr>
+        <w:t>[metric] type=pair_progress client_a=1 client_b=2 epoch=2</w:t>
+        <w:br/>
+      </w:r>
+      <w:r>
+        <w:rPr>
+          <w:rFonts w:ascii="Consolas" w:hAnsi="Consolas" w:eastAsia="Consolas"/>
+          <w:color w:val="1E2630"/>
+          <w:sz w:val="17"/>
+        </w:rPr>
+        <w:t>settling=0 window_samples=6 window_ready=1</w:t>
+        <w:br/>
+      </w:r>
+      <w:r>
+        <w:rPr>
+          <w:rFonts w:ascii="Consolas" w:hAnsi="Consolas" w:eastAsia="Consolas"/>
+          <w:color w:val="1E2630"/>
+          <w:sz w:val="17"/>
+        </w:rPr>
+        <w:t>median_diff_ms=61 median_abs_diff_ms=61 p95_abs_diff_ms=87</w:t>
+        <w:br/>
+      </w:r>
+      <w:r>
+        <w:rPr>
+          <w:rFonts w:ascii="Consolas" w:hAnsi="Consolas" w:eastAsia="Consolas"/>
+          <w:color w:val="1E2630"/>
+          <w:sz w:val="17"/>
+        </w:rPr>
+        <w:t>consecutive_severe=0 quality=good</w:t>
+      </w:r>
+    </w:p>
+    <w:p>
+      <w:pPr>
+        <w:pStyle w:val="ListBullet"/>
+      </w:pPr>
+      <w:r>
+        <w:rPr>
+          <w:rFonts w:ascii="Microsoft YaHei" w:hAnsi="Microsoft YaHei" w:eastAsia="Microsoft YaHei"/>
+          <w:color w:val="1E2630"/>
+          <w:sz w:val="21"/>
+        </w:rPr>
+        <w:t>epoch：当前样本属于哪一次控制周期，便于过滤旧数据和复盘命令影响。</w:t>
+      </w:r>
+    </w:p>
+    <w:p>
+      <w:pPr>
+        <w:pStyle w:val="ListBullet"/>
+      </w:pPr>
+      <w:r>
+        <w:rPr>
+          <w:rFonts w:ascii="Microsoft YaHei" w:hAnsi="Microsoft YaHei" w:eastAsia="Microsoft YaHei"/>
+          <w:color w:val="1E2630"/>
+          <w:sz w:val="21"/>
+        </w:rPr>
+        <w:t>settling=1：仍处于播放器过渡期，只观察、不累计、不纠偏。</w:t>
+      </w:r>
+    </w:p>
+    <w:p>
+      <w:pPr>
+        <w:pStyle w:val="ListBullet"/>
+      </w:pPr>
+      <w:r>
+        <w:rPr>
+          <w:rFonts w:ascii="Microsoft YaHei" w:hAnsi="Microsoft YaHei" w:eastAsia="Microsoft YaHei"/>
+          <w:color w:val="1E2630"/>
+          <w:sz w:val="21"/>
+        </w:rPr>
+        <w:t>window_ready=1：样本数量达到最小要求，稳健统计才可供控制算法使用。</w:t>
+      </w:r>
+    </w:p>
+    <w:p>
+      <w:pPr>
+        <w:pStyle w:val="ListBullet"/>
+      </w:pPr>
+      <w:r>
+        <w:rPr>
+          <w:rFonts w:ascii="Microsoft YaHei" w:hAnsi="Microsoft YaHei" w:eastAsia="Microsoft YaHei"/>
+          <w:color w:val="1E2630"/>
+          <w:sz w:val="21"/>
+        </w:rPr>
+        <w:t>quality：窗口未 ready 时仅供观察；ready 后以 median_abs_diff_ms 判定。</w:t>
+      </w:r>
+    </w:p>
+    <w:p>
+      <w:pPr>
+        <w:pStyle w:val="Heading2"/>
+      </w:pPr>
+      <w:r>
+        <w:t>4.6 本地回归结果</w:t>
+      </w:r>
+    </w:p>
+    <w:p>
+      <w:pPr>
+        <w:pStyle w:val="ListNumber"/>
+      </w:pPr>
+      <w:r>
+        <w:rPr>
+          <w:rFonts w:ascii="Microsoft YaHei" w:hAnsi="Microsoft YaHei" w:eastAsia="Microsoft YaHei"/>
+          <w:color w:val="1E2630"/>
+          <w:sz w:val="21"/>
+        </w:rPr>
+        <w:t>Windows x64 libVLC 完整目标再次构建通过。</w:t>
+      </w:r>
+    </w:p>
+    <w:p>
+      <w:pPr>
+        <w:pStyle w:val="ListNumber"/>
+      </w:pPr>
+      <w:r>
+        <w:rPr>
+          <w:rFonts w:ascii="Microsoft YaHei" w:hAnsi="Microsoft YaHei" w:eastAsia="Microsoft YaHei"/>
+          <w:color w:val="1E2630"/>
+          <w:sz w:val="21"/>
+        </w:rPr>
+        <w:t>WSL Ubuntu 22.04 的 SyncCinemaServer 目标再次构建通过。</w:t>
+      </w:r>
+    </w:p>
+    <w:p>
+      <w:pPr>
+        <w:pStyle w:val="ListNumber"/>
+      </w:pPr>
+      <w:r>
+        <w:rPr>
+          <w:rFonts w:ascii="Microsoft YaHei" w:hAnsi="Microsoft YaHei" w:eastAsia="Microsoft YaHei"/>
+          <w:color w:val="1E2630"/>
+          <w:sz w:val="21"/>
+        </w:rPr>
+        <w:t>两个脚本 TCP client 并发发送 PLAY 和 REPORT，epoch 1 的前 2 秒样本正确标记为 settling。</w:t>
+      </w:r>
+    </w:p>
+    <w:p>
+      <w:pPr>
+        <w:pStyle w:val="ListNumber"/>
+      </w:pPr>
+      <w:r>
+        <w:rPr>
+          <w:rFonts w:ascii="Microsoft YaHei" w:hAnsi="Microsoft YaHei" w:eastAsia="Microsoft YaHei"/>
+          <w:color w:val="1E2630"/>
+          <w:sz w:val="21"/>
+        </w:rPr>
+        <w:t>稳定期后窗口从 1 增长到 6，window_ready 变为 1，中位数约 60-61 ms、P95 约 75-87 ms。</w:t>
+      </w:r>
+    </w:p>
+    <w:p>
+      <w:pPr>
+        <w:pStyle w:val="ListNumber"/>
+      </w:pPr>
+      <w:r>
+        <w:rPr>
+          <w:rFonts w:ascii="Microsoft YaHei" w:hAnsi="Microsoft YaHei" w:eastAsia="Microsoft YaHei"/>
+          <w:color w:val="1E2630"/>
+          <w:sz w:val="21"/>
+        </w:rPr>
+        <w:t>发送 SEEK 后进入 epoch 2，旧窗口被清空并重新进入 settling，验证跨控制周期污染已被阻断。</w:t>
+      </w:r>
+    </w:p>
+    <w:p>
+      <w:pPr>
+        <w:spacing w:before="120" w:after="160" w:line="300" w:lineRule="auto"/>
+        <w:shd w:fill="F4F6F9"/>
+        <w:ind w:left="160" w:right="160"/>
+      </w:pPr>
+      <w:r>
+        <w:rPr>
+          <w:rFonts w:ascii="Microsoft YaHei" w:hAnsi="Microsoft YaHei" w:eastAsia="Microsoft YaHei"/>
+          <w:b/>
+          <w:color w:val="1F4D78"/>
+          <w:sz w:val="21"/>
+        </w:rPr>
+        <w:t>当前状态：</w:t>
+      </w:r>
+      <w:r>
+        <w:rPr>
+          <w:rFonts w:ascii="Microsoft YaHei" w:hAnsi="Microsoft YaHei" w:eastAsia="Microsoft YaHei"/>
+          <w:color w:val="1E2630"/>
+          <w:sz w:val="21"/>
+        </w:rPr>
+        <w:t>本阶段代码已经实现并完成本地构建与功能回归，但按提交节奏要求暂未提交或部署。云服务器当前仍运行已发布的 2c1bf4f 版本，便于清晰区分已发布基线与本地候选版本。</w:t>
+      </w:r>
+    </w:p>
+    <w:p>
+      <w:pPr>
+        <w:pStyle w:val="Heading2"/>
+      </w:pPr>
+      <w:r>
+        <w:t>4.7 尚未完成</w:t>
+      </w:r>
+    </w:p>
+    <w:p>
+      <w:pPr>
+        <w:pStyle w:val="ListBullet"/>
+      </w:pPr>
+      <w:r>
+        <w:rPr>
+          <w:rFonts w:ascii="Microsoft YaHei" w:hAnsi="Microsoft YaHei" w:eastAsia="Microsoft YaHei"/>
+          <w:color w:val="1E2630"/>
+          <w:sz w:val="21"/>
+        </w:rPr>
+        <w:t>窗口指标目前只用于日志分析，尚未自动下发校正命令。</w:t>
+      </w:r>
+    </w:p>
+    <w:p>
+      <w:pPr>
+        <w:pStyle w:val="ListBullet"/>
+      </w:pPr>
+      <w:r>
+        <w:rPr>
+          <w:rFonts w:ascii="Microsoft YaHei" w:hAnsi="Microsoft YaHei" w:eastAsia="Microsoft YaHei"/>
+          <w:color w:val="1E2630"/>
+          <w:sz w:val="21"/>
+        </w:rPr>
+        <w:t>新 client 的晚加入状态快照仍未实现，这是进入自动纠偏前更确定、优先级更高的功能缺口。</w:t>
+      </w:r>
+    </w:p>
+    <w:p>
+      <w:pPr>
+        <w:pStyle w:val="ListBullet"/>
+      </w:pPr>
+      <w:r>
+        <w:rPr>
+          <w:rFonts w:ascii="Microsoft YaHei" w:hAnsi="Microsoft YaHei" w:eastAsia="Microsoft YaHei"/>
+          <w:color w:val="1E2630"/>
+          <w:sz w:val="21"/>
+        </w:rPr>
+        <w:t>当前 P95 使用最近 12 个样本的 nearest-rank 算法，样本较少时粒度有限。</w:t>
+      </w:r>
+    </w:p>
+    <w:p>
+      <w:pPr>
+        <w:pStyle w:val="ListBullet"/>
+      </w:pPr>
+      <w:r>
+        <w:rPr>
+          <w:rFonts w:ascii="Microsoft YaHei" w:hAnsi="Microsoft YaHei" w:eastAsia="Microsoft YaHei"/>
+          <w:color w:val="1E2630"/>
+          <w:sz w:val="21"/>
+        </w:rPr>
+        <w:t>暂停和播放共用 2 秒稳定期，后续可按命令类型和播放器事件细化。</w:t>
       </w:r>
     </w:p>
     <w:p>
@@ -1917,7 +2960,41 @@
         <w:pStyle w:val="Heading1"/>
       </w:pPr>
       <w:r>
-        <w:t>5. 后续学习重点</w:t>
+        <w:t>5. 面试表达模板</w:t>
+      </w:r>
+    </w:p>
+    <w:p>
+      <w:pPr>
+        <w:spacing w:before="0" w:after="120" w:line="300" w:lineRule="auto"/>
+      </w:pPr>
+      <w:r>
+        <w:rPr>
+          <w:rFonts w:ascii="Microsoft YaHei" w:hAnsi="Microsoft YaHei" w:eastAsia="Microsoft YaHei"/>
+          <w:color w:val="1E2630"/>
+          <w:sz w:val="21"/>
+        </w:rPr>
+        <w:t>第一段可以这样说明指标演进：最初我用服务器 Room 的理论时钟评估每个客户端，但公网测试发现两端都可能因 libVLC 缓冲共同落后 Room 几百毫秒，这个指标不能直接代表观众之间不同步。于是我保留 client-to-Room 指标用于诊断，另外缓存每个 client 的最近上报，结合 RTT/2 和 server steady_clock，把异步到达的进度投影到同一时刻后计算 pair_diff。同时过滤陈旧样本和状态不一致样本，并坚持先观测后控制，为后续自动纠偏建立可信数据基础。</w:t>
+      </w:r>
+    </w:p>
+    <w:p>
+      <w:pPr>
+        <w:spacing w:before="0" w:after="120" w:line="300" w:lineRule="auto"/>
+      </w:pPr>
+      <w:r>
+        <w:rPr>
+          <w:rFonts w:ascii="Microsoft YaHei" w:hAnsi="Microsoft YaHei" w:eastAsia="Microsoft YaHei"/>
+          <w:color w:val="1E2630"/>
+          <w:sz w:val="21"/>
+        </w:rPr>
+        <w:t>第二段可以这样说明稳健性：公网实测中，两台客户端暂停后只差约 2 ms，但播放时单条日志会出现约 250 ms 的量化台阶。我没有直接按单个样本 seek，而是为每次 PLAY、PAUSE、SEEK 建立独立 epoch，清理旧进度统计但保留 RTT；控制后设置 2 秒稳定期，再用最近 12 个样本的中位数评估典型偏差、P95 观察尾部风险，同时统计连续严重异常。这样未来的校正策略会基于趋势，而不是被播放器异步行为或一次网络抖动误触发。</w:t>
+      </w:r>
+    </w:p>
+    <w:p>
+      <w:pPr>
+        <w:pStyle w:val="Heading1"/>
+      </w:pPr>
+      <w:r>
+        <w:t>6. 后续学习重点</w:t>
       </w:r>
     </w:p>
     <w:p>
@@ -1944,6 +3021,45 @@
           <w:sz w:val="21"/>
         </w:rPr>
         <w:t>projectPositionToServerTime：为什么 Playing 才能按经过时间推进。</w:t>
+      </w:r>
+    </w:p>
+    <w:p>
+      <w:pPr>
+        <w:pStyle w:val="ListNumber"/>
+      </w:pPr>
+      <w:r>
+        <w:rPr>
+          <w:rFonts w:ascii="Microsoft YaHei" w:hAnsi="Microsoft YaHei" w:eastAsia="Microsoft YaHei"/>
+          <w:color w:val="1E2630"/>
+          <w:sz w:val="21"/>
+        </w:rPr>
+        <w:t>SyncMetricsCollector::beginControlEpoch：为什么 RTT 保留，而播放偏差必须按控制周期重置。</w:t>
+      </w:r>
+    </w:p>
+    <w:p>
+      <w:pPr>
+        <w:pStyle w:val="ListNumber"/>
+      </w:pPr>
+      <w:r>
+        <w:rPr>
+          <w:rFonts w:ascii="Microsoft YaHei" w:hAnsi="Microsoft YaHei" w:eastAsia="Microsoft YaHei"/>
+          <w:color w:val="1E2630"/>
+          <w:sz w:val="21"/>
+        </w:rPr>
+        <w:t>medianOf / percentile95OfAbsoluteDiffs：稳健统计如何减少离群样本误导。</w:t>
+      </w:r>
+    </w:p>
+    <w:p>
+      <w:pPr>
+        <w:pStyle w:val="ListNumber"/>
+      </w:pPr>
+      <w:r>
+        <w:rPr>
+          <w:rFonts w:ascii="Microsoft YaHei" w:hAnsi="Microsoft YaHei" w:eastAsia="Microsoft YaHei"/>
+          <w:color w:val="1E2630"/>
+          <w:sz w:val="21"/>
+        </w:rPr>
+        <w:t>SyncServer::processLine：controlCommandMutex 如何统一 Room、广播、epoch 和 REPORT 的并发顺序。</w:t>
       </w:r>
     </w:p>
     <w:p>
@@ -1990,7 +3106,7 @@
         <w:pStyle w:val="Heading1"/>
       </w:pPr>
       <w:r>
-        <w:t>6. 后续工程路线</w:t>
+        <w:t>7. 后续工程路线</w:t>
       </w:r>
     </w:p>
     <w:p>
@@ -2003,7 +3119,7 @@
           <w:color w:val="1E2630"/>
           <w:sz w:val="21"/>
         </w:rPr>
-        <w:t>把 pair_progress 部署到云服务器，用两台真实设备采集播放、暂停、seek 和晚加入场景。</w:t>
+        <w:t>在合理提交间隔后提交并部署 epoch/window 候选版本，再用两台真实设备复测 PLAY、PAUSE 与 SEEK。</w:t>
       </w:r>
     </w:p>
     <w:p>
@@ -2016,7 +3132,7 @@
           <w:color w:val="1E2630"/>
           <w:sz w:val="21"/>
         </w:rPr>
-        <w:t>引入 playback epoch / command id，使 PLAY、PAUSE、SEEK 后的样本和统计归属于正确控制周期。</w:t>
+        <w:t>实现新 client 的状态快照与加入同步，先消除“晚加入后停在 0 秒”的确定性缺陷。</w:t>
       </w:r>
     </w:p>
     <w:p>
@@ -2029,7 +3145,7 @@
           <w:color w:val="1E2630"/>
           <w:sz w:val="21"/>
         </w:rPr>
-        <w:t>实现新 client 的状态快照与加入同步，先消除“连接后停在 0 秒”的确定性缺陷。</w:t>
+        <w:t>设计只读校正建议日志：根据 window_ready、中位数、P95 和连续异常输出 would_correct，但仍不实际控制。</w:t>
       </w:r>
     </w:p>
     <w:p>
@@ -2042,7 +3158,7 @@
           <w:color w:val="1E2630"/>
           <w:sz w:val="21"/>
         </w:rPr>
-        <w:t>在可信 pair_diff 基础上加入带阈值、冷却和迟滞的自动校正策略。</w:t>
+        <w:t>验证建议策略后，再加入带阈值、冷却和迟滞的自动 seek；小偏差优先观察，暂不贸然引入倍速控制。</w:t>
       </w:r>
     </w:p>
     <w:p>
@@ -2092,7 +3208,7 @@
           <w:color w:val="1E2630"/>
           <w:sz w:val="21"/>
         </w:rPr>
-        <w:t>先完成云端 pair_progress 验证。若两端相对偏差稳定，再实现 playback epoch 与晚加入同步；不要直接根据 client-to-Room 的数值触发自动 seek。</w:t>
+        <w:t>先保持当前候选代码不提交，复核文档与本地回归证据。下一次工程阶段优先实现晚加入同步，随后再让稳健窗口输出“只建议、不执行”的校正决策；不要直接根据 client-to-Room 或单条 pair_diff 触发 seek。</w:t>
       </w:r>
     </w:p>
     <w:sectPr>

</xml_diff>

<commit_message>
feature: synchronize late-joining clients with room snapshots
</commit_message>
<xml_diff>
--- a/docs/SyncCinema_Engineering_Journal.docx
+++ b/docs/SyncCinema_Engineering_Journal.docx
@@ -206,7 +206,7 @@
                 <w:color w:val="1E2630"/>
                 <w:sz w:val="19"/>
               </w:rPr>
-              <w:t>2c1bf4f - pairwise playback skew analysis</w:t>
+              <w:t>4944cf8 - control epochs and robust skew windows</w:t>
             </w:r>
           </w:p>
         </w:tc>
@@ -247,7 +247,7 @@
                 <w:color w:val="1E2630"/>
                 <w:sz w:val="19"/>
               </w:rPr>
-              <w:t>公网指标验证、控制 epoch 与稳健偏差窗口</w:t>
+              <w:t>晚加入房间快照、控制版本与毫秒级播放器对齐</w:t>
             </w:r>
           </w:p>
         </w:tc>
@@ -288,7 +288,7 @@
                 <w:color w:val="1E2630"/>
                 <w:sz w:val="19"/>
               </w:rPr>
-              <w:t>2026-07-28</w:t>
+              <w:t>2026-07-29</w:t>
             </w:r>
           </w:p>
         </w:tc>
@@ -1136,6 +1136,65 @@
           </w:p>
         </w:tc>
       </w:tr>
+      <w:tr>
+        <w:tc>
+          <w:tcPr>
+            <w:tcW w:type="dxa" w:w="1450"/>
+          </w:tcPr>
+          <w:p>
+            <w:pPr>
+              <w:spacing w:before="0" w:after="0" w:line="276" w:lineRule="auto"/>
+              <w:jc w:val="center"/>
+            </w:pPr>
+            <w:r>
+              <w:rPr>
+                <w:rFonts w:ascii="Consolas" w:hAnsi="Consolas" w:eastAsia="Consolas"/>
+                <w:color w:val="1E2630"/>
+                <w:sz w:val="17"/>
+              </w:rPr>
+              <w:t>4944cf8</w:t>
+            </w:r>
+          </w:p>
+        </w:tc>
+        <w:tc>
+          <w:tcPr>
+            <w:tcW w:type="dxa" w:w="3300"/>
+          </w:tcPr>
+          <w:p>
+            <w:pPr>
+              <w:spacing w:before="0" w:after="0" w:line="276" w:lineRule="auto"/>
+              <w:jc w:val="left"/>
+            </w:pPr>
+            <w:r>
+              <w:rPr>
+                <w:rFonts w:ascii="Microsoft YaHei" w:hAnsi="Microsoft YaHei" w:eastAsia="Microsoft YaHei"/>
+                <w:color w:val="1E2630"/>
+                <w:sz w:val="18"/>
+              </w:rPr>
+              <w:t>control epochs and robust skew windows</w:t>
+            </w:r>
+          </w:p>
+        </w:tc>
+        <w:tc>
+          <w:tcPr>
+            <w:tcW w:type="dxa" w:w="4610"/>
+          </w:tcPr>
+          <w:p>
+            <w:pPr>
+              <w:spacing w:before="0" w:after="0" w:line="276" w:lineRule="auto"/>
+              <w:jc w:val="left"/>
+            </w:pPr>
+            <w:r>
+              <w:rPr>
+                <w:rFonts w:ascii="Microsoft YaHei" w:hAnsi="Microsoft YaHei" w:eastAsia="Microsoft YaHei"/>
+                <w:color w:val="1E2630"/>
+                <w:sz w:val="18"/>
+              </w:rPr>
+              <w:t>隔离控制周期并以中位数/P95 过滤单点抖动</w:t>
+            </w:r>
+          </w:p>
+        </w:tc>
+      </w:tr>
     </w:tbl>
     <w:p>
       <w:pPr>
@@ -2892,7 +2951,7 @@
           <w:color w:val="1E2630"/>
           <w:sz w:val="21"/>
         </w:rPr>
-        <w:t>本阶段代码已经实现并完成本地构建与功能回归，但按提交节奏要求暂未提交或部署。云服务器当前仍运行已发布的 2c1bf4f 版本，便于清晰区分已发布基线与本地候选版本。</w:t>
+        <w:t>本阶段已作为 4944cf8 发布到 GitHub。当前文档后续章节记录的新快照功能仍是本地候选，尚未提交或部署，便于清晰区分已发布基线与下一次提交。</w:t>
       </w:r>
     </w:p>
     <w:p>
@@ -2900,7 +2959,7 @@
         <w:pStyle w:val="Heading2"/>
       </w:pPr>
       <w:r>
-        <w:t>4.7 尚未完成</w:t>
+        <w:t>4.7 该提交留下的边界</w:t>
       </w:r>
     </w:p>
     <w:p>
@@ -2926,7 +2985,7 @@
           <w:color w:val="1E2630"/>
           <w:sz w:val="21"/>
         </w:rPr>
-        <w:t>新 client 的晚加入状态快照仍未实现，这是进入自动纠偏前更确定、优先级更高的功能缺口。</w:t>
+        <w:t>4944cf8 尚未处理晚加入 client；该确定性缺陷由下一章的本地候选版本解决。</w:t>
       </w:r>
     </w:p>
     <w:p>
@@ -2960,7 +3019,943 @@
         <w:pStyle w:val="Heading1"/>
       </w:pPr>
       <w:r>
-        <w:t>5. 面试表达模板</w:t>
+        <w:t>5. 本地阶段：晚加入快照与房间版本</w:t>
+      </w:r>
+    </w:p>
+    <w:p>
+      <w:pPr>
+        <w:pStyle w:val="Heading2"/>
+      </w:pPr>
+      <w:r>
+        <w:t>5.1 问题与正确性目标</w:t>
+      </w:r>
+    </w:p>
+    <w:p>
+      <w:pPr>
+        <w:spacing w:before="0" w:after="120" w:line="300" w:lineRule="auto"/>
+      </w:pPr>
+      <w:r>
+        <w:rPr>
+          <w:rFonts w:ascii="Microsoft YaHei" w:hAnsi="Microsoft YaHei" w:eastAsia="Microsoft YaHei"/>
+          <w:color w:val="1E2630"/>
+          <w:sz w:val="21"/>
+        </w:rPr>
+        <w:t>旧版本 client 连接成功后总是从 Stopped、0 秒开始。若房间已经播放到 80 秒，它只有等别人再次发送 SEEK 才能追上；这不是网络抖动，而是协议缺少初始化状态。本阶段先解决这个确定性缺陷，再讨论自动纠偏。</w:t>
+      </w:r>
+    </w:p>
+    <w:p>
+      <w:pPr>
+        <w:spacing w:before="120" w:after="160" w:line="300" w:lineRule="auto"/>
+        <w:shd w:fill="F4F6F9"/>
+        <w:ind w:left="160" w:right="160"/>
+      </w:pPr>
+      <w:r>
+        <w:rPr>
+          <w:rFonts w:ascii="Microsoft YaHei" w:hAnsi="Microsoft YaHei" w:eastAsia="Microsoft YaHei"/>
+          <w:b/>
+          <w:color w:val="1F4D78"/>
+          <w:sz w:val="21"/>
+        </w:rPr>
+        <w:t>正确性目标：</w:t>
+      </w:r>
+      <w:r>
+        <w:rPr>
+          <w:rFonts w:ascii="Microsoft YaHei" w:hAnsi="Microsoft YaHei" w:eastAsia="Microsoft YaHei"/>
+          <w:color w:val="1E2630"/>
+          <w:sz w:val="21"/>
+        </w:rPr>
+        <w:t>新 client 必须得到同一时刻的房间状态、毫秒位置和控制版本；在它加入广播列表与完成初始化之间，不能静默漏掉任何 PLAY、PAUSE 或 SEEK。</w:t>
+      </w:r>
+    </w:p>
+    <w:p>
+      <w:pPr>
+        <w:pStyle w:val="Heading2"/>
+      </w:pPr>
+      <w:r>
+        <w:t>5.2 SNAPSHOT 协议与唯一 epoch</w:t>
+      </w:r>
+    </w:p>
+    <w:p>
+      <w:pPr>
+        <w:spacing w:before="80" w:after="160" w:line="264" w:lineRule="auto"/>
+        <w:shd w:fill="F7F8FA"/>
+        <w:ind w:left="180" w:right="180"/>
+      </w:pPr>
+      <w:r>
+        <w:rPr>
+          <w:rFonts w:ascii="Consolas" w:hAnsi="Consolas" w:eastAsia="Consolas"/>
+          <w:color w:val="1E2630"/>
+          <w:sz w:val="17"/>
+        </w:rPr>
+        <w:t>SNAPSHOT &lt;control_epoch&gt; &lt;Playing|Paused|Stopped&gt; &lt;position_ms&gt;</w:t>
+        <w:br/>
+      </w:r>
+      <w:r>
+        <w:rPr>
+          <w:rFonts w:ascii="Consolas" w:hAnsi="Consolas" w:eastAsia="Consolas"/>
+          <w:color w:val="1E2630"/>
+          <w:sz w:val="17"/>
+        </w:rPr>
+        <w:br/>
+      </w:r>
+      <w:r>
+        <w:rPr>
+          <w:rFonts w:ascii="Consolas" w:hAnsi="Consolas" w:eastAsia="Consolas"/>
+          <w:color w:val="1E2630"/>
+          <w:sz w:val="17"/>
+        </w:rPr>
+        <w:t>example:</w:t>
+        <w:br/>
+      </w:r>
+      <w:r>
+        <w:rPr>
+          <w:rFonts w:ascii="Consolas" w:hAnsi="Consolas" w:eastAsia="Consolas"/>
+          <w:color w:val="1E2630"/>
+          <w:sz w:val="17"/>
+        </w:rPr>
+        <w:t>SNAPSHOT 7 Playing 123456</w:t>
+      </w:r>
+    </w:p>
+    <w:p>
+      <w:pPr>
+        <w:spacing w:before="0" w:after="120" w:line="300" w:lineRule="auto"/>
+      </w:pPr>
+      <w:r>
+        <w:rPr>
+          <w:rFonts w:ascii="Microsoft YaHei" w:hAnsi="Microsoft YaHei" w:eastAsia="Microsoft YaHei"/>
+          <w:color w:val="1E2630"/>
+          <w:sz w:val="21"/>
+        </w:rPr>
+        <w:t>Room 成为 controlEpoch 的唯一生产者：每接受一条 PLAY、PAUSE 或 SEEK，epoch 递增一次。Room::getSnapshot() 在同一把 mutex 下同时读取推算后的 SyncState 和 controlEpoch，避免把新位置与旧版本拼成一份逻辑上不存在的快照。Metrics 只消费 Room 给出的 epoch，不再维护第二套独立计数器。</w:t>
+      </w:r>
+    </w:p>
+    <w:p>
+      <w:pPr>
+        <w:pStyle w:val="ListBullet"/>
+      </w:pPr>
+      <w:r>
+        <w:rPr>
+          <w:rFonts w:ascii="Microsoft YaHei" w:hAnsi="Microsoft YaHei" w:eastAsia="Microsoft YaHei"/>
+          <w:color w:val="1E2630"/>
+          <w:sz w:val="21"/>
+        </w:rPr>
+        <w:t>SNAPSHOT 是 server 到 client 的单向初始化消息，client 伪造快照不会改变 Room。</w:t>
+      </w:r>
+    </w:p>
+    <w:p>
+      <w:pPr>
+        <w:pStyle w:val="ListBullet"/>
+      </w:pPr>
+      <w:r>
+        <w:rPr>
+          <w:rFonts w:ascii="Microsoft YaHei" w:hAnsi="Microsoft YaHei" w:eastAsia="Microsoft YaHei"/>
+          <w:color w:val="1E2630"/>
+          <w:sz w:val="21"/>
+        </w:rPr>
+        <w:t>解析器拒绝负 epoch、负位置、非法状态、缺失字段、额外字段和无法安全转换的超大位置。</w:t>
+      </w:r>
+    </w:p>
+    <w:p>
+      <w:pPr>
+        <w:pStyle w:val="ListBullet"/>
+      </w:pPr>
+      <w:r>
+        <w:rPr>
+          <w:rFonts w:ascii="Microsoft YaHei" w:hAnsi="Microsoft YaHei" w:eastAsia="Microsoft YaHei"/>
+          <w:color w:val="1E2630"/>
+          <w:sz w:val="21"/>
+        </w:rPr>
+        <w:t>PLAY/PAUSE/SEEK 的判定集中在 isPlaybackControlMessage()，server、Room 和 metrics 共用一套规则。</w:t>
+      </w:r>
+    </w:p>
+    <w:p>
+      <w:pPr>
+        <w:pStyle w:val="Heading2"/>
+      </w:pPr>
+      <w:r>
+        <w:t>5.3 如何保证加入顺序</w:t>
+      </w:r>
+    </w:p>
+    <w:p>
+      <w:pPr>
+        <w:spacing w:before="80" w:after="160" w:line="264" w:lineRule="auto"/>
+        <w:shd w:fill="F7F8FA"/>
+        <w:ind w:left="180" w:right="180"/>
+      </w:pPr>
+      <w:r>
+        <w:rPr>
+          <w:rFonts w:ascii="Consolas" w:hAnsi="Consolas" w:eastAsia="Consolas"/>
+          <w:color w:val="1E2630"/>
+          <w:sz w:val="17"/>
+        </w:rPr>
+        <w:t>accept client</w:t>
+        <w:br/>
+      </w:r>
+      <w:r>
+        <w:rPr>
+          <w:rFonts w:ascii="Consolas" w:hAnsi="Consolas" w:eastAsia="Consolas"/>
+          <w:color w:val="1E2630"/>
+          <w:sz w:val="17"/>
+        </w:rPr>
+        <w:t xml:space="preserve">  -&gt; lock controlCommandMutex</w:t>
+        <w:br/>
+      </w:r>
+      <w:r>
+        <w:rPr>
+          <w:rFonts w:ascii="Consolas" w:hAnsi="Consolas" w:eastAsia="Consolas"/>
+          <w:color w:val="1E2630"/>
+          <w:sz w:val="17"/>
+        </w:rPr>
+        <w:t xml:space="preserve">  -&gt; Room::addClient</w:t>
+        <w:br/>
+      </w:r>
+      <w:r>
+        <w:rPr>
+          <w:rFonts w:ascii="Consolas" w:hAnsi="Consolas" w:eastAsia="Consolas"/>
+          <w:color w:val="1E2630"/>
+          <w:sz w:val="17"/>
+        </w:rPr>
+        <w:t xml:space="preserve">  -&gt; Room::getSnapshot</w:t>
+        <w:br/>
+      </w:r>
+      <w:r>
+        <w:rPr>
+          <w:rFonts w:ascii="Consolas" w:hAnsi="Consolas" w:eastAsia="Consolas"/>
+          <w:color w:val="1E2630"/>
+          <w:sz w:val="17"/>
+        </w:rPr>
+        <w:t xml:space="preserve">  -&gt; send SNAPSHOT</w:t>
+        <w:br/>
+      </w:r>
+      <w:r>
+        <w:rPr>
+          <w:rFonts w:ascii="Consolas" w:hAnsi="Consolas" w:eastAsia="Consolas"/>
+          <w:color w:val="1E2630"/>
+          <w:sz w:val="17"/>
+        </w:rPr>
+        <w:t xml:space="preserve">  -&gt; unlock</w:t>
+        <w:br/>
+      </w:r>
+      <w:r>
+        <w:rPr>
+          <w:rFonts w:ascii="Consolas" w:hAnsi="Consolas" w:eastAsia="Consolas"/>
+          <w:color w:val="1E2630"/>
+          <w:sz w:val="17"/>
+        </w:rPr>
+        <w:t xml:space="preserve">  -&gt; start client receive thread</w:t>
+      </w:r>
+    </w:p>
+    <w:p>
+      <w:pPr>
+        <w:spacing w:before="0" w:after="120" w:line="300" w:lineRule="auto"/>
+      </w:pPr>
+      <w:r>
+        <w:rPr>
+          <w:rFonts w:ascii="Microsoft YaHei" w:hAnsi="Microsoft YaHei" w:eastAsia="Microsoft YaHei"/>
+          <w:color w:val="1E2630"/>
+          <w:sz w:val="21"/>
+        </w:rPr>
+        <w:t>注册、读取快照和发送快照与普通控制命令使用同一把 controlCommandMutex。因此其他 client 的控制命令只能完整地发生在该流程之前或之后，不能插在中间。heartbeat 线程仍可能先发出 PING，所以 client 的握手状态机允许在 SNAPSHOT 前响应 PING；同一次 recv 多读到的后续字节会保留并交给广播线程，TCP 顺序不会被丢弃。</w:t>
+      </w:r>
+    </w:p>
+    <w:p>
+      <w:pPr>
+        <w:pStyle w:val="ListBullet"/>
+      </w:pPr>
+      <w:r>
+        <w:rPr>
+          <w:rFonts w:ascii="Microsoft YaHei" w:hAnsi="Microsoft YaHei" w:eastAsia="Microsoft YaHei"/>
+          <w:color w:val="1E2630"/>
+          <w:sz w:val="21"/>
+        </w:rPr>
+        <w:t>client 最多等待 5 秒；连接旧 server 或协议异常时明确失败，不会永久卡在 recv。</w:t>
+      </w:r>
+    </w:p>
+    <w:p>
+      <w:pPr>
+        <w:pStyle w:val="ListBullet"/>
+      </w:pPr>
+      <w:r>
+        <w:rPr>
+          <w:rFonts w:ascii="Microsoft YaHei" w:hAnsi="Microsoft YaHei" w:eastAsia="Microsoft YaHei"/>
+          <w:color w:val="1E2630"/>
+          <w:sz w:val="21"/>
+        </w:rPr>
+        <w:t>SNAPSHOT 发送失败时，server 会移除连接并关闭 socket，不启动半初始化 client 线程。</w:t>
+      </w:r>
+    </w:p>
+    <w:p>
+      <w:pPr>
+        <w:pStyle w:val="ListBullet"/>
+      </w:pPr>
+      <w:r>
+        <w:rPr>
+          <w:rFonts w:ascii="Microsoft YaHei" w:hAnsi="Microsoft YaHei" w:eastAsia="Microsoft YaHei"/>
+          <w:color w:val="1E2630"/>
+          <w:sz w:val="21"/>
+        </w:rPr>
+        <w:t>快照发送完成后到达的新控制消息会按同一 TCP 连接顺序排在快照后面。</w:t>
+      </w:r>
+    </w:p>
+    <w:p>
+      <w:pPr>
+        <w:pStyle w:val="Heading2"/>
+      </w:pPr>
+      <w:r>
+        <w:t>5.4 真实播放器如何应用快照</w:t>
+      </w:r>
+    </w:p>
+    <w:p>
+      <w:pPr>
+        <w:spacing w:before="0" w:after="120" w:line="300" w:lineRule="auto"/>
+      </w:pPr>
+      <w:r>
+        <w:rPr>
+          <w:rFonts w:ascii="Microsoft YaHei" w:hAnsi="Microsoft YaHei" w:eastAsia="Microsoft YaHei"/>
+          <w:color w:val="1E2630"/>
+          <w:sz w:val="21"/>
+        </w:rPr>
+        <w:t>openMedia() 成功只代表媒体对象创建完成，网络媒体和真实解码器此时未必可以 seek。对于非 Stopped+0 的快照，client 先启动播放器，最多等待 15 秒直到 isSeekable()，再调用 seekMilliseconds()。若快照状态是 Paused 或 Stopped，则定位后暂停；若是 Playing，则补上从收到快照到实际 seek 的本地经过时间。</w:t>
+      </w:r>
+    </w:p>
+    <w:p>
+      <w:pPr>
+        <w:spacing w:before="120" w:after="160" w:line="300" w:lineRule="auto"/>
+        <w:shd w:fill="F4F6F9"/>
+        <w:ind w:left="160" w:right="160"/>
+      </w:pPr>
+      <w:r>
+        <w:rPr>
+          <w:rFonts w:ascii="Microsoft YaHei" w:hAnsi="Microsoft YaHei" w:eastAsia="Microsoft YaHei"/>
+          <w:b/>
+          <w:color w:val="1F4D78"/>
+          <w:sz w:val="21"/>
+        </w:rPr>
+        <w:t>精度修正：</w:t>
+      </w:r>
+      <w:r>
+        <w:rPr>
+          <w:rFonts w:ascii="Microsoft YaHei" w:hAnsi="Microsoft YaHei" w:eastAsia="Microsoft YaHei"/>
+          <w:color w:val="1E2630"/>
+          <w:sz w:val="21"/>
+        </w:rPr>
+        <w:t>最初实现把 position_ms 四舍五入成整秒后调用 seek(int)，天然引入最多约 500 ms 误差。复核时扩展 PlayerController::seekMilliseconds()，libVLC 直接使用原生毫秒时间单位，MockPlayer 同步保留毫秒状态。</w:t>
+      </w:r>
+    </w:p>
+    <w:p>
+      <w:pPr>
+        <w:pStyle w:val="ListBullet"/>
+      </w:pPr>
+      <w:r>
+        <w:rPr>
+          <w:rFonts w:ascii="Microsoft YaHei" w:hAnsi="Microsoft YaHei" w:eastAsia="Microsoft YaHei"/>
+          <w:color w:val="1E2630"/>
+          <w:sz w:val="21"/>
+        </w:rPr>
+        <w:t>Stopped+0 不启动解码器，避免一个空房间的新连接无意义地弹出播放器窗口。</w:t>
+      </w:r>
+    </w:p>
+    <w:p>
+      <w:pPr>
+        <w:pStyle w:val="ListBullet"/>
+      </w:pPr>
+      <w:r>
+        <w:rPr>
+          <w:rFonts w:ascii="Microsoft YaHei" w:hAnsi="Microsoft YaHei" w:eastAsia="Microsoft YaHei"/>
+          <w:color w:val="1E2630"/>
+          <w:sz w:val="21"/>
+        </w:rPr>
+        <w:t>播放器准备期间 playerMutex 保证同一个 PlayerController 不被其他线程并发控制。</w:t>
+      </w:r>
+    </w:p>
+    <w:p>
+      <w:pPr>
+        <w:pStyle w:val="ListBullet"/>
+      </w:pPr>
+      <w:r>
+        <w:rPr>
+          <w:rFonts w:ascii="Microsoft YaHei" w:hAnsi="Microsoft YaHei" w:eastAsia="Microsoft YaHei"/>
+          <w:color w:val="1E2630"/>
+          <w:sz w:val="21"/>
+        </w:rPr>
+        <w:t>成功后输出 initial_sync 指标，包含 epoch、快照位置、目标位置和应用耗时。</w:t>
+      </w:r>
+    </w:p>
+    <w:p>
+      <w:pPr>
+        <w:pStyle w:val="Heading2"/>
+      </w:pPr>
+      <w:r>
+        <w:t>5.5 核心修改</w:t>
+      </w:r>
+    </w:p>
+    <w:tbl>
+      <w:tblPr>
+        <w:tblW w:type="dxa" w:w="9360"/>
+        <w:jc w:val="left"/>
+        <w:tblLayout w:type="fixed"/>
+        <w:tblLook w:firstColumn="1" w:firstRow="1" w:lastColumn="0" w:lastRow="0" w:noHBand="0" w:noVBand="1" w:val="04A0"/>
+        <w:tblInd w:w="120" w:type="dxa"/>
+        <w:tblBorders>
+          <w:top w:val="single" w:sz="4" w:space="0" w:color="C8D2DE"/>
+          <w:left w:val="single" w:sz="4" w:space="0" w:color="C8D2DE"/>
+          <w:bottom w:val="single" w:sz="4" w:space="0" w:color="C8D2DE"/>
+          <w:right w:val="single" w:sz="4" w:space="0" w:color="C8D2DE"/>
+          <w:insideH w:val="single" w:sz="4" w:space="0" w:color="C8D2DE"/>
+          <w:insideV w:val="single" w:sz="4" w:space="0" w:color="C8D2DE"/>
+        </w:tblBorders>
+      </w:tblPr>
+      <w:tblGrid>
+        <w:gridCol w:w="2200"/>
+        <w:gridCol w:w="3580"/>
+        <w:gridCol w:w="3580"/>
+      </w:tblGrid>
+      <w:tr>
+        <w:trPr>
+          <w:tblHeader w:val="true"/>
+        </w:trPr>
+        <w:tc>
+          <w:tcPr>
+            <w:tcW w:type="dxa" w:w="2200"/>
+            <w:vAlign w:val="center"/>
+            <w:tcMar>
+              <w:top w:w="80" w:type="dxa"/>
+              <w:start w:w="120" w:type="dxa"/>
+              <w:bottom w:w="80" w:type="dxa"/>
+              <w:end w:w="120" w:type="dxa"/>
+            </w:tcMar>
+            <w:shd w:fill="E8EEF5"/>
+          </w:tcPr>
+          <w:p>
+            <w:pPr>
+              <w:spacing w:before="0" w:after="0" w:line="276" w:lineRule="auto"/>
+              <w:jc w:val="center"/>
+            </w:pPr>
+            <w:r>
+              <w:rPr>
+                <w:rFonts w:ascii="Microsoft YaHei" w:hAnsi="Microsoft YaHei" w:eastAsia="Microsoft YaHei"/>
+                <w:b/>
+                <w:color w:val="1F4D78"/>
+                <w:sz w:val="18"/>
+              </w:rPr>
+              <w:t>文件/模块</w:t>
+            </w:r>
+          </w:p>
+        </w:tc>
+        <w:tc>
+          <w:tcPr>
+            <w:tcW w:type="dxa" w:w="3580"/>
+            <w:vAlign w:val="center"/>
+            <w:tcMar>
+              <w:top w:w="80" w:type="dxa"/>
+              <w:start w:w="120" w:type="dxa"/>
+              <w:bottom w:w="80" w:type="dxa"/>
+              <w:end w:w="120" w:type="dxa"/>
+            </w:tcMar>
+            <w:shd w:fill="E8EEF5"/>
+          </w:tcPr>
+          <w:p>
+            <w:pPr>
+              <w:spacing w:before="0" w:after="0" w:line="276" w:lineRule="auto"/>
+              <w:jc w:val="center"/>
+            </w:pPr>
+            <w:r>
+              <w:rPr>
+                <w:rFonts w:ascii="Microsoft YaHei" w:hAnsi="Microsoft YaHei" w:eastAsia="Microsoft YaHei"/>
+                <w:b/>
+                <w:color w:val="1F4D78"/>
+                <w:sz w:val="18"/>
+              </w:rPr>
+              <w:t>核心修改</w:t>
+            </w:r>
+          </w:p>
+        </w:tc>
+        <w:tc>
+          <w:tcPr>
+            <w:tcW w:type="dxa" w:w="3580"/>
+            <w:vAlign w:val="center"/>
+            <w:tcMar>
+              <w:top w:w="80" w:type="dxa"/>
+              <w:start w:w="120" w:type="dxa"/>
+              <w:bottom w:w="80" w:type="dxa"/>
+              <w:end w:w="120" w:type="dxa"/>
+            </w:tcMar>
+            <w:shd w:fill="E8EEF5"/>
+          </w:tcPr>
+          <w:p>
+            <w:pPr>
+              <w:spacing w:before="0" w:after="0" w:line="276" w:lineRule="auto"/>
+              <w:jc w:val="center"/>
+            </w:pPr>
+            <w:r>
+              <w:rPr>
+                <w:rFonts w:ascii="Microsoft YaHei" w:hAnsi="Microsoft YaHei" w:eastAsia="Microsoft YaHei"/>
+                <w:b/>
+                <w:color w:val="1F4D78"/>
+                <w:sz w:val="18"/>
+              </w:rPr>
+              <w:t>工程价值</w:t>
+            </w:r>
+          </w:p>
+        </w:tc>
+      </w:tr>
+      <w:tr>
+        <w:tc>
+          <w:tcPr>
+            <w:tcW w:type="dxa" w:w="2200"/>
+          </w:tcPr>
+          <w:p>
+            <w:pPr>
+              <w:spacing w:before="0" w:after="0" w:line="276" w:lineRule="auto"/>
+            </w:pPr>
+            <w:r>
+              <w:rPr>
+                <w:rFonts w:ascii="Consolas" w:hAnsi="Consolas" w:eastAsia="Consolas"/>
+                <w:color w:val="1E2630"/>
+                <w:sz w:val="17"/>
+              </w:rPr>
+              <w:t>Protocol.h/.cpp</w:t>
+            </w:r>
+          </w:p>
+        </w:tc>
+        <w:tc>
+          <w:tcPr>
+            <w:tcW w:type="dxa" w:w="3580"/>
+          </w:tcPr>
+          <w:p>
+            <w:pPr>
+              <w:spacing w:before="0" w:after="0" w:line="276" w:lineRule="auto"/>
+            </w:pPr>
+            <w:r>
+              <w:rPr>
+                <w:rFonts w:ascii="Microsoft YaHei" w:hAnsi="Microsoft YaHei" w:eastAsia="Microsoft YaHei"/>
+                <w:color w:val="1E2630"/>
+                <w:sz w:val="18"/>
+              </w:rPr>
+              <w:t>新增 SNAPSHOT 消息、controlEpoch、严格解析与控制消息分类。</w:t>
+            </w:r>
+          </w:p>
+        </w:tc>
+        <w:tc>
+          <w:tcPr>
+            <w:tcW w:type="dxa" w:w="3580"/>
+          </w:tcPr>
+          <w:p>
+            <w:pPr>
+              <w:spacing w:before="0" w:after="0" w:line="276" w:lineRule="auto"/>
+            </w:pPr>
+            <w:r>
+              <w:rPr>
+                <w:rFonts w:ascii="Microsoft YaHei" w:hAnsi="Microsoft YaHei" w:eastAsia="Microsoft YaHei"/>
+                <w:color w:val="1E2630"/>
+                <w:sz w:val="18"/>
+              </w:rPr>
+              <w:t>把晚加入状态变成可测试、可演进的正式协议，而不是临时字符串。</w:t>
+            </w:r>
+          </w:p>
+        </w:tc>
+      </w:tr>
+      <w:tr>
+        <w:tc>
+          <w:tcPr>
+            <w:tcW w:type="dxa" w:w="2200"/>
+          </w:tcPr>
+          <w:p>
+            <w:pPr>
+              <w:spacing w:before="0" w:after="0" w:line="276" w:lineRule="auto"/>
+            </w:pPr>
+            <w:r>
+              <w:rPr>
+                <w:rFonts w:ascii="Consolas" w:hAnsi="Consolas" w:eastAsia="Consolas"/>
+                <w:color w:val="1E2630"/>
+                <w:sz w:val="17"/>
+              </w:rPr>
+              <w:t>Room.h/.cpp</w:t>
+            </w:r>
+          </w:p>
+        </w:tc>
+        <w:tc>
+          <w:tcPr>
+            <w:tcW w:type="dxa" w:w="3580"/>
+          </w:tcPr>
+          <w:p>
+            <w:pPr>
+              <w:spacing w:before="0" w:after="0" w:line="276" w:lineRule="auto"/>
+            </w:pPr>
+            <w:r>
+              <w:rPr>
+                <w:rFonts w:ascii="Microsoft YaHei" w:hAnsi="Microsoft YaHei" w:eastAsia="Microsoft YaHei"/>
+                <w:color w:val="1E2630"/>
+                <w:sz w:val="18"/>
+              </w:rPr>
+              <w:t>新增原子 RoomSnapshot；每条有效控制命令递增唯一 epoch。</w:t>
+            </w:r>
+          </w:p>
+        </w:tc>
+        <w:tc>
+          <w:tcPr>
+            <w:tcW w:type="dxa" w:w="3580"/>
+          </w:tcPr>
+          <w:p>
+            <w:pPr>
+              <w:spacing w:before="0" w:after="0" w:line="276" w:lineRule="auto"/>
+            </w:pPr>
+            <w:r>
+              <w:rPr>
+                <w:rFonts w:ascii="Microsoft YaHei" w:hAnsi="Microsoft YaHei" w:eastAsia="Microsoft YaHei"/>
+                <w:color w:val="1E2630"/>
+                <w:sz w:val="18"/>
+              </w:rPr>
+              <w:t>状态、位置和版本在同一把锁下读取，不会拼出撕裂快照。</w:t>
+            </w:r>
+          </w:p>
+        </w:tc>
+      </w:tr>
+      <w:tr>
+        <w:tc>
+          <w:tcPr>
+            <w:tcW w:type="dxa" w:w="2200"/>
+          </w:tcPr>
+          <w:p>
+            <w:pPr>
+              <w:spacing w:before="0" w:after="0" w:line="276" w:lineRule="auto"/>
+            </w:pPr>
+            <w:r>
+              <w:rPr>
+                <w:rFonts w:ascii="Consolas" w:hAnsi="Consolas" w:eastAsia="Consolas"/>
+                <w:color w:val="1E2630"/>
+                <w:sz w:val="17"/>
+              </w:rPr>
+              <w:t>SyncServer.cpp</w:t>
+            </w:r>
+          </w:p>
+        </w:tc>
+        <w:tc>
+          <w:tcPr>
+            <w:tcW w:type="dxa" w:w="3580"/>
+          </w:tcPr>
+          <w:p>
+            <w:pPr>
+              <w:spacing w:before="0" w:after="0" w:line="276" w:lineRule="auto"/>
+            </w:pPr>
+            <w:r>
+              <w:rPr>
+                <w:rFonts w:ascii="Microsoft YaHei" w:hAnsi="Microsoft YaHei" w:eastAsia="Microsoft YaHei"/>
+                <w:color w:val="1E2630"/>
+                <w:sz w:val="18"/>
+              </w:rPr>
+              <w:t>注册 client、读取快照和发送快照与控制命令共用顺序锁。</w:t>
+            </w:r>
+          </w:p>
+        </w:tc>
+        <w:tc>
+          <w:tcPr>
+            <w:tcW w:type="dxa" w:w="3580"/>
+          </w:tcPr>
+          <w:p>
+            <w:pPr>
+              <w:spacing w:before="0" w:after="0" w:line="276" w:lineRule="auto"/>
+            </w:pPr>
+            <w:r>
+              <w:rPr>
+                <w:rFonts w:ascii="Microsoft YaHei" w:hAnsi="Microsoft YaHei" w:eastAsia="Microsoft YaHei"/>
+                <w:color w:val="1E2630"/>
+                <w:sz w:val="18"/>
+              </w:rPr>
+              <w:t>新 client 不会在加入与初始化之间漏掉 PLAY、PAUSE 或 SEEK。</w:t>
+            </w:r>
+          </w:p>
+        </w:tc>
+      </w:tr>
+      <w:tr>
+        <w:tc>
+          <w:tcPr>
+            <w:tcW w:type="dxa" w:w="2200"/>
+          </w:tcPr>
+          <w:p>
+            <w:pPr>
+              <w:spacing w:before="0" w:after="0" w:line="276" w:lineRule="auto"/>
+            </w:pPr>
+            <w:r>
+              <w:rPr>
+                <w:rFonts w:ascii="Consolas" w:hAnsi="Consolas" w:eastAsia="Consolas"/>
+                <w:color w:val="1E2630"/>
+                <w:sz w:val="17"/>
+              </w:rPr>
+              <w:t>Client / PlayerController</w:t>
+            </w:r>
+          </w:p>
+        </w:tc>
+        <w:tc>
+          <w:tcPr>
+            <w:tcW w:type="dxa" w:w="3580"/>
+          </w:tcPr>
+          <w:p>
+            <w:pPr>
+              <w:spacing w:before="0" w:after="0" w:line="276" w:lineRule="auto"/>
+            </w:pPr>
+            <w:r>
+              <w:rPr>
+                <w:rFonts w:ascii="Microsoft YaHei" w:hAnsi="Microsoft YaHei" w:eastAsia="Microsoft YaHei"/>
+                <w:color w:val="1E2630"/>
+                <w:sz w:val="18"/>
+              </w:rPr>
+              <w:t>新增 5 秒握手、PING 兼容、缓冲保留、seekable 等待和毫秒级 seek。</w:t>
+            </w:r>
+          </w:p>
+        </w:tc>
+        <w:tc>
+          <w:tcPr>
+            <w:tcW w:type="dxa" w:w="3580"/>
+          </w:tcPr>
+          <w:p>
+            <w:pPr>
+              <w:spacing w:before="0" w:after="0" w:line="276" w:lineRule="auto"/>
+            </w:pPr>
+            <w:r>
+              <w:rPr>
+                <w:rFonts w:ascii="Microsoft YaHei" w:hAnsi="Microsoft YaHei" w:eastAsia="Microsoft YaHei"/>
+                <w:color w:val="1E2630"/>
+                <w:sz w:val="18"/>
+              </w:rPr>
+              <w:t>真实 libVLC 准备完成后再按快照精确定位，避免整秒取整误差。</w:t>
+            </w:r>
+          </w:p>
+        </w:tc>
+      </w:tr>
+      <w:tr>
+        <w:tc>
+          <w:tcPr>
+            <w:tcW w:type="dxa" w:w="2200"/>
+          </w:tcPr>
+          <w:p>
+            <w:pPr>
+              <w:spacing w:before="0" w:after="0" w:line="276" w:lineRule="auto"/>
+            </w:pPr>
+            <w:r>
+              <w:rPr>
+                <w:rFonts w:ascii="Consolas" w:hAnsi="Consolas" w:eastAsia="Consolas"/>
+                <w:color w:val="1E2630"/>
+                <w:sz w:val="17"/>
+              </w:rPr>
+              <w:t>CMake / core tests</w:t>
+            </w:r>
+          </w:p>
+        </w:tc>
+        <w:tc>
+          <w:tcPr>
+            <w:tcW w:type="dxa" w:w="3580"/>
+          </w:tcPr>
+          <w:p>
+            <w:pPr>
+              <w:spacing w:before="0" w:after="0" w:line="276" w:lineRule="auto"/>
+            </w:pPr>
+            <w:r>
+              <w:rPr>
+                <w:rFonts w:ascii="Microsoft YaHei" w:hAnsi="Microsoft YaHei" w:eastAsia="Microsoft YaHei"/>
+                <w:color w:val="1E2630"/>
+                <w:sz w:val="18"/>
+              </w:rPr>
+              <w:t>新增无第三方测试目标，覆盖协议、Room epoch 和伪造快照拒绝。</w:t>
+            </w:r>
+          </w:p>
+        </w:tc>
+        <w:tc>
+          <w:tcPr>
+            <w:tcW w:type="dxa" w:w="3580"/>
+          </w:tcPr>
+          <w:p>
+            <w:pPr>
+              <w:spacing w:before="0" w:after="0" w:line="276" w:lineRule="auto"/>
+            </w:pPr>
+            <w:r>
+              <w:rPr>
+                <w:rFonts w:ascii="Microsoft YaHei" w:hAnsi="Microsoft YaHei" w:eastAsia="Microsoft YaHei"/>
+                <w:color w:val="1E2630"/>
+                <w:sz w:val="18"/>
+              </w:rPr>
+              <w:t>Windows 与 Linux 都能快速锁住核心行为。</w:t>
+            </w:r>
+          </w:p>
+        </w:tc>
+      </w:tr>
+    </w:tbl>
+    <w:p>
+      <w:pPr>
+        <w:pStyle w:val="Heading2"/>
+      </w:pPr>
+      <w:r>
+        <w:t>5.6 验证证据</w:t>
+      </w:r>
+    </w:p>
+    <w:p>
+      <w:pPr>
+        <w:pStyle w:val="ListNumber"/>
+      </w:pPr>
+      <w:r>
+        <w:rPr>
+          <w:rFonts w:ascii="Microsoft YaHei" w:hAnsi="Microsoft YaHei" w:eastAsia="Microsoft YaHei"/>
+          <w:color w:val="1E2630"/>
+          <w:sz w:val="21"/>
+        </w:rPr>
+        <w:t>Windows x64 Debug with libVLC 与 MockPlayer 两个配置均完整构建通过。</w:t>
+      </w:r>
+    </w:p>
+    <w:p>
+      <w:pPr>
+        <w:pStyle w:val="ListNumber"/>
+      </w:pPr>
+      <w:r>
+        <w:rPr>
+          <w:rFonts w:ascii="Microsoft YaHei" w:hAnsi="Microsoft YaHei" w:eastAsia="Microsoft YaHei"/>
+          <w:color w:val="1E2630"/>
+          <w:sz w:val="21"/>
+        </w:rPr>
+        <w:t>Windows CTest 在两个配置下均为 1/1 通过；WSL Ubuntu 22.04 server 与核心测试构建通过，CTest 1/1 通过。</w:t>
+      </w:r>
+    </w:p>
+    <w:p>
+      <w:pPr>
+        <w:pStyle w:val="ListNumber"/>
+      </w:pPr>
+      <w:r>
+        <w:rPr>
+          <w:rFonts w:ascii="Microsoft YaHei" w:hAnsi="Microsoft YaHei" w:eastAsia="Microsoft YaHei"/>
+          <w:color w:val="1E2630"/>
+          <w:sz w:val="21"/>
+        </w:rPr>
+        <w:t>TCP 晚加入回归：A 发送 SEEK 42 + PLAY 后，B 收到 SNAPSHOT 2 Playing 42359；B 暂停后，C 收到 SNAPSHOT 3 Paused 42360。</w:t>
+      </w:r>
+    </w:p>
+    <w:p>
+      <w:pPr>
+        <w:pStyle w:val="ListNumber"/>
+      </w:pPr>
+      <w:r>
+        <w:rPr>
+          <w:rFonts w:ascii="Microsoft YaHei" w:hAnsi="Microsoft YaHei" w:eastAsia="Microsoft YaHei"/>
+          <w:color w:val="1E2630"/>
+          <w:sz w:val="21"/>
+        </w:rPr>
+        <w:t>MockPlayer 晚加入运行得到 epoch=2、Playing、47086 ms，并正确执行 play 与毫秒 seek。</w:t>
+      </w:r>
+    </w:p>
+    <w:p>
+      <w:pPr>
+        <w:pStyle w:val="ListNumber"/>
+      </w:pPr>
+      <w:r>
+        <w:rPr>
+          <w:rFonts w:ascii="Microsoft YaHei" w:hAnsi="Microsoft YaHei" w:eastAsia="Microsoft YaHei"/>
+          <w:color w:val="1E2630"/>
+          <w:sz w:val="21"/>
+        </w:rPr>
+        <w:t>真实 libVLC 本地文件测试收到 epoch=2、Playing、79863 ms，播放器位置与快照目标均为 79863 ms。</w:t>
+      </w:r>
+    </w:p>
+    <w:p>
+      <w:pPr>
+        <w:spacing w:before="120" w:after="160" w:line="300" w:lineRule="auto"/>
+        <w:shd w:fill="F4F6F9"/>
+        <w:ind w:left="160" w:right="160"/>
+      </w:pPr>
+      <w:r>
+        <w:rPr>
+          <w:rFonts w:ascii="Microsoft YaHei" w:hAnsi="Microsoft YaHei" w:eastAsia="Microsoft YaHei"/>
+          <w:b/>
+          <w:color w:val="1F4D78"/>
+          <w:sz w:val="21"/>
+        </w:rPr>
+        <w:t>构建诊断：</w:t>
+      </w:r>
+      <w:r>
+        <w:rPr>
+          <w:rFonts w:ascii="Microsoft YaHei" w:hAnsi="Microsoft YaHei" w:eastAsia="Microsoft YaHei"/>
+          <w:color w:val="1E2630"/>
+          <w:sz w:val="21"/>
+        </w:rPr>
+        <w:t>验证时发现目录名虽然是 x64-vlc-debug，旧 CMakeCache 中 USE_LIBVLC 实际为 OFF。重新执行 cmake --preset x64-vlc-debug 后确认开关为 ON，再完成真实 libVLC 测试。这说明构建目录名称不是事实来源，缓存变量和运行日志才是。</w:t>
+      </w:r>
+    </w:p>
+    <w:p>
+      <w:pPr>
+        <w:pStyle w:val="Heading2"/>
+      </w:pPr>
+      <w:r>
+        <w:t>5.7 当前局限</w:t>
+      </w:r>
+    </w:p>
+    <w:p>
+      <w:pPr>
+        <w:pStyle w:val="ListBullet"/>
+      </w:pPr>
+      <w:r>
+        <w:rPr>
+          <w:rFonts w:ascii="Microsoft YaHei" w:hAnsi="Microsoft YaHei" w:eastAsia="Microsoft YaHei"/>
+          <w:color w:val="1E2630"/>
+          <w:sz w:val="21"/>
+        </w:rPr>
+        <w:t>新 client 在首份快照到达前还没有 RTT 样本，初始单向网络传播时间尚未补偿。</w:t>
+      </w:r>
+    </w:p>
+    <w:p>
+      <w:pPr>
+        <w:pStyle w:val="ListBullet"/>
+      </w:pPr>
+      <w:r>
+        <w:rPr>
+          <w:rFonts w:ascii="Microsoft YaHei" w:hAnsi="Microsoft YaHei" w:eastAsia="Microsoft YaHei"/>
+          <w:color w:val="1E2630"/>
+          <w:sz w:val="21"/>
+        </w:rPr>
+        <w:t>该协议升级要求 client/server 同步更新；新 client 连接旧 server 会在 5 秒后主动失败。</w:t>
+      </w:r>
+    </w:p>
+    <w:p>
+      <w:pPr>
+        <w:pStyle w:val="ListBullet"/>
+      </w:pPr>
+      <w:r>
+        <w:rPr>
+          <w:rFonts w:ascii="Microsoft YaHei" w:hAnsi="Microsoft YaHei" w:eastAsia="Microsoft YaHei"/>
+          <w:color w:val="1E2630"/>
+          <w:sz w:val="21"/>
+        </w:rPr>
+        <w:t>普通广播命令尚未携带 epoch，断线重连、去重和过期命令过滤还需要版本化控制信封。</w:t>
+      </w:r>
+    </w:p>
+    <w:p>
+      <w:pPr>
+        <w:pStyle w:val="ListBullet"/>
+      </w:pPr>
+      <w:r>
+        <w:rPr>
+          <w:rFonts w:ascii="Microsoft YaHei" w:hAnsi="Microsoft YaHei" w:eastAsia="Microsoft YaHei"/>
+          <w:color w:val="1E2630"/>
+          <w:sz w:val="21"/>
+        </w:rPr>
+        <w:t>libVLC 冷启动在一次真实测试中约为 16.7 秒，这是产品启动体验问题，不是本阶段快照算法的误差。</w:t>
+      </w:r>
+    </w:p>
+    <w:p>
+      <w:pPr>
+        <w:pStyle w:val="ListBullet"/>
+      </w:pPr>
+      <w:r>
+        <w:rPr>
+          <w:rFonts w:ascii="Microsoft YaHei" w:hAnsi="Microsoft YaHei" w:eastAsia="Microsoft YaHei"/>
+          <w:color w:val="1E2630"/>
+          <w:sz w:val="21"/>
+        </w:rPr>
+        <w:t>本阶段只完成状态初始化，不根据 pair 窗口自动控制播放器。</w:t>
+      </w:r>
+    </w:p>
+    <w:p>
+      <w:pPr>
+        <w:pStyle w:val="Heading1"/>
+      </w:pPr>
+      <w:r>
+        <w:t>6. 面试表达模板</w:t>
       </w:r>
     </w:p>
     <w:p>
@@ -2991,10 +3986,75 @@
     </w:p>
     <w:p>
       <w:pPr>
+        <w:spacing w:before="0" w:after="120" w:line="300" w:lineRule="auto"/>
+      </w:pPr>
+      <w:r>
+        <w:rPr>
+          <w:rFonts w:ascii="Microsoft YaHei" w:hAnsi="Microsoft YaHei" w:eastAsia="Microsoft YaHei"/>
+          <w:color w:val="1E2630"/>
+          <w:sz w:val="21"/>
+        </w:rPr>
+        <w:t>第三段可以这样说明晚加入：自动纠偏前我先处理了一个确定性更强的问题，即新客户端加入正在播放的房间时会停在 0 秒。我让 Room 统一维护 controlEpoch，新增 SNAPSHOT 消息携带状态、毫秒位置和版本；server 用控制顺序锁把注册、取快照和发送变成一个有序步骤。client 侧实现带超时的握手，能在快照前响应心跳并保留多读字节；真实播放器等待 seekable 后按毫秒定位。同时用 Windows/Linux 核心测试、脚本双客户端和真实 libVLC 三层验证，确保协议、并发顺序和播放器行为都成立。</w:t>
+      </w:r>
+    </w:p>
+    <w:p>
+      <w:pPr>
         <w:pStyle w:val="Heading1"/>
       </w:pPr>
       <w:r>
-        <w:t>6. 后续学习重点</w:t>
+        <w:t>7. 后续学习重点</w:t>
+      </w:r>
+    </w:p>
+    <w:p>
+      <w:pPr>
+        <w:pStyle w:val="ListNumber"/>
+      </w:pPr>
+      <w:r>
+        <w:rPr>
+          <w:rFonts w:ascii="Microsoft YaHei" w:hAnsi="Microsoft YaHei" w:eastAsia="Microsoft YaHei"/>
+          <w:color w:val="1E2630"/>
+          <w:sz w:val="21"/>
+        </w:rPr>
+        <w:t>SyncServer 的 accept 初始化临界区：为什么 addClient、getSnapshot、send 必须与控制命令共用顺序锁。</w:t>
+      </w:r>
+    </w:p>
+    <w:p>
+      <w:pPr>
+        <w:pStyle w:val="ListNumber"/>
+      </w:pPr>
+      <w:r>
+        <w:rPr>
+          <w:rFonts w:ascii="Microsoft YaHei" w:hAnsi="Microsoft YaHei" w:eastAsia="Microsoft YaHei"/>
+          <w:color w:val="1E2630"/>
+          <w:sz w:val="21"/>
+        </w:rPr>
+        <w:t>Client::receiveInitialSnapshot：select 超时、PING 兼容和 TCP 多读缓冲如何组成握手状态机。</w:t>
+      </w:r>
+    </w:p>
+    <w:p>
+      <w:pPr>
+        <w:pStyle w:val="ListNumber"/>
+      </w:pPr>
+      <w:r>
+        <w:rPr>
+          <w:rFonts w:ascii="Microsoft YaHei" w:hAnsi="Microsoft YaHei" w:eastAsia="Microsoft YaHei"/>
+          <w:color w:val="1E2630"/>
+          <w:sz w:val="21"/>
+        </w:rPr>
+        <w:t>Client::applyInitialSnapshot：播放器准备、毫秒 seek 和 Playing 状态经过时间补偿。</w:t>
+      </w:r>
+    </w:p>
+    <w:p>
+      <w:pPr>
+        <w:pStyle w:val="ListNumber"/>
+      </w:pPr>
+      <w:r>
+        <w:rPr>
+          <w:rFonts w:ascii="Microsoft YaHei" w:hAnsi="Microsoft YaHei" w:eastAsia="Microsoft YaHei"/>
+          <w:color w:val="1E2630"/>
+          <w:sz w:val="21"/>
+        </w:rPr>
+        <w:t>Room::getSnapshot：如何在同一把锁下形成 state+epoch 的一致快照。</w:t>
       </w:r>
     </w:p>
     <w:p>
@@ -3106,7 +4166,7 @@
         <w:pStyle w:val="Heading1"/>
       </w:pPr>
       <w:r>
-        <w:t>7. 后续工程路线</w:t>
+        <w:t>8. 后续工程路线</w:t>
       </w:r>
     </w:p>
     <w:p>
@@ -3119,7 +4179,7 @@
           <w:color w:val="1E2630"/>
           <w:sz w:val="21"/>
         </w:rPr>
-        <w:t>在合理提交间隔后提交并部署 epoch/window 候选版本，再用两台真实设备复测 PLAY、PAUSE 与 SEEK。</w:t>
+        <w:t>在合理提交间隔后提交晚加入快照候选，并部署到云端，用两台真实设备验证播放中加入、暂停中加入和 SEEK 后加入。</w:t>
       </w:r>
     </w:p>
     <w:p>
@@ -3132,7 +4192,7 @@
           <w:color w:val="1E2630"/>
           <w:sz w:val="21"/>
         </w:rPr>
-        <w:t>实现新 client 的状态快照与加入同步，先消除“晚加入后停在 0 秒”的确定性缺陷。</w:t>
+        <w:t>设计只读校正决策引擎：根据 window_ready、中位数、P95、连续异常、状态和 epoch 输出 would_correct，但不实际控制。</w:t>
       </w:r>
     </w:p>
     <w:p>
@@ -3145,7 +4205,7 @@
           <w:color w:val="1E2630"/>
           <w:sz w:val="21"/>
         </w:rPr>
-        <w:t>设计只读校正建议日志：根据 window_ready、中位数、P95 和连续异常输出 would_correct，但仍不实际控制。</w:t>
+        <w:t>为普通控制广播加入 epoch/命令 id，完善重连后的过期消息过滤和幂等语义。</w:t>
       </w:r>
     </w:p>
     <w:p>
@@ -3158,7 +4218,20 @@
           <w:color w:val="1E2630"/>
           <w:sz w:val="21"/>
         </w:rPr>
-        <w:t>验证建议策略后，再加入带阈值、冷却和迟滞的自动 seek；小偏差优先观察，暂不贸然引入倍速控制。</w:t>
+        <w:t>验证建议策略后，再加入带阈值、冷却和迟滞的硬 seek；小偏差优先观察，暂不贸然引入倍速控制。</w:t>
+      </w:r>
+    </w:p>
+    <w:p>
+      <w:pPr>
+        <w:pStyle w:val="ListNumber"/>
+      </w:pPr>
+      <w:r>
+        <w:rPr>
+          <w:rFonts w:ascii="Microsoft YaHei" w:hAnsi="Microsoft YaHei" w:eastAsia="Microsoft YaHei"/>
+          <w:color w:val="1E2630"/>
+          <w:sz w:val="21"/>
+        </w:rPr>
+        <w:t>进一步同步 server/client 时钟并支持未来执行时间，让两端在约定时刻执行控制，降低广播到达差。</w:t>
       </w:r>
     </w:p>
     <w:p>
@@ -3208,7 +4281,7 @@
           <w:color w:val="1E2630"/>
           <w:sz w:val="21"/>
         </w:rPr>
-        <w:t>先保持当前候选代码不提交，复核文档与本地回归证据。下一次工程阶段优先实现晚加入同步，随后再让稳健窗口输出“只建议、不执行”的校正决策；不要直接根据 client-to-Room 或单条 pair_diff 触发 seek。</w:t>
+        <w:t>当前快照候选已经完成本地实现与验证，按提交节奏要求停在未提交状态。下一阶段先让稳健窗口输出“只建议、不执行”的校正决策，并把原因、阈值、方向和冷却状态写入日志；不要直接根据 client-to-Room 或单条 pair_diff 触发 seek。</w:t>
       </w:r>
     </w:p>
     <w:sectPr>

</xml_diff>

<commit_message>
metrics: add read-only sync correction advice
</commit_message>
<xml_diff>
--- a/docs/SyncCinema_Engineering_Journal.docx
+++ b/docs/SyncCinema_Engineering_Journal.docx
@@ -206,7 +206,7 @@
                 <w:color w:val="1E2630"/>
                 <w:sz w:val="19"/>
               </w:rPr>
-              <w:t>4944cf8 - control epochs and robust skew windows</w:t>
+              <w:t>92300ce - synchronize late-joining clients with room snapshots</w:t>
             </w:r>
           </w:p>
         </w:tc>
@@ -247,7 +247,7 @@
                 <w:color w:val="1E2630"/>
                 <w:sz w:val="19"/>
               </w:rPr>
-              <w:t>晚加入房间快照、控制版本与毫秒级播放器对齐</w:t>
+              <w:t>只读校正决策、安全门与可解释建议日志</w:t>
             </w:r>
           </w:p>
         </w:tc>
@@ -1195,6 +1195,65 @@
           </w:p>
         </w:tc>
       </w:tr>
+      <w:tr>
+        <w:tc>
+          <w:tcPr>
+            <w:tcW w:type="dxa" w:w="1450"/>
+          </w:tcPr>
+          <w:p>
+            <w:pPr>
+              <w:spacing w:before="0" w:after="0" w:line="276" w:lineRule="auto"/>
+              <w:jc w:val="center"/>
+            </w:pPr>
+            <w:r>
+              <w:rPr>
+                <w:rFonts w:ascii="Consolas" w:hAnsi="Consolas" w:eastAsia="Consolas"/>
+                <w:color w:val="1E2630"/>
+                <w:sz w:val="17"/>
+              </w:rPr>
+              <w:t>92300ce</w:t>
+            </w:r>
+          </w:p>
+        </w:tc>
+        <w:tc>
+          <w:tcPr>
+            <w:tcW w:type="dxa" w:w="3300"/>
+          </w:tcPr>
+          <w:p>
+            <w:pPr>
+              <w:spacing w:before="0" w:after="0" w:line="276" w:lineRule="auto"/>
+              <w:jc w:val="left"/>
+            </w:pPr>
+            <w:r>
+              <w:rPr>
+                <w:rFonts w:ascii="Microsoft YaHei" w:hAnsi="Microsoft YaHei" w:eastAsia="Microsoft YaHei"/>
+                <w:color w:val="1E2630"/>
+                <w:sz w:val="18"/>
+              </w:rPr>
+              <w:t>late-joining room snapshots</w:t>
+            </w:r>
+          </w:p>
+        </w:tc>
+        <w:tc>
+          <w:tcPr>
+            <w:tcW w:type="dxa" w:w="4610"/>
+          </w:tcPr>
+          <w:p>
+            <w:pPr>
+              <w:spacing w:before="0" w:after="0" w:line="276" w:lineRule="auto"/>
+              <w:jc w:val="left"/>
+            </w:pPr>
+            <w:r>
+              <w:rPr>
+                <w:rFonts w:ascii="Microsoft YaHei" w:hAnsi="Microsoft YaHei" w:eastAsia="Microsoft YaHei"/>
+                <w:color w:val="1E2630"/>
+                <w:sz w:val="18"/>
+              </w:rPr>
+              <w:t>新 client 加入时按毫秒对齐当前房间状态与控制版本</w:t>
+            </w:r>
+          </w:p>
+        </w:tc>
+      </w:tr>
     </w:tbl>
     <w:p>
       <w:pPr>
@@ -2951,7 +3010,7 @@
           <w:color w:val="1E2630"/>
           <w:sz w:val="21"/>
         </w:rPr>
-        <w:t>本阶段已作为 4944cf8 发布到 GitHub。当前文档后续章节记录的新快照功能仍是本地候选，尚未提交或部署，便于清晰区分已发布基线与下一次提交。</w:t>
+        <w:t>本阶段已作为 4944cf8 发布到 GitHub。它留下的晚加入确定性缺陷，已经在后续的 92300ce 快照提交中解决。</w:t>
       </w:r>
     </w:p>
     <w:p>
@@ -3019,7 +3078,7 @@
         <w:pStyle w:val="Heading1"/>
       </w:pPr>
       <w:r>
-        <w:t>5. 本地阶段：晚加入快照与房间版本</w:t>
+        <w:t>5. 已发布阶段：晚加入快照与房间版本</w:t>
       </w:r>
     </w:p>
     <w:p>
@@ -3955,7 +4014,942 @@
         <w:pStyle w:val="Heading1"/>
       </w:pPr>
       <w:r>
-        <w:t>6. 面试表达模板</w:t>
+        <w:t>6. 本地阶段：只读校正决策引擎</w:t>
+      </w:r>
+    </w:p>
+    <w:p>
+      <w:pPr>
+        <w:pStyle w:val="Heading2"/>
+      </w:pPr>
+      <w:r>
+        <w:t>6.1 为什么不直接调用 seek</w:t>
+      </w:r>
+    </w:p>
+    <w:p>
+      <w:pPr>
+        <w:spacing w:before="0" w:after="120" w:line="300" w:lineRule="auto"/>
+      </w:pPr>
+      <w:r>
+        <w:rPr>
+          <w:rFonts w:ascii="Microsoft YaHei" w:hAnsi="Microsoft YaHei" w:eastAsia="Microsoft YaHei"/>
+          <w:color w:val="1E2630"/>
+          <w:sz w:val="21"/>
+        </w:rPr>
+        <w:t>到 92300ce 为止，系统已经能测量 RTT、把两端上报投影到同一 server 时刻，并在每个控制 epoch 内形成中位数、P95 和连续严重偏差窗口。但“测到偏差”并不等于“应该立刻控制播放器”：样本可能仍在稳定期、窗口不足、方向反复变化，或者刚做过一次校正。若在这些情况下直接 seek，测量噪声会变成用户可见的画面跳动。</w:t>
+      </w:r>
+    </w:p>
+    <w:p>
+      <w:pPr>
+        <w:spacing w:before="120" w:after="160" w:line="300" w:lineRule="auto"/>
+        <w:shd w:fill="F4F6F9"/>
+        <w:ind w:left="160" w:right="160"/>
+      </w:pPr>
+      <w:r>
+        <w:rPr>
+          <w:rFonts w:ascii="Microsoft YaHei" w:hAnsi="Microsoft YaHei" w:eastAsia="Microsoft YaHei"/>
+          <w:b/>
+          <w:color w:val="1F4D78"/>
+          <w:sz w:val="21"/>
+        </w:rPr>
+        <w:t>本阶段目标：</w:t>
+      </w:r>
+      <w:r>
+        <w:rPr>
+          <w:rFonts w:ascii="Microsoft YaHei" w:hAnsi="Microsoft YaHei" w:eastAsia="Microsoft YaHei"/>
+          <w:color w:val="1E2630"/>
+          <w:sz w:val="21"/>
+        </w:rPr>
+        <w:t>新增一个只读策略层，把窗口证据转换成 hold / would_seek_forward 建议；它输出原因、目标端和建议前进量，但绝不调用播放器 API。先验证决策质量，再打开闭环控制。</w:t>
+      </w:r>
+    </w:p>
+    <w:p>
+      <w:pPr>
+        <w:pStyle w:val="Heading2"/>
+      </w:pPr>
+      <w:r>
+        <w:t>6.2 测量、决策与执行三层分离</w:t>
+      </w:r>
+    </w:p>
+    <w:p>
+      <w:pPr>
+        <w:spacing w:before="80" w:after="160" w:line="264" w:lineRule="auto"/>
+        <w:shd w:fill="F7F8FA"/>
+        <w:ind w:left="180" w:right="180"/>
+      </w:pPr>
+      <w:r>
+        <w:rPr>
+          <w:rFonts w:ascii="Consolas" w:hAnsi="Consolas" w:eastAsia="Consolas"/>
+          <w:color w:val="1E2630"/>
+          <w:sz w:val="17"/>
+        </w:rPr>
+        <w:t>SyncMetricsCollector</w:t>
+        <w:br/>
+      </w:r>
+      <w:r>
+        <w:rPr>
+          <w:rFonts w:ascii="Consolas" w:hAnsi="Consolas" w:eastAsia="Consolas"/>
+          <w:color w:val="1E2630"/>
+          <w:sz w:val="17"/>
+        </w:rPr>
+        <w:t xml:space="preserve">  -&gt; normalized pair window / RTT / epoch evidence</w:t>
+        <w:br/>
+      </w:r>
+      <w:r>
+        <w:rPr>
+          <w:rFonts w:ascii="Consolas" w:hAnsi="Consolas" w:eastAsia="Consolas"/>
+          <w:color w:val="1E2630"/>
+          <w:sz w:val="17"/>
+        </w:rPr>
+        <w:t xml:space="preserve">  -&gt; SyncCorrectionPolicy (pure decision)</w:t>
+        <w:br/>
+      </w:r>
+      <w:r>
+        <w:rPr>
+          <w:rFonts w:ascii="Consolas" w:hAnsi="Consolas" w:eastAsia="Consolas"/>
+          <w:color w:val="1E2630"/>
+          <w:sz w:val="17"/>
+        </w:rPr>
+        <w:t xml:space="preserve">  -&gt; correction_advice mode=read_only</w:t>
+        <w:br/>
+      </w:r>
+      <w:r>
+        <w:rPr>
+          <w:rFonts w:ascii="Consolas" w:hAnsi="Consolas" w:eastAsia="Consolas"/>
+          <w:color w:val="1E2630"/>
+          <w:sz w:val="17"/>
+        </w:rPr>
+        <w:br/>
+      </w:r>
+      <w:r>
+        <w:rPr>
+          <w:rFonts w:ascii="Consolas" w:hAnsi="Consolas" w:eastAsia="Consolas"/>
+          <w:color w:val="1E2630"/>
+          <w:sz w:val="17"/>
+        </w:rPr>
+        <w:t>future SyncCorrectionController</w:t>
+        <w:br/>
+      </w:r>
+      <w:r>
+        <w:rPr>
+          <w:rFonts w:ascii="Consolas" w:hAnsi="Consolas" w:eastAsia="Consolas"/>
+          <w:color w:val="1E2630"/>
+          <w:sz w:val="17"/>
+        </w:rPr>
+        <w:t xml:space="preserve">  -&gt; validate client/session/epoch again</w:t>
+        <w:br/>
+      </w:r>
+      <w:r>
+        <w:rPr>
+          <w:rFonts w:ascii="Consolas" w:hAnsi="Consolas" w:eastAsia="Consolas"/>
+          <w:color w:val="1E2630"/>
+          <w:sz w:val="17"/>
+        </w:rPr>
+        <w:t xml:space="preserve">  -&gt; send correction command</w:t>
+        <w:br/>
+      </w:r>
+      <w:r>
+        <w:rPr>
+          <w:rFonts w:ascii="Consolas" w:hAnsi="Consolas" w:eastAsia="Consolas"/>
+          <w:color w:val="1E2630"/>
+          <w:sz w:val="17"/>
+        </w:rPr>
+        <w:t xml:space="preserve">  -&gt; client applies seek and reports result</w:t>
+      </w:r>
+    </w:p>
+    <w:p>
+      <w:pPr>
+        <w:spacing w:before="0" w:after="120" w:line="300" w:lineRule="auto"/>
+      </w:pPr>
+      <w:r>
+        <w:rPr>
+          <w:rFonts w:ascii="Microsoft YaHei" w:hAnsi="Microsoft YaHei" w:eastAsia="Microsoft YaHei"/>
+          <w:color w:val="1E2630"/>
+          <w:sz w:val="21"/>
+        </w:rPr>
+        <w:t>SyncCorrectionPolicy 不持有共享状态，也不访问 socket、Room 或 PlayerController。同一组输入总会得到同一决策，因此可以用快速单元测试覆盖边界。SyncMetricsCollector 仍负责收集和归一化事实；未来控制器才负责命令发送、失败处理和执行反馈。</w:t>
+      </w:r>
+    </w:p>
+    <w:p>
+      <w:pPr>
+        <w:pStyle w:val="Heading2"/>
+      </w:pPr>
+      <w:r>
+        <w:t>6.3 安全门按顺序放行</w:t>
+      </w:r>
+    </w:p>
+    <w:p>
+      <w:pPr>
+        <w:pStyle w:val="ListNumber"/>
+      </w:pPr>
+      <w:r>
+        <w:rPr>
+          <w:rFonts w:ascii="Microsoft YaHei" w:hAnsi="Microsoft YaHei" w:eastAsia="Microsoft YaHei"/>
+          <w:color w:val="1E2630"/>
+          <w:sz w:val="21"/>
+        </w:rPr>
+        <w:t>稳定期：控制后 2 秒内只观察，返回 settling。</w:t>
+      </w:r>
+    </w:p>
+    <w:p>
+      <w:pPr>
+        <w:pStyle w:val="ListNumber"/>
+      </w:pPr>
+      <w:r>
+        <w:rPr>
+          <w:rFonts w:ascii="Microsoft YaHei" w:hAnsi="Microsoft YaHei" w:eastAsia="Microsoft YaHei"/>
+          <w:color w:val="1E2630"/>
+          <w:sz w:val="21"/>
+        </w:rPr>
+        <w:t>窗口完整性：至少 6 个有效 pair 样本，未满足时返回 window_not_ready。</w:t>
+      </w:r>
+    </w:p>
+    <w:p>
+      <w:pPr>
+        <w:pStyle w:val="ListNumber"/>
+      </w:pPr>
+      <w:r>
+        <w:rPr>
+          <w:rFonts w:ascii="Microsoft YaHei" w:hAnsi="Microsoft YaHei" w:eastAsia="Microsoft YaHei"/>
+          <w:color w:val="1E2630"/>
+          <w:sz w:val="21"/>
+        </w:rPr>
+        <w:t>播放状态：Stopped 不纠偏；Playing 还要求两端均有 RTT，Paused 可直接比较静止位置。</w:t>
+      </w:r>
+    </w:p>
+    <w:p>
+      <w:pPr>
+        <w:pStyle w:val="ListNumber"/>
+      </w:pPr>
+      <w:r>
+        <w:rPr>
+          <w:rFonts w:ascii="Microsoft YaHei" w:hAnsi="Microsoft YaHei" w:eastAsia="Microsoft YaHei"/>
+          <w:color w:val="1E2630"/>
+          <w:sz w:val="21"/>
+        </w:rPr>
+        <w:t>偏差分级：中位绝对偏差不超过 250 ms 时保持；250-750 ms 只观察，不做硬 seek。</w:t>
+      </w:r>
+    </w:p>
+    <w:p>
+      <w:pPr>
+        <w:pStyle w:val="ListNumber"/>
+      </w:pPr>
+      <w:r>
+        <w:rPr>
+          <w:rFonts w:ascii="Microsoft YaHei" w:hAnsi="Microsoft YaHei" w:eastAsia="Microsoft YaHei"/>
+          <w:color w:val="1E2630"/>
+          <w:sz w:val="21"/>
+        </w:rPr>
+        <w:t>方向稳定性：至少 75% 窗口样本必须同向，防止 A/B 领先关系不断翻转。</w:t>
+      </w:r>
+    </w:p>
+    <w:p>
+      <w:pPr>
+        <w:pStyle w:val="ListNumber"/>
+      </w:pPr>
+      <w:r>
+        <w:rPr>
+          <w:rFonts w:ascii="Microsoft YaHei" w:hAnsi="Microsoft YaHei" w:eastAsia="Microsoft YaHei"/>
+          <w:color w:val="1E2630"/>
+          <w:sz w:val="21"/>
+        </w:rPr>
+        <w:t>持续性：至少 3 个连续样本达到 750 ms，排除单点异常。</w:t>
+      </w:r>
+    </w:p>
+    <w:p>
+      <w:pPr>
+        <w:pStyle w:val="ListNumber"/>
+      </w:pPr>
+      <w:r>
+        <w:rPr>
+          <w:rFonts w:ascii="Microsoft YaHei" w:hAnsi="Microsoft YaHei" w:eastAsia="Microsoft YaHei"/>
+          <w:color w:val="1E2630"/>
+          <w:sz w:val="21"/>
+        </w:rPr>
+        <w:t>冷却：一次 would_seek 后模拟 5 秒冷却，验证未来控制节奏不会连续触发。</w:t>
+      </w:r>
+    </w:p>
+    <w:p>
+      <w:pPr>
+        <w:spacing w:before="0" w:after="120" w:line="300" w:lineRule="auto"/>
+      </w:pPr>
+      <w:r>
+        <w:rPr>
+          <w:rFonts w:ascii="Microsoft YaHei" w:hAnsi="Microsoft YaHei" w:eastAsia="Microsoft YaHei"/>
+          <w:color w:val="1E2630"/>
+          <w:sz w:val="21"/>
+        </w:rPr>
+        <w:t>策略以 median_diff_ms 的符号确定领先方向，以 median_abs_diff_ms 判断典型偏差大小。P95 当前只记录尾部风险，不参与第一版动作门槛；这样可以先积累真实数据，再决定是否需要把尾部抖动纳入更复杂的策略。</w:t>
+      </w:r>
+    </w:p>
+    <w:p>
+      <w:pPr>
+        <w:pStyle w:val="Heading2"/>
+      </w:pPr>
+      <w:r>
+        <w:t>6.4 为什么只让落后端向前追</w:t>
+      </w:r>
+    </w:p>
+    <w:p>
+      <w:pPr>
+        <w:spacing w:before="0" w:after="120" w:line="300" w:lineRule="auto"/>
+      </w:pPr>
+      <w:r>
+        <w:rPr>
+          <w:rFonts w:ascii="Microsoft YaHei" w:hAnsi="Microsoft YaHei" w:eastAsia="Microsoft YaHei"/>
+          <w:color w:val="1E2630"/>
+          <w:sz w:val="21"/>
+        </w:rPr>
+        <w:t>pair_diff_ms 定义为 client_a - client_b。若结果为正，说明 B 落后，建议目标是 B；若为负，说明 A 落后，建议目标是 A。第一版不把领先端向后拉，因为后退会让用户再次看到已经看过的画面，通常比落后端向前跳更明显。suggested_forward_ms 使用带符号中位差的绝对值，而不是某个瞬时样本。</w:t>
+      </w:r>
+    </w:p>
+    <w:p>
+      <w:pPr>
+        <w:spacing w:before="80" w:after="160" w:line="264" w:lineRule="auto"/>
+        <w:shd w:fill="F7F8FA"/>
+        <w:ind w:left="180" w:right="180"/>
+      </w:pPr>
+      <w:r>
+        <w:rPr>
+          <w:rFonts w:ascii="Consolas" w:hAnsi="Consolas" w:eastAsia="Consolas"/>
+          <w:color w:val="1E2630"/>
+          <w:sz w:val="17"/>
+        </w:rPr>
+        <w:t>[metric] type=correction_advice mode=read_only</w:t>
+        <w:br/>
+      </w:r>
+      <w:r>
+        <w:rPr>
+          <w:rFonts w:ascii="Consolas" w:hAnsi="Consolas" w:eastAsia="Consolas"/>
+          <w:color w:val="1E2630"/>
+          <w:sz w:val="17"/>
+        </w:rPr>
+        <w:t>client_a=1 client_b=2 epoch=2 state=Paused</w:t>
+        <w:br/>
+      </w:r>
+      <w:r>
+        <w:rPr>
+          <w:rFonts w:ascii="Consolas" w:hAnsi="Consolas" w:eastAsia="Consolas"/>
+          <w:color w:val="1E2630"/>
+          <w:sz w:val="17"/>
+        </w:rPr>
+        <w:t>action=would_seek_forward reason=persistent_skew</w:t>
+        <w:br/>
+      </w:r>
+      <w:r>
+        <w:rPr>
+          <w:rFonts w:ascii="Consolas" w:hAnsi="Consolas" w:eastAsia="Consolas"/>
+          <w:color w:val="1E2630"/>
+          <w:sz w:val="17"/>
+        </w:rPr>
+        <w:t>target_client=2 reference_client=1 suggested_forward_ms=1000</w:t>
+        <w:br/>
+      </w:r>
+      <w:r>
+        <w:rPr>
+          <w:rFonts w:ascii="Consolas" w:hAnsi="Consolas" w:eastAsia="Consolas"/>
+          <w:color w:val="1E2630"/>
+          <w:sz w:val="17"/>
+        </w:rPr>
+        <w:t>median_diff_ms=1000 direction_agreement_pct=100</w:t>
+        <w:br/>
+      </w:r>
+      <w:r>
+        <w:rPr>
+          <w:rFonts w:ascii="Consolas" w:hAnsi="Consolas" w:eastAsia="Consolas"/>
+          <w:color w:val="1E2630"/>
+          <w:sz w:val="17"/>
+        </w:rPr>
+        <w:t>consecutive_severe=6 window_samples=6</w:t>
+      </w:r>
+    </w:p>
+    <w:p>
+      <w:pPr>
+        <w:pStyle w:val="Heading2"/>
+      </w:pPr>
+      <w:r>
+        <w:t>6.5 核心修改</w:t>
+      </w:r>
+    </w:p>
+    <w:tbl>
+      <w:tblPr>
+        <w:tblW w:type="dxa" w:w="9360"/>
+        <w:jc w:val="left"/>
+        <w:tblLayout w:type="fixed"/>
+        <w:tblLook w:firstColumn="1" w:firstRow="1" w:lastColumn="0" w:lastRow="0" w:noHBand="0" w:noVBand="1" w:val="04A0"/>
+        <w:tblInd w:w="120" w:type="dxa"/>
+        <w:tblBorders>
+          <w:top w:val="single" w:sz="4" w:space="0" w:color="C8D2DE"/>
+          <w:left w:val="single" w:sz="4" w:space="0" w:color="C8D2DE"/>
+          <w:bottom w:val="single" w:sz="4" w:space="0" w:color="C8D2DE"/>
+          <w:right w:val="single" w:sz="4" w:space="0" w:color="C8D2DE"/>
+          <w:insideH w:val="single" w:sz="4" w:space="0" w:color="C8D2DE"/>
+          <w:insideV w:val="single" w:sz="4" w:space="0" w:color="C8D2DE"/>
+        </w:tblBorders>
+      </w:tblPr>
+      <w:tblGrid>
+        <w:gridCol w:w="2200"/>
+        <w:gridCol w:w="3580"/>
+        <w:gridCol w:w="3580"/>
+      </w:tblGrid>
+      <w:tr>
+        <w:trPr>
+          <w:tblHeader w:val="true"/>
+        </w:trPr>
+        <w:tc>
+          <w:tcPr>
+            <w:tcW w:type="dxa" w:w="2200"/>
+            <w:vAlign w:val="center"/>
+            <w:tcMar>
+              <w:top w:w="80" w:type="dxa"/>
+              <w:start w:w="120" w:type="dxa"/>
+              <w:bottom w:w="80" w:type="dxa"/>
+              <w:end w:w="120" w:type="dxa"/>
+            </w:tcMar>
+            <w:shd w:fill="E8EEF5"/>
+          </w:tcPr>
+          <w:p>
+            <w:pPr>
+              <w:spacing w:before="0" w:after="0" w:line="276" w:lineRule="auto"/>
+              <w:jc w:val="center"/>
+            </w:pPr>
+            <w:r>
+              <w:rPr>
+                <w:rFonts w:ascii="Microsoft YaHei" w:hAnsi="Microsoft YaHei" w:eastAsia="Microsoft YaHei"/>
+                <w:b/>
+                <w:color w:val="1F4D78"/>
+                <w:sz w:val="18"/>
+              </w:rPr>
+              <w:t>文件/模块</w:t>
+            </w:r>
+          </w:p>
+        </w:tc>
+        <w:tc>
+          <w:tcPr>
+            <w:tcW w:type="dxa" w:w="3580"/>
+            <w:vAlign w:val="center"/>
+            <w:tcMar>
+              <w:top w:w="80" w:type="dxa"/>
+              <w:start w:w="120" w:type="dxa"/>
+              <w:bottom w:w="80" w:type="dxa"/>
+              <w:end w:w="120" w:type="dxa"/>
+            </w:tcMar>
+            <w:shd w:fill="E8EEF5"/>
+          </w:tcPr>
+          <w:p>
+            <w:pPr>
+              <w:spacing w:before="0" w:after="0" w:line="276" w:lineRule="auto"/>
+              <w:jc w:val="center"/>
+            </w:pPr>
+            <w:r>
+              <w:rPr>
+                <w:rFonts w:ascii="Microsoft YaHei" w:hAnsi="Microsoft YaHei" w:eastAsia="Microsoft YaHei"/>
+                <w:b/>
+                <w:color w:val="1F4D78"/>
+                <w:sz w:val="18"/>
+              </w:rPr>
+              <w:t>核心修改</w:t>
+            </w:r>
+          </w:p>
+        </w:tc>
+        <w:tc>
+          <w:tcPr>
+            <w:tcW w:type="dxa" w:w="3580"/>
+            <w:vAlign w:val="center"/>
+            <w:tcMar>
+              <w:top w:w="80" w:type="dxa"/>
+              <w:start w:w="120" w:type="dxa"/>
+              <w:bottom w:w="80" w:type="dxa"/>
+              <w:end w:w="120" w:type="dxa"/>
+            </w:tcMar>
+            <w:shd w:fill="E8EEF5"/>
+          </w:tcPr>
+          <w:p>
+            <w:pPr>
+              <w:spacing w:before="0" w:after="0" w:line="276" w:lineRule="auto"/>
+              <w:jc w:val="center"/>
+            </w:pPr>
+            <w:r>
+              <w:rPr>
+                <w:rFonts w:ascii="Microsoft YaHei" w:hAnsi="Microsoft YaHei" w:eastAsia="Microsoft YaHei"/>
+                <w:b/>
+                <w:color w:val="1F4D78"/>
+                <w:sz w:val="18"/>
+              </w:rPr>
+              <w:t>工程价值</w:t>
+            </w:r>
+          </w:p>
+        </w:tc>
+      </w:tr>
+      <w:tr>
+        <w:tc>
+          <w:tcPr>
+            <w:tcW w:type="dxa" w:w="2200"/>
+          </w:tcPr>
+          <w:p>
+            <w:pPr>
+              <w:spacing w:before="0" w:after="0" w:line="276" w:lineRule="auto"/>
+            </w:pPr>
+            <w:r>
+              <w:rPr>
+                <w:rFonts w:ascii="Consolas" w:hAnsi="Consolas" w:eastAsia="Consolas"/>
+                <w:color w:val="1E2630"/>
+                <w:sz w:val="17"/>
+              </w:rPr>
+              <w:t>SyncCorrectionPolicy.h/.cpp</w:t>
+            </w:r>
+          </w:p>
+        </w:tc>
+        <w:tc>
+          <w:tcPr>
+            <w:tcW w:type="dxa" w:w="3580"/>
+          </w:tcPr>
+          <w:p>
+            <w:pPr>
+              <w:spacing w:before="0" w:after="0" w:line="276" w:lineRule="auto"/>
+            </w:pPr>
+            <w:r>
+              <w:rPr>
+                <w:rFonts w:ascii="Microsoft YaHei" w:hAnsi="Microsoft YaHei" w:eastAsia="Microsoft YaHei"/>
+                <w:color w:val="1E2630"/>
+                <w:sz w:val="18"/>
+              </w:rPr>
+              <w:t>新增纯策略输入、配置、安全门、动作与原因；策略不访问 socket、Room 或播放器。</w:t>
+            </w:r>
+          </w:p>
+        </w:tc>
+        <w:tc>
+          <w:tcPr>
+            <w:tcW w:type="dxa" w:w="3580"/>
+          </w:tcPr>
+          <w:p>
+            <w:pPr>
+              <w:spacing w:before="0" w:after="0" w:line="276" w:lineRule="auto"/>
+            </w:pPr>
+            <w:r>
+              <w:rPr>
+                <w:rFonts w:ascii="Microsoft YaHei" w:hAnsi="Microsoft YaHei" w:eastAsia="Microsoft YaHei"/>
+                <w:color w:val="1E2630"/>
+                <w:sz w:val="18"/>
+              </w:rPr>
+              <w:t>测量与决策解耦，可独立单元测试，也不会误触真实 seek。</w:t>
+            </w:r>
+          </w:p>
+        </w:tc>
+      </w:tr>
+      <w:tr>
+        <w:tc>
+          <w:tcPr>
+            <w:tcW w:type="dxa" w:w="2200"/>
+          </w:tcPr>
+          <w:p>
+            <w:pPr>
+              <w:spacing w:before="0" w:after="0" w:line="276" w:lineRule="auto"/>
+            </w:pPr>
+            <w:r>
+              <w:rPr>
+                <w:rFonts w:ascii="Consolas" w:hAnsi="Consolas" w:eastAsia="Consolas"/>
+                <w:color w:val="1E2630"/>
+                <w:sz w:val="17"/>
+              </w:rPr>
+              <w:t>SyncMetrics.h/.cpp</w:t>
+            </w:r>
+          </w:p>
+        </w:tc>
+        <w:tc>
+          <w:tcPr>
+            <w:tcW w:type="dxa" w:w="3580"/>
+          </w:tcPr>
+          <w:p>
+            <w:pPr>
+              <w:spacing w:before="0" w:after="0" w:line="276" w:lineRule="auto"/>
+            </w:pPr>
+            <w:r>
+              <w:rPr>
+                <w:rFonts w:ascii="Microsoft YaHei" w:hAnsi="Microsoft YaHei" w:eastAsia="Microsoft YaHei"/>
+                <w:color w:val="1E2630"/>
+                <w:sz w:val="18"/>
+              </w:rPr>
+              <w:t>从稳健窗口构造策略输入，计算方向一致率，并输出去重后的 correction_advice。</w:t>
+            </w:r>
+          </w:p>
+        </w:tc>
+        <w:tc>
+          <w:tcPr>
+            <w:tcW w:type="dxa" w:w="3580"/>
+          </w:tcPr>
+          <w:p>
+            <w:pPr>
+              <w:spacing w:before="0" w:after="0" w:line="276" w:lineRule="auto"/>
+            </w:pPr>
+            <w:r>
+              <w:rPr>
+                <w:rFonts w:ascii="Microsoft YaHei" w:hAnsi="Microsoft YaHei" w:eastAsia="Microsoft YaHei"/>
+                <w:color w:val="1E2630"/>
+                <w:sz w:val="18"/>
+              </w:rPr>
+              <w:t>把既有指标转成可解释的控制建议，同时保留完整观测证据。</w:t>
+            </w:r>
+          </w:p>
+        </w:tc>
+      </w:tr>
+      <w:tr>
+        <w:tc>
+          <w:tcPr>
+            <w:tcW w:type="dxa" w:w="2200"/>
+          </w:tcPr>
+          <w:p>
+            <w:pPr>
+              <w:spacing w:before="0" w:after="0" w:line="276" w:lineRule="auto"/>
+            </w:pPr>
+            <w:r>
+              <w:rPr>
+                <w:rFonts w:ascii="Consolas" w:hAnsi="Consolas" w:eastAsia="Consolas"/>
+                <w:color w:val="1E2630"/>
+                <w:sz w:val="17"/>
+              </w:rPr>
+              <w:t>SyncCinemaCoreTests</w:t>
+            </w:r>
+          </w:p>
+        </w:tc>
+        <w:tc>
+          <w:tcPr>
+            <w:tcW w:type="dxa" w:w="3580"/>
+          </w:tcPr>
+          <w:p>
+            <w:pPr>
+              <w:spacing w:before="0" w:after="0" w:line="276" w:lineRule="auto"/>
+            </w:pPr>
+            <w:r>
+              <w:rPr>
+                <w:rFonts w:ascii="Microsoft YaHei" w:hAnsi="Microsoft YaHei" w:eastAsia="Microsoft YaHei"/>
+                <w:color w:val="1E2630"/>
+                <w:sz w:val="18"/>
+              </w:rPr>
+              <w:t>覆盖稳定期、窗口、状态、RTT、阈值、方向、连续性、冷却及目标端选择。</w:t>
+            </w:r>
+          </w:p>
+        </w:tc>
+        <w:tc>
+          <w:tcPr>
+            <w:tcW w:type="dxa" w:w="3580"/>
+          </w:tcPr>
+          <w:p>
+            <w:pPr>
+              <w:spacing w:before="0" w:after="0" w:line="276" w:lineRule="auto"/>
+            </w:pPr>
+            <w:r>
+              <w:rPr>
+                <w:rFonts w:ascii="Microsoft YaHei" w:hAnsi="Microsoft YaHei" w:eastAsia="Microsoft YaHei"/>
+                <w:color w:val="1E2630"/>
+                <w:sz w:val="18"/>
+              </w:rPr>
+              <w:t>为未来闭环执行提供快速、跨平台的策略回归保护。</w:t>
+            </w:r>
+          </w:p>
+        </w:tc>
+      </w:tr>
+      <w:tr>
+        <w:tc>
+          <w:tcPr>
+            <w:tcW w:type="dxa" w:w="2200"/>
+          </w:tcPr>
+          <w:p>
+            <w:pPr>
+              <w:spacing w:before="0" w:after="0" w:line="276" w:lineRule="auto"/>
+            </w:pPr>
+            <w:r>
+              <w:rPr>
+                <w:rFonts w:ascii="Consolas" w:hAnsi="Consolas" w:eastAsia="Consolas"/>
+                <w:color w:val="1E2630"/>
+                <w:sz w:val="17"/>
+              </w:rPr>
+              <w:t>CMakeLists.txt</w:t>
+            </w:r>
+          </w:p>
+        </w:tc>
+        <w:tc>
+          <w:tcPr>
+            <w:tcW w:type="dxa" w:w="3580"/>
+          </w:tcPr>
+          <w:p>
+            <w:pPr>
+              <w:spacing w:before="0" w:after="0" w:line="276" w:lineRule="auto"/>
+            </w:pPr>
+            <w:r>
+              <w:rPr>
+                <w:rFonts w:ascii="Microsoft YaHei" w:hAnsi="Microsoft YaHei" w:eastAsia="Microsoft YaHei"/>
+                <w:color w:val="1E2630"/>
+                <w:sz w:val="18"/>
+              </w:rPr>
+              <w:t>让 Windows client、Linux server 和核心测试共同编译策略模块。</w:t>
+            </w:r>
+          </w:p>
+        </w:tc>
+        <w:tc>
+          <w:tcPr>
+            <w:tcW w:type="dxa" w:w="3580"/>
+          </w:tcPr>
+          <w:p>
+            <w:pPr>
+              <w:spacing w:before="0" w:after="0" w:line="276" w:lineRule="auto"/>
+            </w:pPr>
+            <w:r>
+              <w:rPr>
+                <w:rFonts w:ascii="Microsoft YaHei" w:hAnsi="Microsoft YaHei" w:eastAsia="Microsoft YaHei"/>
+                <w:color w:val="1E2630"/>
+                <w:sz w:val="18"/>
+              </w:rPr>
+              <w:t>保证同一份决策规则在所有目标中保持一致。</w:t>
+            </w:r>
+          </w:p>
+        </w:tc>
+      </w:tr>
+      <w:tr>
+        <w:tc>
+          <w:tcPr>
+            <w:tcW w:type="dxa" w:w="2200"/>
+          </w:tcPr>
+          <w:p>
+            <w:pPr>
+              <w:spacing w:before="0" w:after="0" w:line="276" w:lineRule="auto"/>
+            </w:pPr>
+            <w:r>
+              <w:rPr>
+                <w:rFonts w:ascii="Consolas" w:hAnsi="Consolas" w:eastAsia="Consolas"/>
+                <w:color w:val="1E2630"/>
+                <w:sz w:val="17"/>
+              </w:rPr>
+              <w:t>Engineering Journal</w:t>
+            </w:r>
+          </w:p>
+        </w:tc>
+        <w:tc>
+          <w:tcPr>
+            <w:tcW w:type="dxa" w:w="3580"/>
+          </w:tcPr>
+          <w:p>
+            <w:pPr>
+              <w:spacing w:before="0" w:after="0" w:line="276" w:lineRule="auto"/>
+            </w:pPr>
+            <w:r>
+              <w:rPr>
+                <w:rFonts w:ascii="Microsoft YaHei" w:hAnsi="Microsoft YaHei" w:eastAsia="Microsoft YaHei"/>
+                <w:color w:val="1E2630"/>
+                <w:sz w:val="18"/>
+              </w:rPr>
+              <w:t>记录策略边界、安全门、本地证据、已知限制和面试表达。</w:t>
+            </w:r>
+          </w:p>
+        </w:tc>
+        <w:tc>
+          <w:tcPr>
+            <w:tcW w:type="dxa" w:w="3580"/>
+          </w:tcPr>
+          <w:p>
+            <w:pPr>
+              <w:spacing w:before="0" w:after="0" w:line="276" w:lineRule="auto"/>
+            </w:pPr>
+            <w:r>
+              <w:rPr>
+                <w:rFonts w:ascii="Microsoft YaHei" w:hAnsi="Microsoft YaHei" w:eastAsia="Microsoft YaHei"/>
+                <w:color w:val="1E2630"/>
+                <w:sz w:val="18"/>
+              </w:rPr>
+              <w:t>让后续学习、评审与算法迭代具有连续上下文。</w:t>
+            </w:r>
+          </w:p>
+        </w:tc>
+      </w:tr>
+    </w:tbl>
+    <w:p>
+      <w:pPr>
+        <w:pStyle w:val="Heading2"/>
+      </w:pPr>
+      <w:r>
+        <w:t>6.6 验证证据</w:t>
+      </w:r>
+    </w:p>
+    <w:p>
+      <w:pPr>
+        <w:pStyle w:val="ListNumber"/>
+      </w:pPr>
+      <w:r>
+        <w:rPr>
+          <w:rFonts w:ascii="Microsoft YaHei" w:hAnsi="Microsoft YaHei" w:eastAsia="Microsoft YaHei"/>
+          <w:color w:val="1E2630"/>
+          <w:sz w:val="21"/>
+        </w:rPr>
+        <w:t>Windows x64 Debug、x64 Debug with libVLC 均完整构建，两个配置的 CTest 均为 1/1 通过。</w:t>
+      </w:r>
+    </w:p>
+    <w:p>
+      <w:pPr>
+        <w:pStyle w:val="ListNumber"/>
+      </w:pPr>
+      <w:r>
+        <w:rPr>
+          <w:rFonts w:ascii="Microsoft YaHei" w:hAnsi="Microsoft YaHei" w:eastAsia="Microsoft YaHei"/>
+          <w:color w:val="1E2630"/>
+          <w:sz w:val="21"/>
+        </w:rPr>
+        <w:t>WSL Ubuntu 22.04 的 SyncCinemaServer 与 SyncCinemaCoreTests 构建通过，CTest 1/1 通过。</w:t>
+      </w:r>
+    </w:p>
+    <w:p>
+      <w:pPr>
+        <w:pStyle w:val="ListNumber"/>
+      </w:pPr>
+      <w:r>
+        <w:rPr>
+          <w:rFonts w:ascii="Microsoft YaHei" w:hAnsi="Microsoft YaHei" w:eastAsia="Microsoft YaHei"/>
+          <w:color w:val="1E2630"/>
+          <w:sz w:val="21"/>
+        </w:rPr>
+        <w:t>策略单元测试覆盖所有安全门，以及正负偏差下目标 client、参考 client 和建议前进量。</w:t>
+      </w:r>
+    </w:p>
+    <w:p>
+      <w:pPr>
+        <w:pStyle w:val="ListNumber"/>
+      </w:pPr>
+      <w:r>
+        <w:rPr>
+          <w:rFonts w:ascii="Microsoft YaHei" w:hAnsi="Microsoft YaHei" w:eastAsia="Microsoft YaHei"/>
+          <w:color w:val="1E2630"/>
+          <w:sz w:val="21"/>
+        </w:rPr>
+        <w:t>双脚本 client 集成验证得到 window_not_ready -&gt; persistent_skew -&gt; cooldown 的确定序列。</w:t>
+      </w:r>
+    </w:p>
+    <w:p>
+      <w:pPr>
+        <w:pStyle w:val="ListNumber"/>
+      </w:pPr>
+      <w:r>
+        <w:rPr>
+          <w:rFonts w:ascii="Microsoft YaHei" w:hAnsi="Microsoft YaHei" w:eastAsia="Microsoft YaHei"/>
+          <w:color w:val="1E2630"/>
+          <w:sz w:val="21"/>
+        </w:rPr>
+        <w:t>1 秒稳定偏差场景中，策略在第 6 个有效样本建议 client 2 向前 1000 ms；下一样本进入约 4.9 秒冷却。</w:t>
+      </w:r>
+    </w:p>
+    <w:p>
+      <w:pPr>
+        <w:spacing w:before="120" w:after="160" w:line="300" w:lineRule="auto"/>
+        <w:shd w:fill="F4F6F9"/>
+        <w:ind w:left="160" w:right="160"/>
+      </w:pPr>
+      <w:r>
+        <w:rPr>
+          <w:rFonts w:ascii="Microsoft YaHei" w:hAnsi="Microsoft YaHei" w:eastAsia="Microsoft YaHei"/>
+          <w:b/>
+          <w:color w:val="1F4D78"/>
+          <w:sz w:val="21"/>
+        </w:rPr>
+        <w:t>关键保证：</w:t>
+      </w:r>
+      <w:r>
+        <w:rPr>
+          <w:rFonts w:ascii="Microsoft YaHei" w:hAnsi="Microsoft YaHei" w:eastAsia="Microsoft YaHei"/>
+          <w:color w:val="1E2630"/>
+          <w:sz w:val="21"/>
+        </w:rPr>
+        <w:t>本地集成测试只验证建议日志，代码路径没有 PlayerController 依赖，也没有执行 seek。因此这一阶段即使阈值仍需公网调参，也不会改变任何用户播放行为。</w:t>
+      </w:r>
+    </w:p>
+    <w:p>
+      <w:pPr>
+        <w:pStyle w:val="Heading2"/>
+      </w:pPr>
+      <w:r>
+        <w:t>6.7 已知局限与上线前门槛</w:t>
+      </w:r>
+    </w:p>
+    <w:p>
+      <w:pPr>
+        <w:pStyle w:val="ListBullet"/>
+      </w:pPr>
+      <w:r>
+        <w:rPr>
+          <w:rFonts w:ascii="Microsoft YaHei" w:hAnsi="Microsoft YaHei" w:eastAsia="Microsoft YaHei"/>
+          <w:color w:val="1E2630"/>
+          <w:sz w:val="21"/>
+        </w:rPr>
+        <w:t>当前 5 秒冷却是只读模拟：would_seek 被当作“假设已执行”，用于验证建议节奏。</w:t>
+      </w:r>
+    </w:p>
+    <w:p>
+      <w:pPr>
+        <w:pStyle w:val="ListBullet"/>
+      </w:pPr>
+      <w:r>
+        <w:rPr>
+          <w:rFonts w:ascii="Microsoft YaHei" w:hAnsi="Microsoft YaHei" w:eastAsia="Microsoft YaHei"/>
+          <w:color w:val="1E2630"/>
+          <w:sz w:val="21"/>
+        </w:rPr>
+        <w:t>多于两个 client 时会产生多组 pair 建议；未来执行器需要基于房间共识选目标，不能逐对盲目 seek。</w:t>
+      </w:r>
+    </w:p>
+    <w:p>
+      <w:pPr>
+        <w:pStyle w:val="ListBullet"/>
+      </w:pPr>
+      <w:r>
+        <w:rPr>
+          <w:rFonts w:ascii="Microsoft YaHei" w:hAnsi="Microsoft YaHei" w:eastAsia="Microsoft YaHei"/>
+          <w:color w:val="1E2630"/>
+          <w:sz w:val="21"/>
+        </w:rPr>
+        <w:t>250/750 ms、75% 和 3 个连续样本是保守初值，需要两台真实异地设备的数据校准。</w:t>
+      </w:r>
+    </w:p>
+    <w:p>
+      <w:pPr>
+        <w:pStyle w:val="ListBullet"/>
+      </w:pPr>
+      <w:r>
+        <w:rPr>
+          <w:rFonts w:ascii="Microsoft YaHei" w:hAnsi="Microsoft YaHei" w:eastAsia="Microsoft YaHei"/>
+          <w:color w:val="1E2630"/>
+          <w:sz w:val="21"/>
+        </w:rPr>
+        <w:t>P95 目前只作诊断；是否参与硬校正必须根据误触发率和用户体验决定。</w:t>
+      </w:r>
+    </w:p>
+    <w:p>
+      <w:pPr>
+        <w:pStyle w:val="ListBullet"/>
+      </w:pPr>
+      <w:r>
+        <w:rPr>
+          <w:rFonts w:ascii="Microsoft YaHei" w:hAnsi="Microsoft YaHei" w:eastAsia="Microsoft YaHei"/>
+          <w:color w:val="1E2630"/>
+          <w:sz w:val="21"/>
+        </w:rPr>
+        <w:t>普通控制广播仍未携带命令 id/epoch，真正闭环前需要再次校验连接身份、epoch 和目标状态。</w:t>
+      </w:r>
+    </w:p>
+    <w:p>
+      <w:pPr>
+        <w:pStyle w:val="ListBullet"/>
+      </w:pPr>
+      <w:r>
+        <w:rPr>
+          <w:rFonts w:ascii="Microsoft YaHei" w:hAnsi="Microsoft YaHei" w:eastAsia="Microsoft YaHei"/>
+          <w:color w:val="1E2630"/>
+          <w:sz w:val="21"/>
+        </w:rPr>
+        <w:t>下一步应先部署只读版本采集公网建议日志，再实现 server 到目标 client 的专用校正命令与执行回执。</w:t>
+      </w:r>
+    </w:p>
+    <w:p>
+      <w:pPr>
+        <w:pStyle w:val="Heading1"/>
+      </w:pPr>
+      <w:r>
+        <w:t>7. 面试表达模板</w:t>
       </w:r>
     </w:p>
     <w:p>
@@ -3999,10 +4993,75 @@
     </w:p>
     <w:p>
       <w:pPr>
+        <w:spacing w:before="0" w:after="120" w:line="300" w:lineRule="auto"/>
+      </w:pPr>
+      <w:r>
+        <w:rPr>
+          <w:rFonts w:ascii="Microsoft YaHei" w:hAnsi="Microsoft YaHei" w:eastAsia="Microsoft YaHei"/>
+          <w:color w:val="1E2630"/>
+          <w:sz w:val="21"/>
+        </w:rPr>
+        <w:t>第四段可以这样说明控制安全性：有了相对偏差后我没有直接 seek，而是把测量、决策和执行拆成三层。纯策略层按稳定期、窗口、状态、RTT、阈值、方向一致率、连续异常和冷却逐层放行，只输出 would_seek_forward 及可解释 reason。它只让落后端向前追赶，并通过跨平台单元测试和双客户端集成测试验证 window_not_ready、persistent_skew、cooldown 的状态序列。当前仍是 read_only，先用公网数据验证误触发率，再接入真正的命令执行和回执。</w:t>
+      </w:r>
+    </w:p>
+    <w:p>
+      <w:pPr>
         <w:pStyle w:val="Heading1"/>
       </w:pPr>
       <w:r>
-        <w:t>7. 后续学习重点</w:t>
+        <w:t>8. 后续学习重点</w:t>
+      </w:r>
+    </w:p>
+    <w:p>
+      <w:pPr>
+        <w:pStyle w:val="ListNumber"/>
+      </w:pPr>
+      <w:r>
+        <w:rPr>
+          <w:rFonts w:ascii="Microsoft YaHei" w:hAnsi="Microsoft YaHei" w:eastAsia="Microsoft YaHei"/>
+          <w:color w:val="1E2630"/>
+          <w:sz w:val="21"/>
+        </w:rPr>
+        <w:t>evaluateSyncCorrection：如何用提前返回把安全门写成可读、可测试的纯决策函数。</w:t>
+      </w:r>
+    </w:p>
+    <w:p>
+      <w:pPr>
+        <w:pStyle w:val="ListNumber"/>
+      </w:pPr>
+      <w:r>
+        <w:rPr>
+          <w:rFonts w:ascii="Microsoft YaHei" w:hAnsi="Microsoft YaHei" w:eastAsia="Microsoft YaHei"/>
+          <w:color w:val="1E2630"/>
+          <w:sz w:val="21"/>
+        </w:rPr>
+        <w:t>calculateDirectionAgreementPercent：为什么偏差大小之外还必须验证方向稳定。</w:t>
+      </w:r>
+    </w:p>
+    <w:p>
+      <w:pPr>
+        <w:pStyle w:val="ListNumber"/>
+      </w:pPr>
+      <w:r>
+        <w:rPr>
+          <w:rFonts w:ascii="Microsoft YaHei" w:hAnsi="Microsoft YaHei" w:eastAsia="Microsoft YaHei"/>
+          <w:color w:val="1E2630"/>
+          <w:sz w:val="21"/>
+        </w:rPr>
+        <w:t>PairWindowStats 的建议去重与模拟冷却：状态为什么属于 pair+epoch，而不是某个 client。</w:t>
+      </w:r>
+    </w:p>
+    <w:p>
+      <w:pPr>
+        <w:pStyle w:val="ListNumber"/>
+      </w:pPr>
+      <w:r>
+        <w:rPr>
+          <w:rFonts w:ascii="Microsoft YaHei" w:hAnsi="Microsoft YaHei" w:eastAsia="Microsoft YaHei"/>
+          <w:color w:val="1E2630"/>
+          <w:sz w:val="21"/>
+        </w:rPr>
+        <w:t>策略单元测试：如何用输入夹具覆盖安全门和正负方向，而不启动网络与播放器。</w:t>
       </w:r>
     </w:p>
     <w:p>
@@ -4166,7 +5225,7 @@
         <w:pStyle w:val="Heading1"/>
       </w:pPr>
       <w:r>
-        <w:t>8. 后续工程路线</w:t>
+        <w:t>9. 后续工程路线</w:t>
       </w:r>
     </w:p>
     <w:p>
@@ -4179,7 +5238,7 @@
           <w:color w:val="1E2630"/>
           <w:sz w:val="21"/>
         </w:rPr>
-        <w:t>在合理提交间隔后提交晚加入快照候选，并部署到云端，用两台真实设备验证播放中加入、暂停中加入和 SEEK 后加入。</w:t>
+        <w:t>在合理提交间隔后提交只读校正决策候选，并部署到云端，用两台真实设备统计建议频率、方向正确率和误触发场景。</w:t>
       </w:r>
     </w:p>
     <w:p>
@@ -4192,7 +5251,20 @@
           <w:color w:val="1E2630"/>
           <w:sz w:val="21"/>
         </w:rPr>
-        <w:t>设计只读校正决策引擎：根据 window_ready、中位数、P95、连续异常、状态和 epoch 输出 would_correct，但不实际控制。</w:t>
+        <w:t>设计专用校正协议：携带目标 client、room epoch、目标毫秒位置和命令 id，并要求应用结果回执。</w:t>
+      </w:r>
+    </w:p>
+    <w:p>
+      <w:pPr>
+        <w:pStyle w:val="ListNumber"/>
+      </w:pPr>
+      <w:r>
+        <w:rPr>
+          <w:rFonts w:ascii="Microsoft YaHei" w:hAnsi="Microsoft YaHei" w:eastAsia="Microsoft YaHei"/>
+          <w:color w:val="1E2630"/>
+          <w:sz w:val="21"/>
+        </w:rPr>
+        <w:t>加入最小闭环硬 seek：server 只向落后端发送，client 再次校验 epoch，执行后上报实际位置；失败时不连续重试。</w:t>
       </w:r>
     </w:p>
     <w:p>
@@ -4218,7 +5290,7 @@
           <w:color w:val="1E2630"/>
           <w:sz w:val="21"/>
         </w:rPr>
-        <w:t>验证建议策略后，再加入带阈值、冷却和迟滞的硬 seek；小偏差优先观察，暂不贸然引入倍速控制。</w:t>
+        <w:t>云端闭环稳定后，再研究 250-750 ms 小偏差的温和校正；暂不贸然引入倍速控制。</w:t>
       </w:r>
     </w:p>
     <w:p>
@@ -4281,7 +5353,7 @@
           <w:color w:val="1E2630"/>
           <w:sz w:val="21"/>
         </w:rPr>
-        <w:t>当前快照候选已经完成本地实现与验证，按提交节奏要求停在未提交状态。下一阶段先让稳健窗口输出“只建议、不执行”的校正决策，并把原因、阈值、方向和冷却状态写入日志；不要直接根据 client-to-Room 或单条 pair_diff 触发 seek。</w:t>
+        <w:t>92300ce 晚加入快照已经发布。当前只读校正策略已完成本地实现、跨平台测试和双客户端集成验证，按提交节奏要求停在未提交状态。下一步先部署该 read_only 版本收集真实异地建议日志；确认方向、阈值和冷却可靠后，才设计带 epoch、命令 id 与执行回执的最小闭环。</w:t>
       </w:r>
     </w:p>
     <w:sectPr>

</xml_diff>

<commit_message>
feature: add Qt desktop client and shared session layer
</commit_message>
<xml_diff>
--- a/docs/SyncCinema_Engineering_Journal.docx
+++ b/docs/SyncCinema_Engineering_Journal.docx
@@ -165,7 +165,7 @@
                 <w:color w:val="1E2630"/>
                 <w:sz w:val="19"/>
               </w:rPr>
-              <w:t>feature/sync-metrics</w:t>
+              <w:t>feature/qt-client-ui</w:t>
             </w:r>
           </w:p>
         </w:tc>
@@ -206,7 +206,7 @@
                 <w:color w:val="1E2630"/>
                 <w:sz w:val="19"/>
               </w:rPr>
-              <w:t>92300ce - synchronize late-joining clients with room snapshots</w:t>
+              <w:t>2f4f27a - add read-only sync correction advice</w:t>
             </w:r>
           </w:p>
         </w:tc>
@@ -247,7 +247,7 @@
                 <w:color w:val="1E2630"/>
                 <w:sz w:val="19"/>
               </w:rPr>
-              <w:t>只读校正决策、安全门与可解释建议日志</w:t>
+              <w:t>Qt 桌面客户端、共享会话层与播放器画面嵌入</w:t>
             </w:r>
           </w:p>
         </w:tc>
@@ -1254,6 +1254,65 @@
           </w:p>
         </w:tc>
       </w:tr>
+      <w:tr>
+        <w:tc>
+          <w:tcPr>
+            <w:tcW w:type="dxa" w:w="1450"/>
+          </w:tcPr>
+          <w:p>
+            <w:pPr>
+              <w:spacing w:before="0" w:after="0" w:line="276" w:lineRule="auto"/>
+              <w:jc w:val="center"/>
+            </w:pPr>
+            <w:r>
+              <w:rPr>
+                <w:rFonts w:ascii="Consolas" w:hAnsi="Consolas" w:eastAsia="Consolas"/>
+                <w:color w:val="1E2630"/>
+                <w:sz w:val="17"/>
+              </w:rPr>
+              <w:t>2f4f27a</w:t>
+            </w:r>
+          </w:p>
+        </w:tc>
+        <w:tc>
+          <w:tcPr>
+            <w:tcW w:type="dxa" w:w="3300"/>
+          </w:tcPr>
+          <w:p>
+            <w:pPr>
+              <w:spacing w:before="0" w:after="0" w:line="276" w:lineRule="auto"/>
+              <w:jc w:val="left"/>
+            </w:pPr>
+            <w:r>
+              <w:rPr>
+                <w:rFonts w:ascii="Microsoft YaHei" w:hAnsi="Microsoft YaHei" w:eastAsia="Microsoft YaHei"/>
+                <w:color w:val="1E2630"/>
+                <w:sz w:val="18"/>
+              </w:rPr>
+              <w:t>read-only sync correction advice</w:t>
+            </w:r>
+          </w:p>
+        </w:tc>
+        <w:tc>
+          <w:tcPr>
+            <w:tcW w:type="dxa" w:w="4610"/>
+          </w:tcPr>
+          <w:p>
+            <w:pPr>
+              <w:spacing w:before="0" w:after="0" w:line="276" w:lineRule="auto"/>
+              <w:jc w:val="left"/>
+            </w:pPr>
+            <w:r>
+              <w:rPr>
+                <w:rFonts w:ascii="Microsoft YaHei" w:hAnsi="Microsoft YaHei" w:eastAsia="Microsoft YaHei"/>
+                <w:color w:val="1E2630"/>
+                <w:sz w:val="18"/>
+              </w:rPr>
+              <w:t>以安全门和可解释原因生成校正建议，但不改变播放行为</w:t>
+            </w:r>
+          </w:p>
+        </w:tc>
+      </w:tr>
     </w:tbl>
     <w:p>
       <w:pPr>
@@ -4014,7 +4073,7 @@
         <w:pStyle w:val="Heading1"/>
       </w:pPr>
       <w:r>
-        <w:t>6. 本地阶段：只读校正决策引擎</w:t>
+        <w:t>6. 已发布阶段：只读校正决策引擎</w:t>
       </w:r>
     </w:p>
     <w:p>
@@ -4949,7 +5008,937 @@
         <w:pStyle w:val="Heading1"/>
       </w:pPr>
       <w:r>
-        <w:t>7. 面试表达模板</w:t>
+        <w:t>7. 本地阶段：Qt 桌面客户端 MVP</w:t>
+      </w:r>
+    </w:p>
+    <w:p>
+      <w:pPr>
+        <w:pStyle w:val="Heading2"/>
+      </w:pPr>
+      <w:r>
+        <w:t>7.1 为什么先做 UI</w:t>
+      </w:r>
+    </w:p>
+    <w:p>
+      <w:pPr>
+        <w:spacing w:before="0" w:after="120" w:line="300" w:lineRule="auto"/>
+      </w:pPr>
+      <w:r>
+        <w:rPr>
+          <w:rFonts w:ascii="Microsoft YaHei" w:hAnsi="Microsoft YaHei" w:eastAsia="Microsoft YaHei"/>
+          <w:color w:val="1E2630"/>
+          <w:sz w:val="21"/>
+        </w:rPr>
+        <w:t>同步算法已经具备 RTT、同刻投影、稳健窗口和只读校正建议，但真实异地测试仍依赖对方熟悉命令行。本阶段先把现有核心能力包装成普通用户可以直接操作的桌面播放器，让第二台电脑能够作为真实测试端参与，同时坚持不在 UI 文件里复制 TCP 和协议逻辑。</w:t>
+      </w:r>
+    </w:p>
+    <w:p>
+      <w:pPr>
+        <w:spacing w:before="120" w:after="160" w:line="300" w:lineRule="auto"/>
+        <w:shd w:fill="F4F6F9"/>
+        <w:ind w:left="160" w:right="160"/>
+      </w:pPr>
+      <w:r>
+        <w:rPr>
+          <w:rFonts w:ascii="Microsoft YaHei" w:hAnsi="Microsoft YaHei" w:eastAsia="Microsoft YaHei"/>
+          <w:b/>
+          <w:color w:val="1F4D78"/>
+          <w:sz w:val="21"/>
+        </w:rPr>
+        <w:t>产品目标：</w:t>
+      </w:r>
+      <w:r>
+        <w:rPr>
+          <w:rFonts w:ascii="Microsoft YaHei" w:hAnsi="Microsoft YaHei" w:eastAsia="Microsoft YaHei"/>
+          <w:color w:val="1E2630"/>
+          <w:sz w:val="21"/>
+        </w:rPr>
+        <w:t>用户只需填写同一媒体 URL 与 server 地址，点击连接后即可播放、暂停、拖动进度、调节音量和全屏；server 仍只协调状态，不传输播放器控制之外的 TCP 视频数据。</w:t>
+      </w:r>
+    </w:p>
+    <w:p>
+      <w:pPr>
+        <w:pStyle w:val="Heading2"/>
+      </w:pPr>
+      <w:r>
+        <w:t>7.2 先抽会话层，再接界面</w:t>
+      </w:r>
+    </w:p>
+    <w:p>
+      <w:pPr>
+        <w:spacing w:before="80" w:after="160" w:line="264" w:lineRule="auto"/>
+        <w:shd w:fill="F7F8FA"/>
+        <w:ind w:left="180" w:right="180"/>
+      </w:pPr>
+      <w:r>
+        <w:rPr>
+          <w:rFonts w:ascii="Consolas" w:hAnsi="Consolas" w:eastAsia="Consolas"/>
+          <w:color w:val="1E2630"/>
+          <w:sz w:val="17"/>
+        </w:rPr>
+        <w:t>QtClientWindow (widgets / visual state)</w:t>
+        <w:br/>
+      </w:r>
+      <w:r>
+        <w:rPr>
+          <w:rFonts w:ascii="Consolas" w:hAnsi="Consolas" w:eastAsia="Consolas"/>
+          <w:color w:val="1E2630"/>
+          <w:sz w:val="17"/>
+        </w:rPr>
+        <w:t xml:space="preserve">  -&gt; QtClientController (Qt &lt;-&gt; C++ adapter)</w:t>
+        <w:br/>
+      </w:r>
+      <w:r>
+        <w:rPr>
+          <w:rFonts w:ascii="Consolas" w:hAnsi="Consolas" w:eastAsia="Consolas"/>
+          <w:color w:val="1E2630"/>
+          <w:sz w:val="17"/>
+        </w:rPr>
+        <w:t xml:space="preserve">  -&gt; SyncClientSession (TCP / protocol / worker threads)</w:t>
+        <w:br/>
+      </w:r>
+      <w:r>
+        <w:rPr>
+          <w:rFonts w:ascii="Consolas" w:hAnsi="Consolas" w:eastAsia="Consolas"/>
+          <w:color w:val="1E2630"/>
+          <w:sz w:val="17"/>
+        </w:rPr>
+        <w:t xml:space="preserve">  -&gt; PlayerController</w:t>
+        <w:br/>
+      </w:r>
+      <w:r>
+        <w:rPr>
+          <w:rFonts w:ascii="Consolas" w:hAnsi="Consolas" w:eastAsia="Consolas"/>
+          <w:color w:val="1E2630"/>
+          <w:sz w:val="17"/>
+        </w:rPr>
+        <w:t xml:space="preserve">       -&gt; LibVlcPlayer</w:t>
+        <w:br/>
+      </w:r>
+      <w:r>
+        <w:rPr>
+          <w:rFonts w:ascii="Consolas" w:hAnsi="Consolas" w:eastAsia="Consolas"/>
+          <w:color w:val="1E2630"/>
+          <w:sz w:val="17"/>
+        </w:rPr>
+        <w:br/>
+      </w:r>
+      <w:r>
+        <w:rPr>
+          <w:rFonts w:ascii="Consolas" w:hAnsi="Consolas" w:eastAsia="Consolas"/>
+          <w:color w:val="1E2630"/>
+          <w:sz w:val="17"/>
+        </w:rPr>
+        <w:t>CLI Client.cpp</w:t>
+        <w:br/>
+      </w:r>
+      <w:r>
+        <w:rPr>
+          <w:rFonts w:ascii="Consolas" w:hAnsi="Consolas" w:eastAsia="Consolas"/>
+          <w:color w:val="1E2630"/>
+          <w:sz w:val="17"/>
+        </w:rPr>
+        <w:t xml:space="preserve">  -&gt; same SyncClientSession</w:t>
+      </w:r>
+    </w:p>
+    <w:p>
+      <w:pPr>
+        <w:spacing w:before="0" w:after="120" w:line="300" w:lineRule="auto"/>
+      </w:pPr>
+      <w:r>
+        <w:rPr>
+          <w:rFonts w:ascii="Microsoft YaHei" w:hAnsi="Microsoft YaHei" w:eastAsia="Microsoft YaHei"/>
+          <w:color w:val="1E2630"/>
+          <w:sz w:val="21"/>
+        </w:rPr>
+        <w:t>旧 Client.cpp 同时承担命令解析、Winsock 生命周期、消息边界、快照握手、广播线程、心跳回复、进度上报和播放器互斥。若 Qt 再复制一遍，任何协议修复都必须改两处。因此新增 SyncClientSession，把一个 client 连接的完整生命周期封装为纯 C++ 对象；CLI 只负责读取 std::cin，Qt 只负责控件和信号，两者通过 callbacks 消费相同事件。</w:t>
+      </w:r>
+    </w:p>
+    <w:p>
+      <w:pPr>
+        <w:pStyle w:val="Heading2"/>
+      </w:pPr>
+      <w:r>
+        <w:t>7.3 UI 线程为什么不能做冷启动和网络握手</w:t>
+      </w:r>
+    </w:p>
+    <w:p>
+      <w:pPr>
+        <w:spacing w:before="0" w:after="120" w:line="300" w:lineRule="auto"/>
+      </w:pPr>
+      <w:r>
+        <w:rPr>
+          <w:rFonts w:ascii="Microsoft YaHei" w:hAnsi="Microsoft YaHei" w:eastAsia="Microsoft YaHei"/>
+          <w:color w:val="1E2630"/>
+          <w:sz w:val="21"/>
+        </w:rPr>
+        <w:t>libVLC 第一次初始化曾实测需要十几秒，TCP connect 和初始 SNAPSHOT 也可能等待超时。若这些操作直接发生在 Qt 主线程，窗口会无法拖动、重绘或响应关闭。QtClientController 因此使用 startupThread 创建播放器、打开媒体和建立会话；网络回调通过 QMetaObject::invokeMethod 的 QueuedConnection 回到 UI 线程，再更新控件。后台线程从不直接操作 QWidget。</w:t>
+      </w:r>
+    </w:p>
+    <w:p>
+      <w:pPr>
+        <w:pStyle w:val="ListBullet"/>
+      </w:pPr>
+      <w:r>
+        <w:rPr>
+          <w:rFonts w:ascii="Microsoft YaHei" w:hAnsi="Microsoft YaHei" w:eastAsia="Microsoft YaHei"/>
+          <w:color w:val="1E2630"/>
+          <w:sz w:val="21"/>
+        </w:rPr>
+        <w:t>resourcesMutex 保护 controller 持有的 player/session 指针和断开时的所有权转移。</w:t>
+      </w:r>
+    </w:p>
+    <w:p>
+      <w:pPr>
+        <w:pStyle w:val="ListBullet"/>
+      </w:pPr>
+      <w:r>
+        <w:rPr>
+          <w:rFonts w:ascii="Microsoft YaHei" w:hAnsi="Microsoft YaHei" w:eastAsia="Microsoft YaHei"/>
+          <w:color w:val="1E2630"/>
+          <w:sz w:val="21"/>
+        </w:rPr>
+        <w:t>SyncClientSession 内部 playerMutex 保护同一个播放器，sendMutex 保证多线程发送不会交叉 TCP 字节。</w:t>
+      </w:r>
+    </w:p>
+    <w:p>
+      <w:pPr>
+        <w:pStyle w:val="ListBullet"/>
+      </w:pPr>
+      <w:r>
+        <w:rPr>
+          <w:rFonts w:ascii="Microsoft YaHei" w:hAnsi="Microsoft YaHei" w:eastAsia="Microsoft YaHei"/>
+          <w:color w:val="1E2630"/>
+          <w:sz w:val="21"/>
+        </w:rPr>
+        <w:t>关闭窗口时先取消启动、停止会话并 join 线程，再销毁被 session 引用的 player。</w:t>
+      </w:r>
+    </w:p>
+    <w:p>
+      <w:pPr>
+        <w:pStyle w:val="Heading2"/>
+      </w:pPr>
+      <w:r>
+        <w:t>7.4 播放器嵌入与常用控件</w:t>
+      </w:r>
+    </w:p>
+    <w:p>
+      <w:pPr>
+        <w:spacing w:before="0" w:after="120" w:line="300" w:lineRule="auto"/>
+      </w:pPr>
+      <w:r>
+        <w:rPr>
+          <w:rFonts w:ascii="Microsoft YaHei" w:hAnsi="Microsoft YaHei" w:eastAsia="Microsoft YaHei"/>
+          <w:color w:val="1E2630"/>
+          <w:sz w:val="21"/>
+        </w:rPr>
+        <w:t>Qt 的视频区域设置为原生窗口，winId() 转成 Windows HWND 后交给 libvlc_media_player_set_hwnd。画面由 libVLC 渲染，Qt 负责其外部布局。PlayerController 新增 setVideoOutputWindow、getDurationMilliseconds、setVolume 和 getVolume，因此 Qt 层仍然不接触 libVLC 头文件之外的实现细节。</w:t>
+      </w:r>
+    </w:p>
+    <w:p>
+      <w:pPr>
+        <w:pStyle w:val="ListBullet"/>
+      </w:pPr>
+      <w:r>
+        <w:rPr>
+          <w:rFonts w:ascii="Microsoft YaHei" w:hAnsi="Microsoft YaHei" w:eastAsia="Microsoft YaHei"/>
+          <w:color w:val="1E2630"/>
+          <w:sz w:val="21"/>
+        </w:rPr>
+        <w:t>顶部保留媒体文件/URL、文件选择、server 地址、连接按钮和状态指示。</w:t>
+      </w:r>
+    </w:p>
+    <w:p>
+      <w:pPr>
+        <w:pStyle w:val="ListBullet"/>
+      </w:pPr>
+      <w:r>
+        <w:rPr>
+          <w:rFonts w:ascii="Microsoft YaHei" w:hAnsi="Microsoft YaHei" w:eastAsia="Microsoft YaHei"/>
+          <w:color w:val="1E2630"/>
+          <w:sz w:val="21"/>
+        </w:rPr>
+        <w:t>视频区域全宽占据主体，不使用营销式卡片或无关装饰。</w:t>
+      </w:r>
+    </w:p>
+    <w:p>
+      <w:pPr>
+        <w:pStyle w:val="ListBullet"/>
+      </w:pPr>
+      <w:r>
+        <w:rPr>
+          <w:rFonts w:ascii="Microsoft YaHei" w:hAnsi="Microsoft YaHei" w:eastAsia="Microsoft YaHei"/>
+          <w:color w:val="1E2630"/>
+          <w:sz w:val="21"/>
+        </w:rPr>
+        <w:t>底部采用播放器熟悉的播放/暂停、时间轴、时间、音量和全屏图标；双击画面也可全屏，Esc 退出。</w:t>
+      </w:r>
+    </w:p>
+    <w:p>
+      <w:pPr>
+        <w:pStyle w:val="ListBullet"/>
+      </w:pPr>
+      <w:r>
+        <w:rPr>
+          <w:rFonts w:ascii="Microsoft YaHei" w:hAnsi="Microsoft YaHei" w:eastAsia="Microsoft YaHei"/>
+          <w:color w:val="1E2630"/>
+          <w:sz w:val="21"/>
+        </w:rPr>
+        <w:t>QSettings 保存媒体地址、server 地址和音量，降低重复测试成本。</w:t>
+      </w:r>
+    </w:p>
+    <w:p>
+      <w:pPr>
+        <w:pStyle w:val="Heading2"/>
+      </w:pPr>
+      <w:r>
+        <w:t>7.5 构建与发布边界</w:t>
+      </w:r>
+    </w:p>
+    <w:p>
+      <w:pPr>
+        <w:spacing w:before="0" w:after="120" w:line="300" w:lineRule="auto"/>
+      </w:pPr>
+      <w:r>
+        <w:rPr>
+          <w:rFonts w:ascii="Microsoft YaHei" w:hAnsi="Microsoft YaHei" w:eastAsia="Microsoft YaHei"/>
+          <w:color w:val="1E2630"/>
+          <w:sz w:val="21"/>
+        </w:rPr>
+        <w:t>BUILD_QT_CLIENT 默认 OFF，保证 Linux 云 server 和未安装 Qt 的开发环境不受影响。x64-qt-vlc-release preset 才启用桌面目标；CMake 优先查找 Qt 6，找不到时兼容 Qt 5。构建后 windeployqt 自动复制 Qt DLL 与 platform plugin，公共 helper 同时复制 libVLC DLL 和 plugins。给测试用户时必须发送整个输出目录，而不是单独发送 exe。</w:t>
+      </w:r>
+    </w:p>
+    <w:p>
+      <w:pPr>
+        <w:spacing w:before="120" w:after="160" w:line="300" w:lineRule="auto"/>
+        <w:shd w:fill="F4F6F9"/>
+        <w:ind w:left="160" w:right="160"/>
+      </w:pPr>
+      <w:r>
+        <w:rPr>
+          <w:rFonts w:ascii="Microsoft YaHei" w:hAnsi="Microsoft YaHei" w:eastAsia="Microsoft YaHei"/>
+          <w:b/>
+          <w:color w:val="1F4D78"/>
+          <w:sz w:val="21"/>
+        </w:rPr>
+        <w:t>环境兼容记录：</w:t>
+      </w:r>
+      <w:r>
+        <w:rPr>
+          <w:rFonts w:ascii="Microsoft YaHei" w:hAnsi="Microsoft YaHei" w:eastAsia="Microsoft YaHei"/>
+          <w:color w:val="1E2630"/>
+          <w:sz w:val="21"/>
+        </w:rPr>
+        <w:t>本机 Anaconda Qt 5.15 仍使用已被 VS 2026 删除的 stdext 检查迭代器。QtMsvcCompatibility.h 只在 Qt 5 + MSVC 下把相关宏退化为普通指针；这是当前开发环境适配，不是长期替代官方 Qt 6 SDK 的方案。</w:t>
+      </w:r>
+    </w:p>
+    <w:p>
+      <w:pPr>
+        <w:pStyle w:val="Heading2"/>
+      </w:pPr>
+      <w:r>
+        <w:t>7.6 核心修改</w:t>
+      </w:r>
+    </w:p>
+    <w:tbl>
+      <w:tblPr>
+        <w:tblW w:type="dxa" w:w="9360"/>
+        <w:jc w:val="left"/>
+        <w:tblLayout w:type="fixed"/>
+        <w:tblLook w:firstColumn="1" w:firstRow="1" w:lastColumn="0" w:lastRow="0" w:noHBand="0" w:noVBand="1" w:val="04A0"/>
+        <w:tblInd w:w="120" w:type="dxa"/>
+        <w:tblBorders>
+          <w:top w:val="single" w:sz="4" w:space="0" w:color="C8D2DE"/>
+          <w:left w:val="single" w:sz="4" w:space="0" w:color="C8D2DE"/>
+          <w:bottom w:val="single" w:sz="4" w:space="0" w:color="C8D2DE"/>
+          <w:right w:val="single" w:sz="4" w:space="0" w:color="C8D2DE"/>
+          <w:insideH w:val="single" w:sz="4" w:space="0" w:color="C8D2DE"/>
+          <w:insideV w:val="single" w:sz="4" w:space="0" w:color="C8D2DE"/>
+        </w:tblBorders>
+      </w:tblPr>
+      <w:tblGrid>
+        <w:gridCol w:w="2200"/>
+        <w:gridCol w:w="3580"/>
+        <w:gridCol w:w="3580"/>
+      </w:tblGrid>
+      <w:tr>
+        <w:trPr>
+          <w:tblHeader w:val="true"/>
+        </w:trPr>
+        <w:tc>
+          <w:tcPr>
+            <w:tcW w:type="dxa" w:w="2200"/>
+            <w:vAlign w:val="center"/>
+            <w:tcMar>
+              <w:top w:w="80" w:type="dxa"/>
+              <w:start w:w="120" w:type="dxa"/>
+              <w:bottom w:w="80" w:type="dxa"/>
+              <w:end w:w="120" w:type="dxa"/>
+            </w:tcMar>
+            <w:shd w:fill="E8EEF5"/>
+          </w:tcPr>
+          <w:p>
+            <w:pPr>
+              <w:spacing w:before="0" w:after="0" w:line="276" w:lineRule="auto"/>
+              <w:jc w:val="center"/>
+            </w:pPr>
+            <w:r>
+              <w:rPr>
+                <w:rFonts w:ascii="Microsoft YaHei" w:hAnsi="Microsoft YaHei" w:eastAsia="Microsoft YaHei"/>
+                <w:b/>
+                <w:color w:val="1F4D78"/>
+                <w:sz w:val="18"/>
+              </w:rPr>
+              <w:t>文件/模块</w:t>
+            </w:r>
+          </w:p>
+        </w:tc>
+        <w:tc>
+          <w:tcPr>
+            <w:tcW w:type="dxa" w:w="3580"/>
+            <w:vAlign w:val="center"/>
+            <w:tcMar>
+              <w:top w:w="80" w:type="dxa"/>
+              <w:start w:w="120" w:type="dxa"/>
+              <w:bottom w:w="80" w:type="dxa"/>
+              <w:end w:w="120" w:type="dxa"/>
+            </w:tcMar>
+            <w:shd w:fill="E8EEF5"/>
+          </w:tcPr>
+          <w:p>
+            <w:pPr>
+              <w:spacing w:before="0" w:after="0" w:line="276" w:lineRule="auto"/>
+              <w:jc w:val="center"/>
+            </w:pPr>
+            <w:r>
+              <w:rPr>
+                <w:rFonts w:ascii="Microsoft YaHei" w:hAnsi="Microsoft YaHei" w:eastAsia="Microsoft YaHei"/>
+                <w:b/>
+                <w:color w:val="1F4D78"/>
+                <w:sz w:val="18"/>
+              </w:rPr>
+              <w:t>核心修改</w:t>
+            </w:r>
+          </w:p>
+        </w:tc>
+        <w:tc>
+          <w:tcPr>
+            <w:tcW w:type="dxa" w:w="3580"/>
+            <w:vAlign w:val="center"/>
+            <w:tcMar>
+              <w:top w:w="80" w:type="dxa"/>
+              <w:start w:w="120" w:type="dxa"/>
+              <w:bottom w:w="80" w:type="dxa"/>
+              <w:end w:w="120" w:type="dxa"/>
+            </w:tcMar>
+            <w:shd w:fill="E8EEF5"/>
+          </w:tcPr>
+          <w:p>
+            <w:pPr>
+              <w:spacing w:before="0" w:after="0" w:line="276" w:lineRule="auto"/>
+              <w:jc w:val="center"/>
+            </w:pPr>
+            <w:r>
+              <w:rPr>
+                <w:rFonts w:ascii="Microsoft YaHei" w:hAnsi="Microsoft YaHei" w:eastAsia="Microsoft YaHei"/>
+                <w:b/>
+                <w:color w:val="1F4D78"/>
+                <w:sz w:val="18"/>
+              </w:rPr>
+              <w:t>工程价值</w:t>
+            </w:r>
+          </w:p>
+        </w:tc>
+      </w:tr>
+      <w:tr>
+        <w:tc>
+          <w:tcPr>
+            <w:tcW w:type="dxa" w:w="2200"/>
+          </w:tcPr>
+          <w:p>
+            <w:pPr>
+              <w:spacing w:before="0" w:after="0" w:line="276" w:lineRule="auto"/>
+            </w:pPr>
+            <w:r>
+              <w:rPr>
+                <w:rFonts w:ascii="Consolas" w:hAnsi="Consolas" w:eastAsia="Consolas"/>
+                <w:color w:val="1E2630"/>
+                <w:sz w:val="17"/>
+              </w:rPr>
+              <w:t>SyncClientSession.h/.cpp</w:t>
+            </w:r>
+          </w:p>
+        </w:tc>
+        <w:tc>
+          <w:tcPr>
+            <w:tcW w:type="dxa" w:w="3580"/>
+          </w:tcPr>
+          <w:p>
+            <w:pPr>
+              <w:spacing w:before="0" w:after="0" w:line="276" w:lineRule="auto"/>
+            </w:pPr>
+            <w:r>
+              <w:rPr>
+                <w:rFonts w:ascii="Microsoft YaHei" w:hAnsi="Microsoft YaHei" w:eastAsia="Microsoft YaHei"/>
+                <w:color w:val="1E2630"/>
+                <w:sz w:val="18"/>
+              </w:rPr>
+              <w:t>从原 Client.cpp 抽出连接、快照握手、广播接收、PING/PONG、进度上报和串行发送。</w:t>
+            </w:r>
+          </w:p>
+        </w:tc>
+        <w:tc>
+          <w:tcPr>
+            <w:tcW w:type="dxa" w:w="3580"/>
+          </w:tcPr>
+          <w:p>
+            <w:pPr>
+              <w:spacing w:before="0" w:after="0" w:line="276" w:lineRule="auto"/>
+            </w:pPr>
+            <w:r>
+              <w:rPr>
+                <w:rFonts w:ascii="Microsoft YaHei" w:hAnsi="Microsoft YaHei" w:eastAsia="Microsoft YaHei"/>
+                <w:color w:val="1E2630"/>
+                <w:sz w:val="18"/>
+              </w:rPr>
+              <w:t>CLI 与 Qt 共用同一套网络行为，后续协议升级不再维护两份实现。</w:t>
+            </w:r>
+          </w:p>
+        </w:tc>
+      </w:tr>
+      <w:tr>
+        <w:tc>
+          <w:tcPr>
+            <w:tcW w:type="dxa" w:w="2200"/>
+          </w:tcPr>
+          <w:p>
+            <w:pPr>
+              <w:spacing w:before="0" w:after="0" w:line="276" w:lineRule="auto"/>
+            </w:pPr>
+            <w:r>
+              <w:rPr>
+                <w:rFonts w:ascii="Consolas" w:hAnsi="Consolas" w:eastAsia="Consolas"/>
+                <w:color w:val="1E2630"/>
+                <w:sz w:val="17"/>
+              </w:rPr>
+              <w:t>QtClientWindow.h/.cpp</w:t>
+            </w:r>
+          </w:p>
+        </w:tc>
+        <w:tc>
+          <w:tcPr>
+            <w:tcW w:type="dxa" w:w="3580"/>
+          </w:tcPr>
+          <w:p>
+            <w:pPr>
+              <w:spacing w:before="0" w:after="0" w:line="276" w:lineRule="auto"/>
+            </w:pPr>
+            <w:r>
+              <w:rPr>
+                <w:rFonts w:ascii="Microsoft YaHei" w:hAnsi="Microsoft YaHei" w:eastAsia="Microsoft YaHei"/>
+                <w:color w:val="1E2630"/>
+                <w:sz w:val="18"/>
+              </w:rPr>
+              <w:t>新增媒体/服务器输入、连接状态、视频区域、播放控制、进度、音量和全屏界面。</w:t>
+            </w:r>
+          </w:p>
+        </w:tc>
+        <w:tc>
+          <w:tcPr>
+            <w:tcW w:type="dxa" w:w="3580"/>
+          </w:tcPr>
+          <w:p>
+            <w:pPr>
+              <w:spacing w:before="0" w:after="0" w:line="276" w:lineRule="auto"/>
+            </w:pPr>
+            <w:r>
+              <w:rPr>
+                <w:rFonts w:ascii="Microsoft YaHei" w:hAnsi="Microsoft YaHei" w:eastAsia="Microsoft YaHei"/>
+                <w:color w:val="1E2630"/>
+                <w:sz w:val="18"/>
+              </w:rPr>
+              <w:t>普通测试用户无需学习命令行，即可完成核心观影流程。</w:t>
+            </w:r>
+          </w:p>
+        </w:tc>
+      </w:tr>
+      <w:tr>
+        <w:tc>
+          <w:tcPr>
+            <w:tcW w:type="dxa" w:w="2200"/>
+          </w:tcPr>
+          <w:p>
+            <w:pPr>
+              <w:spacing w:before="0" w:after="0" w:line="276" w:lineRule="auto"/>
+            </w:pPr>
+            <w:r>
+              <w:rPr>
+                <w:rFonts w:ascii="Consolas" w:hAnsi="Consolas" w:eastAsia="Consolas"/>
+                <w:color w:val="1E2630"/>
+                <w:sz w:val="17"/>
+              </w:rPr>
+              <w:t>QtClientController.h/.cpp</w:t>
+            </w:r>
+          </w:p>
+        </w:tc>
+        <w:tc>
+          <w:tcPr>
+            <w:tcW w:type="dxa" w:w="3580"/>
+          </w:tcPr>
+          <w:p>
+            <w:pPr>
+              <w:spacing w:before="0" w:after="0" w:line="276" w:lineRule="auto"/>
+            </w:pPr>
+            <w:r>
+              <w:rPr>
+                <w:rFonts w:ascii="Microsoft YaHei" w:hAnsi="Microsoft YaHei" w:eastAsia="Microsoft YaHei"/>
+                <w:color w:val="1E2630"/>
+                <w:sz w:val="18"/>
+              </w:rPr>
+              <w:t>在后台线程初始化 libVLC 和连接 server，并用 queued invoke 把网络回调送回 UI 线程。</w:t>
+            </w:r>
+          </w:p>
+        </w:tc>
+        <w:tc>
+          <w:tcPr>
+            <w:tcW w:type="dxa" w:w="3580"/>
+          </w:tcPr>
+          <w:p>
+            <w:pPr>
+              <w:spacing w:before="0" w:after="0" w:line="276" w:lineRule="auto"/>
+            </w:pPr>
+            <w:r>
+              <w:rPr>
+                <w:rFonts w:ascii="Microsoft YaHei" w:hAnsi="Microsoft YaHei" w:eastAsia="Microsoft YaHei"/>
+                <w:color w:val="1E2630"/>
+                <w:sz w:val="18"/>
+              </w:rPr>
+              <w:t>避免冷启动和网络握手冻结界面，也禁止后台线程直接操作 QWidget。</w:t>
+            </w:r>
+          </w:p>
+        </w:tc>
+      </w:tr>
+      <w:tr>
+        <w:tc>
+          <w:tcPr>
+            <w:tcW w:type="dxa" w:w="2200"/>
+          </w:tcPr>
+          <w:p>
+            <w:pPr>
+              <w:spacing w:before="0" w:after="0" w:line="276" w:lineRule="auto"/>
+            </w:pPr>
+            <w:r>
+              <w:rPr>
+                <w:rFonts w:ascii="Consolas" w:hAnsi="Consolas" w:eastAsia="Consolas"/>
+                <w:color w:val="1E2630"/>
+                <w:sz w:val="17"/>
+              </w:rPr>
+              <w:t>PlayerController / LibVlcPlayer</w:t>
+            </w:r>
+          </w:p>
+        </w:tc>
+        <w:tc>
+          <w:tcPr>
+            <w:tcW w:type="dxa" w:w="3580"/>
+          </w:tcPr>
+          <w:p>
+            <w:pPr>
+              <w:spacing w:before="0" w:after="0" w:line="276" w:lineRule="auto"/>
+            </w:pPr>
+            <w:r>
+              <w:rPr>
+                <w:rFonts w:ascii="Microsoft YaHei" w:hAnsi="Microsoft YaHei" w:eastAsia="Microsoft YaHei"/>
+                <w:color w:val="1E2630"/>
+                <w:sz w:val="18"/>
+              </w:rPr>
+              <w:t>补充原生视频窗口、媒体总时长和音量接口，并用 libvlc_media_player_set_hwnd 嵌入画面。</w:t>
+            </w:r>
+          </w:p>
+        </w:tc>
+        <w:tc>
+          <w:tcPr>
+            <w:tcW w:type="dxa" w:w="3580"/>
+          </w:tcPr>
+          <w:p>
+            <w:pPr>
+              <w:spacing w:before="0" w:after="0" w:line="276" w:lineRule="auto"/>
+            </w:pPr>
+            <w:r>
+              <w:rPr>
+                <w:rFonts w:ascii="Microsoft YaHei" w:hAnsi="Microsoft YaHei" w:eastAsia="Microsoft YaHei"/>
+                <w:color w:val="1E2630"/>
+                <w:sz w:val="18"/>
+              </w:rPr>
+              <w:t>播放器能力继续隐藏在抽象接口后，网络会话不依赖 libVLC C API。</w:t>
+            </w:r>
+          </w:p>
+        </w:tc>
+      </w:tr>
+      <w:tr>
+        <w:tc>
+          <w:tcPr>
+            <w:tcW w:type="dxa" w:w="2200"/>
+          </w:tcPr>
+          <w:p>
+            <w:pPr>
+              <w:spacing w:before="0" w:after="0" w:line="276" w:lineRule="auto"/>
+            </w:pPr>
+            <w:r>
+              <w:rPr>
+                <w:rFonts w:ascii="Consolas" w:hAnsi="Consolas" w:eastAsia="Consolas"/>
+                <w:color w:val="1E2630"/>
+                <w:sz w:val="17"/>
+              </w:rPr>
+              <w:t>CMake / presets</w:t>
+            </w:r>
+          </w:p>
+        </w:tc>
+        <w:tc>
+          <w:tcPr>
+            <w:tcW w:type="dxa" w:w="3580"/>
+          </w:tcPr>
+          <w:p>
+            <w:pPr>
+              <w:spacing w:before="0" w:after="0" w:line="276" w:lineRule="auto"/>
+            </w:pPr>
+            <w:r>
+              <w:rPr>
+                <w:rFonts w:ascii="Microsoft YaHei" w:hAnsi="Microsoft YaHei" w:eastAsia="Microsoft YaHei"/>
+                <w:color w:val="1E2630"/>
+                <w:sz w:val="18"/>
+              </w:rPr>
+              <w:t>新增可选 SyncCinemaQt 目标、Qt5/Qt6 发现、windeployqt 与 VLC runtime 自动复制。</w:t>
+            </w:r>
+          </w:p>
+        </w:tc>
+        <w:tc>
+          <w:tcPr>
+            <w:tcW w:type="dxa" w:w="3580"/>
+          </w:tcPr>
+          <w:p>
+            <w:pPr>
+              <w:spacing w:before="0" w:after="0" w:line="276" w:lineRule="auto"/>
+            </w:pPr>
+            <w:r>
+              <w:rPr>
+                <w:rFonts w:ascii="Microsoft YaHei" w:hAnsi="Microsoft YaHei" w:eastAsia="Microsoft YaHei"/>
+                <w:color w:val="1E2630"/>
+                <w:sz w:val="18"/>
+              </w:rPr>
+              <w:t>Qt 默认关闭，Windows CLI 与 Linux server 保持原构建路径；发布目录可独立运行。</w:t>
+            </w:r>
+          </w:p>
+        </w:tc>
+      </w:tr>
+      <w:tr>
+        <w:tc>
+          <w:tcPr>
+            <w:tcW w:type="dxa" w:w="2200"/>
+          </w:tcPr>
+          <w:p>
+            <w:pPr>
+              <w:spacing w:before="0" w:after="0" w:line="276" w:lineRule="auto"/>
+            </w:pPr>
+            <w:r>
+              <w:rPr>
+                <w:rFonts w:ascii="Consolas" w:hAnsi="Consolas" w:eastAsia="Consolas"/>
+                <w:color w:val="1E2630"/>
+                <w:sz w:val="17"/>
+              </w:rPr>
+              <w:t>QtMsvcCompatibility.h</w:t>
+            </w:r>
+          </w:p>
+        </w:tc>
+        <w:tc>
+          <w:tcPr>
+            <w:tcW w:type="dxa" w:w="3580"/>
+          </w:tcPr>
+          <w:p>
+            <w:pPr>
+              <w:spacing w:before="0" w:after="0" w:line="276" w:lineRule="auto"/>
+            </w:pPr>
+            <w:r>
+              <w:rPr>
+                <w:rFonts w:ascii="Microsoft YaHei" w:hAnsi="Microsoft YaHei" w:eastAsia="Microsoft YaHei"/>
+                <w:color w:val="1E2630"/>
+                <w:sz w:val="18"/>
+              </w:rPr>
+              <w:t>仅在 Qt 5 + 新版 MSVC 下替换已经被 VS 2026 删除的 stdext 迭代器宏。</w:t>
+            </w:r>
+          </w:p>
+        </w:tc>
+        <w:tc>
+          <w:tcPr>
+            <w:tcW w:type="dxa" w:w="3580"/>
+          </w:tcPr>
+          <w:p>
+            <w:pPr>
+              <w:spacing w:before="0" w:after="0" w:line="276" w:lineRule="auto"/>
+            </w:pPr>
+            <w:r>
+              <w:rPr>
+                <w:rFonts w:ascii="Microsoft YaHei" w:hAnsi="Microsoft YaHei" w:eastAsia="Microsoft YaHei"/>
+                <w:color w:val="1E2630"/>
+                <w:sz w:val="18"/>
+              </w:rPr>
+              <w:t>兼容当前开发环境；迁移到官方 Qt 6 后自动退出构建。</w:t>
+            </w:r>
+          </w:p>
+        </w:tc>
+      </w:tr>
+    </w:tbl>
+    <w:p>
+      <w:pPr>
+        <w:pStyle w:val="Heading2"/>
+      </w:pPr>
+      <w:r>
+        <w:t>7.7 当前验证证据</w:t>
+      </w:r>
+    </w:p>
+    <w:p>
+      <w:pPr>
+        <w:pStyle w:val="ListNumber"/>
+      </w:pPr>
+      <w:r>
+        <w:rPr>
+          <w:rFonts w:ascii="Microsoft YaHei" w:hAnsi="Microsoft YaHei" w:eastAsia="Microsoft YaHei"/>
+          <w:color w:val="1E2630"/>
+          <w:sz w:val="21"/>
+        </w:rPr>
+        <w:t>SyncCinemaQt、libVLC CLI、SyncCinemaServer 和 SyncCinemaCoreTests 在 Windows Release 配置共同构建通过。</w:t>
+      </w:r>
+    </w:p>
+    <w:p>
+      <w:pPr>
+        <w:pStyle w:val="ListNumber"/>
+      </w:pPr>
+      <w:r>
+        <w:rPr>
+          <w:rFonts w:ascii="Microsoft YaHei" w:hAnsi="Microsoft YaHei" w:eastAsia="Microsoft YaHei"/>
+          <w:color w:val="1E2630"/>
+          <w:sz w:val="21"/>
+        </w:rPr>
+        <w:t>无 libVLC 的 Windows x64 Debug MockPlayer 配置构建通过，CTest 1/1 通过。</w:t>
+      </w:r>
+    </w:p>
+    <w:p>
+      <w:pPr>
+        <w:pStyle w:val="ListNumber"/>
+      </w:pPr>
+      <w:r>
+        <w:rPr>
+          <w:rFonts w:ascii="Microsoft YaHei" w:hAnsi="Microsoft YaHei" w:eastAsia="Microsoft YaHei"/>
+          <w:color w:val="1E2630"/>
+          <w:sz w:val="21"/>
+        </w:rPr>
+        <w:t>WSL Ubuntu 22.04 的 Linux server 和核心测试构建通过，CTest 1/1 通过。</w:t>
+      </w:r>
+    </w:p>
+    <w:p>
+      <w:pPr>
+        <w:pStyle w:val="ListNumber"/>
+      </w:pPr>
+      <w:r>
+        <w:rPr>
+          <w:rFonts w:ascii="Microsoft YaHei" w:hAnsi="Microsoft YaHei" w:eastAsia="Microsoft YaHei"/>
+          <w:color w:val="1E2630"/>
+          <w:sz w:val="21"/>
+        </w:rPr>
+        <w:t>CLI 通过新 SyncClientSession 完成真实 TCP 连接、SNAPSHOT 0 Stopped 0 握手、状态查询和正常退出。</w:t>
+      </w:r>
+    </w:p>
+    <w:p>
+      <w:pPr>
+        <w:pStyle w:val="ListNumber"/>
+      </w:pPr>
+      <w:r>
+        <w:rPr>
+          <w:rFonts w:ascii="Microsoft YaHei" w:hAnsi="Microsoft YaHei" w:eastAsia="Microsoft YaHei"/>
+          <w:color w:val="1E2630"/>
+          <w:sz w:val="21"/>
+        </w:rPr>
+        <w:t>Qt 界面在 1180x760 与最小 820x560 下完成真实渲染截图检查，无控件重叠、文字截断或空白窗口。</w:t>
+      </w:r>
+    </w:p>
+    <w:p>
+      <w:pPr>
+        <w:pStyle w:val="Heading2"/>
+      </w:pPr>
+      <w:r>
+        <w:t>7.8 当前局限</w:t>
+      </w:r>
+    </w:p>
+    <w:p>
+      <w:pPr>
+        <w:pStyle w:val="ListBullet"/>
+      </w:pPr>
+      <w:r>
+        <w:rPr>
+          <w:rFonts w:ascii="Microsoft YaHei" w:hAnsi="Microsoft YaHei" w:eastAsia="Microsoft YaHei"/>
+          <w:color w:val="1E2630"/>
+          <w:sz w:val="21"/>
+        </w:rPr>
+        <w:t>当前尚未在第二台真实电脑上完成 Qt 客户端的完整播放、暂停和 seek 验收。</w:t>
+      </w:r>
+    </w:p>
+    <w:p>
+      <w:pPr>
+        <w:pStyle w:val="ListBullet"/>
+      </w:pPr>
+      <w:r>
+        <w:rPr>
+          <w:rFonts w:ascii="Microsoft YaHei" w:hAnsi="Microsoft YaHei" w:eastAsia="Microsoft YaHei"/>
+          <w:color w:val="1E2630"/>
+          <w:sz w:val="21"/>
+        </w:rPr>
+        <w:t>server 端口仍固定为 9000，界面尚无房间码、用户身份和在线成员列表。</w:t>
+      </w:r>
+    </w:p>
+    <w:p>
+      <w:pPr>
+        <w:pStyle w:val="ListBullet"/>
+      </w:pPr>
+      <w:r>
+        <w:rPr>
+          <w:rFonts w:ascii="Microsoft YaHei" w:hAnsi="Microsoft YaHei" w:eastAsia="Microsoft YaHei"/>
+          <w:color w:val="1E2630"/>
+          <w:sz w:val="21"/>
+        </w:rPr>
+        <w:t>聊天、弹幕、安装器、自动更新、日志文件和崩溃收集均不属于第一版。</w:t>
+      </w:r>
+    </w:p>
+    <w:p>
+      <w:pPr>
+        <w:pStyle w:val="ListBullet"/>
+      </w:pPr>
+      <w:r>
+        <w:rPr>
+          <w:rFonts w:ascii="Microsoft YaHei" w:hAnsi="Microsoft YaHei" w:eastAsia="Microsoft YaHei"/>
+          <w:color w:val="1E2630"/>
+          <w:sz w:val="21"/>
+        </w:rPr>
+        <w:t>只读校正建议仍未闭环执行；UI 不会自动 seek 用户播放器。</w:t>
+      </w:r>
+    </w:p>
+    <w:p>
+      <w:pPr>
+        <w:pStyle w:val="ListBullet"/>
+      </w:pPr>
+      <w:r>
+        <w:rPr>
+          <w:rFonts w:ascii="Microsoft YaHei" w:hAnsi="Microsoft YaHei" w:eastAsia="Microsoft YaHei"/>
+          <w:color w:val="1E2630"/>
+          <w:sz w:val="21"/>
+        </w:rPr>
+        <w:t>公开发布前应换用正式 Qt SDK，并建立可复现的 Release 打包与签名流程。</w:t>
+      </w:r>
+    </w:p>
+    <w:p>
+      <w:pPr>
+        <w:pStyle w:val="Heading1"/>
+      </w:pPr>
+      <w:r>
+        <w:t>8. 面试表达模板</w:t>
       </w:r>
     </w:p>
     <w:p>
@@ -5006,10 +5995,88 @@
     </w:p>
     <w:p>
       <w:pPr>
+        <w:spacing w:before="0" w:after="120" w:line="300" w:lineRule="auto"/>
+      </w:pPr>
+      <w:r>
+        <w:rPr>
+          <w:rFonts w:ascii="Microsoft YaHei" w:hAnsi="Microsoft YaHei" w:eastAsia="Microsoft YaHei"/>
+          <w:color w:val="1E2630"/>
+          <w:sz w:val="21"/>
+        </w:rPr>
+        <w:t>第五段可以这样说明客户端工程化：为了让另一台电脑由普通用户直接参与测试，我没有在 Qt 中重写一套网络代码，而是先把旧 Client.cpp 拆成纯 C++ 的 SyncClientSession。CLI 和 Qt 共用快照握手、心跳、广播与进度上报；QtClientController 在后台完成 libVLC 冷启动和连接，再用 queued invoke 回到 UI 线程。视频通过 HWND 嵌入，CMake 把 Qt 目标设为可选并自动部署 Qt/VLC runtime，因此 Linux server 构建路径保持不变。</w:t>
+      </w:r>
+    </w:p>
+    <w:p>
+      <w:pPr>
         <w:pStyle w:val="Heading1"/>
       </w:pPr>
       <w:r>
-        <w:t>8. 后续学习重点</w:t>
+        <w:t>9. 后续学习重点</w:t>
+      </w:r>
+    </w:p>
+    <w:p>
+      <w:pPr>
+        <w:pStyle w:val="ListNumber"/>
+      </w:pPr>
+      <w:r>
+        <w:rPr>
+          <w:rFonts w:ascii="Microsoft YaHei" w:hAnsi="Microsoft YaHei" w:eastAsia="Microsoft YaHei"/>
+          <w:color w:val="1E2630"/>
+          <w:sz w:val="21"/>
+        </w:rPr>
+        <w:t>SyncClientSession：如何把 UI/CLI 与网络、协议、播放器并发解耦。</w:t>
+      </w:r>
+    </w:p>
+    <w:p>
+      <w:pPr>
+        <w:pStyle w:val="ListNumber"/>
+      </w:pPr>
+      <w:r>
+        <w:rPr>
+          <w:rFonts w:ascii="Microsoft YaHei" w:hAnsi="Microsoft YaHei" w:eastAsia="Microsoft YaHei"/>
+          <w:color w:val="1E2630"/>
+          <w:sz w:val="21"/>
+        </w:rPr>
+        <w:t>QtClientController：为什么慢操作放到 worker thread，QWidget 更新必须回到 UI 线程。</w:t>
+      </w:r>
+    </w:p>
+    <w:p>
+      <w:pPr>
+        <w:pStyle w:val="ListNumber"/>
+      </w:pPr>
+      <w:r>
+        <w:rPr>
+          <w:rFonts w:ascii="Microsoft YaHei" w:hAnsi="Microsoft YaHei" w:eastAsia="Microsoft YaHei"/>
+          <w:color w:val="1E2630"/>
+          <w:sz w:val="21"/>
+        </w:rPr>
+        <w:t>QObject signal、QMetaObject::invokeMethod 与 QueuedConnection 的线程边界。</w:t>
+      </w:r>
+    </w:p>
+    <w:p>
+      <w:pPr>
+        <w:pStyle w:val="ListNumber"/>
+      </w:pPr>
+      <w:r>
+        <w:rPr>
+          <w:rFonts w:ascii="Microsoft YaHei" w:hAnsi="Microsoft YaHei" w:eastAsia="Microsoft YaHei"/>
+          <w:color w:val="1E2630"/>
+          <w:sz w:val="21"/>
+        </w:rPr>
+        <w:t>libvlc_media_player_set_hwnd：第三方播放器如何嵌入 Qt 原生窗口。</w:t>
+      </w:r>
+    </w:p>
+    <w:p>
+      <w:pPr>
+        <w:pStyle w:val="ListNumber"/>
+      </w:pPr>
+      <w:r>
+        <w:rPr>
+          <w:rFonts w:ascii="Microsoft YaHei" w:hAnsi="Microsoft YaHei" w:eastAsia="Microsoft YaHei"/>
+          <w:color w:val="1E2630"/>
+          <w:sz w:val="21"/>
+        </w:rPr>
+        <w:t>CMake 的可选目标、find_package、AUTOMOC 和 POST_BUILD runtime 部署。</w:t>
       </w:r>
     </w:p>
     <w:p>
@@ -5087,7 +6154,7 @@
           <w:color w:val="1E2630"/>
           <w:sz w:val="21"/>
         </w:rPr>
-        <w:t>Client::receiveInitialSnapshot：select 超时、PING 兼容和 TCP 多读缓冲如何组成握手状态机。</w:t>
+        <w:t>SyncClientSession::receiveInitialSnapshot：select 超时、PING 兼容和 TCP 多读缓冲如何组成握手状态机。</w:t>
       </w:r>
     </w:p>
     <w:p>
@@ -5100,7 +6167,7 @@
           <w:color w:val="1E2630"/>
           <w:sz w:val="21"/>
         </w:rPr>
-        <w:t>Client::applyInitialSnapshot：播放器准备、毫秒 seek 和 Playing 状态经过时间补偿。</w:t>
+        <w:t>SyncClientSession::applyInitialSnapshot：播放器准备、毫秒 seek 和 Playing 状态经过时间补偿。</w:t>
       </w:r>
     </w:p>
     <w:p>
@@ -5217,7 +6284,7 @@
           <w:color w:val="1E2630"/>
           <w:sz w:val="21"/>
         </w:rPr>
-        <w:t>Client.cpp 的 playerMutex/sendMutex：多个线程如何安全共享播放器和同一个 TCP 字节流。</w:t>
+        <w:t>SyncClientSession 的 playerMutex/sendMutex：多个线程如何安全共享播放器和同一个 TCP 字节流。</w:t>
       </w:r>
     </w:p>
     <w:p>
@@ -5225,7 +6292,7 @@
         <w:pStyle w:val="Heading1"/>
       </w:pPr>
       <w:r>
-        <w:t>9. 后续工程路线</w:t>
+        <w:t>10. 后续工程路线</w:t>
       </w:r>
     </w:p>
     <w:p>
@@ -5238,7 +6305,20 @@
           <w:color w:val="1E2630"/>
           <w:sz w:val="21"/>
         </w:rPr>
-        <w:t>在合理提交间隔后提交只读校正决策候选，并部署到云端，用两台真实设备统计建议频率、方向正确率和误触发场景。</w:t>
+        <w:t>在合理提交间隔后提交 Qt 桌面客户端候选，并打包完整 runtime 目录交给第二台电脑做真实用户验收。</w:t>
+      </w:r>
+    </w:p>
+    <w:p>
+      <w:pPr>
+        <w:pStyle w:val="ListNumber"/>
+      </w:pPr>
+      <w:r>
+        <w:rPr>
+          <w:rFonts w:ascii="Microsoft YaHei" w:hAnsi="Microsoft YaHei" w:eastAsia="Microsoft YaHei"/>
+          <w:color w:val="1E2630"/>
+          <w:sz w:val="21"/>
+        </w:rPr>
+        <w:t>用两台真实设备采集 read_only 建议日志，统计建议频率、方向正确率和误触发场景。</w:t>
       </w:r>
     </w:p>
     <w:p>
@@ -5316,7 +6396,7 @@
           <w:color w:val="1E2630"/>
           <w:sz w:val="21"/>
         </w:rPr>
-        <w:t>把网络与同步核心从 CLI 交互中进一步解耦，再接入 Qt 界面、聊天和弹幕。</w:t>
+        <w:t>在 Qt 客户端上继续增加房间信息、聊天与弹幕，但不让 UI 直接处理协议字符串。</w:t>
       </w:r>
     </w:p>
     <w:p>
@@ -5353,7 +6433,7 @@
           <w:color w:val="1E2630"/>
           <w:sz w:val="21"/>
         </w:rPr>
-        <w:t>92300ce 晚加入快照已经发布。当前只读校正策略已完成本地实现、跨平台测试和双客户端集成验证，按提交节奏要求停在未提交状态。下一步先部署该 read_only 版本收集真实异地建议日志；确认方向、阈值和冷却可靠后，才设计带 epoch、命令 id 与执行回执的最小闭环。</w:t>
+        <w:t>只读校正策略已作为 2f4f27a 发布。feature/qt-client-ui 已形成可构建、可打包的本地候选，并保持 CLI 与 Linux server 回归通过。下一步在合理提交间隔后提交该 UI 阶段，把完整运行目录交给第二台电脑做真实用户测试；随后用异地日志校准阈值，再打开最小闭环。</w:t>
       </w:r>
     </w:p>
     <w:sectPr>

</xml_diff>

<commit_message>
feature: isolate room state by media session
</commit_message>
<xml_diff>
--- a/docs/SyncCinema_Engineering_Journal.docx
+++ b/docs/SyncCinema_Engineering_Journal.docx
@@ -206,7 +206,7 @@
                 <w:color w:val="1E2630"/>
                 <w:sz w:val="19"/>
               </w:rPr>
-              <w:t>2f4f27a - add read-only sync correction advice</w:t>
+              <w:t>81ec949 - add Qt desktop client and shared session layer</w:t>
             </w:r>
           </w:p>
         </w:tc>
@@ -247,7 +247,7 @@
                 <w:color w:val="1E2630"/>
                 <w:sz w:val="19"/>
               </w:rPr>
-              <w:t>Qt 桌面客户端、共享会话层与播放器画面嵌入</w:t>
+              <w:t>媒体会话身份、JOIN 握手与旧进度隔离</w:t>
             </w:r>
           </w:p>
         </w:tc>
@@ -5935,6 +5935,147 @@
     </w:p>
     <w:p>
       <w:pPr>
+        <w:pStyle w:val="Heading2"/>
+      </w:pPr>
+      <w:r>
+        <w:t>7.9 媒体会话身份与旧进度隔离</w:t>
+      </w:r>
+    </w:p>
+    <w:p>
+      <w:pPr>
+        <w:spacing w:before="0" w:after="120" w:line="300" w:lineRule="auto"/>
+      </w:pPr>
+      <w:r>
+        <w:rPr>
+          <w:rFonts w:ascii="Microsoft YaHei" w:hAnsi="Microsoft YaHei" w:eastAsia="Microsoft YaHei"/>
+          <w:color w:val="1E2630"/>
+          <w:sz w:val="21"/>
+        </w:rPr>
+        <w:t>Qt MVP 暴露出一个房间语义缺口：client 断开后打开另一部电影，server 仍会把上一部电影的 SNAPSHOT 位置应用到新播放器。根因不是 libVLC，而是原协议只同步状态和进度，完全没有说明这些状态属于哪一个媒体。仅在 UI 中把进度强制归零会掩盖问题，并且无法阻止两个 client 播放不同电影时继续交换 PLAY、PAUSE 和 SEEK。</w:t>
+      </w:r>
+    </w:p>
+    <w:p>
+      <w:pPr>
+        <w:spacing w:before="80" w:after="160" w:line="264" w:lineRule="auto"/>
+        <w:shd w:fill="F7F8FA"/>
+        <w:ind w:left="180" w:right="180"/>
+      </w:pPr>
+      <w:r>
+        <w:rPr>
+          <w:rFonts w:ascii="Consolas" w:hAnsi="Consolas" w:eastAsia="Consolas"/>
+          <w:color w:val="1E2630"/>
+          <w:sz w:val="17"/>
+        </w:rPr>
+        <w:t>TCP connected</w:t>
+        <w:br/>
+      </w:r>
+      <w:r>
+        <w:rPr>
+          <w:rFonts w:ascii="Consolas" w:hAnsi="Consolas" w:eastAsia="Consolas"/>
+          <w:color w:val="1E2630"/>
+          <w:sz w:val="17"/>
+        </w:rPr>
+        <w:t xml:space="preserve">  -&gt; client: JOIN &lt;media_identity&gt;</w:t>
+        <w:br/>
+      </w:r>
+      <w:r>
+        <w:rPr>
+          <w:rFonts w:ascii="Consolas" w:hAnsi="Consolas" w:eastAsia="Consolas"/>
+          <w:color w:val="1E2630"/>
+          <w:sz w:val="17"/>
+        </w:rPr>
+        <w:t xml:space="preserve">  -&gt; server: SNAPSHOT &lt;epoch&gt; &lt;state&gt; &lt;position_ms&gt; &lt;media_identity&gt;</w:t>
+        <w:br/>
+      </w:r>
+      <w:r>
+        <w:rPr>
+          <w:rFonts w:ascii="Consolas" w:hAnsi="Consolas" w:eastAsia="Consolas"/>
+          <w:color w:val="1E2630"/>
+          <w:sz w:val="17"/>
+        </w:rPr>
+        <w:t xml:space="preserve">     or REJECT MEDIA_MISMATCH</w:t>
+      </w:r>
+    </w:p>
+    <w:p>
+      <w:pPr>
+        <w:pStyle w:val="ListBullet"/>
+      </w:pPr>
+      <w:r>
+        <w:rPr>
+          <w:rFonts w:ascii="Microsoft YaHei" w:hAnsi="Microsoft YaHei" w:eastAsia="Microsoft YaHei"/>
+          <w:color w:val="1E2630"/>
+          <w:sz w:val="21"/>
+        </w:rPr>
+        <w:t>媒体身份使用规范化来源字符串的稳定 FNV-1a 64-bit 标识，仅做一致性判断，不用于安全认证。</w:t>
+      </w:r>
+    </w:p>
+    <w:p>
+      <w:pPr>
+        <w:pStyle w:val="ListBullet"/>
+      </w:pPr>
+      <w:r>
+        <w:rPr>
+          <w:rFonts w:ascii="Microsoft YaHei" w:hAnsi="Microsoft YaHei" w:eastAsia="Microsoft YaHei"/>
+          <w:color w:val="1E2630"/>
+          <w:sz w:val="21"/>
+        </w:rPr>
+        <w:t>空房间的首个 client 建立新媒体会话，Room 从 Stopped/0 和 epoch 0 开始。</w:t>
+      </w:r>
+    </w:p>
+    <w:p>
+      <w:pPr>
+        <w:pStyle w:val="ListBullet"/>
+      </w:pPr>
+      <w:r>
+        <w:rPr>
+          <w:rFonts w:ascii="Microsoft YaHei" w:hAnsi="Microsoft YaHei" w:eastAsia="Microsoft YaHei"/>
+          <w:color w:val="1E2630"/>
+          <w:sz w:val="21"/>
+        </w:rPr>
+        <w:t>房间已有观众时只允许相同媒体加入，不同媒体在进入广播列表前被拒绝。</w:t>
+      </w:r>
+    </w:p>
+    <w:p>
+      <w:pPr>
+        <w:pStyle w:val="ListBullet"/>
+      </w:pPr>
+      <w:r>
+        <w:rPr>
+          <w:rFonts w:ascii="Microsoft YaHei" w:hAnsi="Microsoft YaHei" w:eastAsia="Microsoft YaHei"/>
+          <w:color w:val="1E2630"/>
+          <w:sz w:val="21"/>
+        </w:rPr>
+        <w:t>最后一个 client 离开后清空媒体、权威状态和 epoch，下一部电影不会继承旧进度。</w:t>
+      </w:r>
+    </w:p>
+    <w:p>
+      <w:pPr>
+        <w:pStyle w:val="ListBullet"/>
+      </w:pPr>
+      <w:r>
+        <w:rPr>
+          <w:rFonts w:ascii="Microsoft YaHei" w:hAnsi="Microsoft YaHei" w:eastAsia="Microsoft YaHei"/>
+          <w:color w:val="1E2630"/>
+          <w:sz w:val="21"/>
+        </w:rPr>
+        <w:t>每个 TCP 连接在独立线程中完成限时 JOIN，慢连接不会阻塞 server 的 accept 循环。</w:t>
+      </w:r>
+    </w:p>
+    <w:p>
+      <w:pPr>
+        <w:spacing w:before="0" w:after="120" w:line="300" w:lineRule="auto"/>
+      </w:pPr>
+      <w:r>
+        <w:rPr>
+          <w:rFonts w:ascii="Microsoft YaHei" w:hAnsi="Microsoft YaHei" w:eastAsia="Microsoft YaHei"/>
+          <w:color w:val="1E2630"/>
+          <w:sz w:val="21"/>
+        </w:rPr>
+        <w:t>测试覆盖 JOIN/REJECT/SNAPSHOT 序列化、路径分隔符归一化、同媒体加入、异媒体拒绝、广播列表隔离以及最后一位用户离开后的状态重置。这个改动先建立正确的会话边界，后续自动校正命令才能确保 epoch、进度和目标 client 都属于同一部媒体。</w:t>
+      </w:r>
+    </w:p>
+    <w:p>
+      <w:pPr>
         <w:pStyle w:val="Heading1"/>
       </w:pPr>
       <w:r>
@@ -6008,6 +6149,19 @@
     </w:p>
     <w:p>
       <w:pPr>
+        <w:spacing w:before="0" w:after="120" w:line="300" w:lineRule="auto"/>
+      </w:pPr>
+      <w:r>
+        <w:rPr>
+          <w:rFonts w:ascii="Microsoft YaHei" w:hAnsi="Microsoft YaHei" w:eastAsia="Microsoft YaHei"/>
+          <w:color w:val="1E2630"/>
+          <w:sz w:val="21"/>
+        </w:rPr>
+        <w:t>第六段可以这样说明媒体一致性：Qt 实测发现切换影片会继承旧 Room 进度，我没有只在 UI 中归零，而是追到协议层补上媒体会话身份。client 先发送 JOIN，server 只有在媒体一致时才注册并返回带身份的快照；活跃房间拒绝不同媒体，最后一位用户离开后重置状态。这样从协议、Room 到 UI 都不会把一部电影的进度错误应用到另一部电影，也为后续带 epoch 的自动校正建立了正确边界。</w:t>
+      </w:r>
+    </w:p>
+    <w:p>
+      <w:pPr>
         <w:pStyle w:val="Heading1"/>
       </w:pPr>
       <w:r>
@@ -6305,7 +6459,20 @@
           <w:color w:val="1E2630"/>
           <w:sz w:val="21"/>
         </w:rPr>
-        <w:t>在合理提交间隔后提交 Qt 桌面客户端候选，并打包完整 runtime 目录交给第二台电脑做真实用户验收。</w:t>
+        <w:t>提交媒体会话身份阶段，并同步部署新版 server 与 client 做切换影片回归。</w:t>
+      </w:r>
+    </w:p>
+    <w:p>
+      <w:pPr>
+        <w:pStyle w:val="ListNumber"/>
+      </w:pPr>
+      <w:r>
+        <w:rPr>
+          <w:rFonts w:ascii="Microsoft YaHei" w:hAnsi="Microsoft YaHei" w:eastAsia="Microsoft YaHei"/>
+          <w:color w:val="1E2630"/>
+          <w:sz w:val="21"/>
+        </w:rPr>
+        <w:t>打包完整 Qt/VLC runtime 目录，交给第二台电脑做真实用户验收。</w:t>
       </w:r>
     </w:p>
     <w:p>
@@ -6433,7 +6600,7 @@
           <w:color w:val="1E2630"/>
           <w:sz w:val="21"/>
         </w:rPr>
-        <w:t>只读校正策略已作为 2f4f27a 发布。feature/qt-client-ui 已形成可构建、可打包的本地候选，并保持 CLI 与 Linux server 回归通过。下一步在合理提交间隔后提交该 UI 阶段，把完整运行目录交给第二台电脑做真实用户测试；随后用异地日志校准阈值，再打开最小闭环。</w:t>
+        <w:t>Qt 桌面客户端已作为 81ec949 发布。当前在独立分支补齐媒体 JOIN 握手、活跃房间一致性检查和空房间状态重置。下一步完成 Windows/Linux 回归并部署新版 server/client，验证切换影片不会继承旧进度；随后把完整运行目录交给第二台电脑测试，再用异地日志校准阈值并打开最小校正闭环。</w:t>
       </w:r>
     </w:p>
     <w:sectPr>

</xml_diff>

<commit_message>
feature: surface asynchronous media playback status
</commit_message>
<xml_diff>
--- a/docs/SyncCinema_Engineering_Journal.docx
+++ b/docs/SyncCinema_Engineering_Journal.docx
@@ -165,7 +165,7 @@
                 <w:color w:val="1E2630"/>
                 <w:sz w:val="19"/>
               </w:rPr>
-              <w:t>feature/qt-client-ui</w:t>
+              <w:t>feature/media-load-feedback</w:t>
             </w:r>
           </w:p>
         </w:tc>
@@ -187,7 +187,7 @@
                 <w:color w:val="1E2630"/>
                 <w:sz w:val="19"/>
               </w:rPr>
-              <w:t>当前已发布提交</w:t>
+              <w:t>版本基线</w:t>
             </w:r>
           </w:p>
         </w:tc>
@@ -206,7 +206,7 @@
                 <w:color w:val="1E2630"/>
                 <w:sz w:val="19"/>
               </w:rPr>
-              <w:t>81ec949 - add Qt desktop client and shared session layer</w:t>
+              <w:t>10a19af + 本阶段 media-load-feedback</w:t>
             </w:r>
           </w:p>
         </w:tc>
@@ -247,7 +247,7 @@
                 <w:color w:val="1E2630"/>
                 <w:sz w:val="19"/>
               </w:rPr>
-              <w:t>媒体会话身份、JOIN 握手与旧进度隔离</w:t>
+              <w:t>libVLC 异步媒体状态与 Qt 错误反馈</w:t>
             </w:r>
           </w:p>
         </w:tc>
@@ -288,7 +288,7 @@
                 <w:color w:val="1E2630"/>
                 <w:sz w:val="19"/>
               </w:rPr>
-              <w:t>2026-07-29</w:t>
+              <w:t>2026-09-01</w:t>
             </w:r>
           </w:p>
         </w:tc>
@@ -6076,6 +6076,160 @@
     </w:p>
     <w:p>
       <w:pPr>
+        <w:pStyle w:val="Heading2"/>
+      </w:pPr>
+      <w:r>
+        <w:t>7.10 libVLC 异步媒体状态与失败反馈</w:t>
+      </w:r>
+    </w:p>
+    <w:p>
+      <w:pPr>
+        <w:spacing w:before="0" w:after="120" w:line="300" w:lineRule="auto"/>
+      </w:pPr>
+      <w:r>
+        <w:rPr>
+          <w:rFonts w:ascii="Microsoft YaHei" w:hAnsi="Microsoft YaHei" w:eastAsia="Microsoft YaHei"/>
+          <w:color w:val="1E2630"/>
+          <w:sz w:val="21"/>
+        </w:rPr>
+        <w:t>Qt 实测发现，错误 URL 会连接房间但视频区域长期黑屏。根因是 openMedia 只完成媒体对象和 media player 的创建；HTTP 404、格式不支持和解码失败发生在真正播放后的 libVLC 内部线程，因此不能用 openMedia 的同步返回值代表媒体已经可播放。</w:t>
+      </w:r>
+    </w:p>
+    <w:p>
+      <w:pPr>
+        <w:spacing w:before="80" w:after="160" w:line="264" w:lineRule="auto"/>
+        <w:shd w:fill="F7F8FA"/>
+        <w:ind w:left="180" w:right="180"/>
+      </w:pPr>
+      <w:r>
+        <w:rPr>
+          <w:rFonts w:ascii="Consolas" w:hAnsi="Consolas" w:eastAsia="Consolas"/>
+          <w:color w:val="1E2630"/>
+          <w:sz w:val="17"/>
+        </w:rPr>
+        <w:t>libVLC internal thread</w:t>
+        <w:br/>
+      </w:r>
+      <w:r>
+        <w:rPr>
+          <w:rFonts w:ascii="Consolas" w:hAnsi="Consolas" w:eastAsia="Consolas"/>
+          <w:color w:val="1E2630"/>
+          <w:sz w:val="17"/>
+        </w:rPr>
+        <w:t xml:space="preserve">  -&gt; PlayerEvent { Opening | Buffering | Playing | Error | EndReached }</w:t>
+        <w:br/>
+      </w:r>
+      <w:r>
+        <w:rPr>
+          <w:rFonts w:ascii="Consolas" w:hAnsi="Consolas" w:eastAsia="Consolas"/>
+          <w:color w:val="1E2630"/>
+          <w:sz w:val="17"/>
+        </w:rPr>
+        <w:t xml:space="preserve">  -&gt; QtClientController queued invoke</w:t>
+        <w:br/>
+      </w:r>
+      <w:r>
+        <w:rPr>
+          <w:rFonts w:ascii="Consolas" w:hAnsi="Consolas" w:eastAsia="Consolas"/>
+          <w:color w:val="1E2630"/>
+          <w:sz w:val="17"/>
+        </w:rPr>
+        <w:t xml:space="preserve">  -&gt; Qt main thread updates the video status overlay</w:t>
+      </w:r>
+    </w:p>
+    <w:p>
+      <w:pPr>
+        <w:pStyle w:val="ListBullet"/>
+      </w:pPr>
+      <w:r>
+        <w:rPr>
+          <w:rFonts w:ascii="Microsoft YaHei" w:hAnsi="Microsoft YaHei" w:eastAsia="Microsoft YaHei"/>
+          <w:color w:val="1E2630"/>
+          <w:sz w:val="21"/>
+        </w:rPr>
+        <w:t>PlayerController 新增 UI 无关的事件接口，Qt 和测试代码不直接依赖 libVLC 事件类型。</w:t>
+      </w:r>
+    </w:p>
+    <w:p>
+      <w:pPr>
+        <w:pStyle w:val="ListBullet"/>
+      </w:pPr>
+      <w:r>
+        <w:rPr>
+          <w:rFonts w:ascii="Microsoft YaHei" w:hAnsi="Microsoft YaHei" w:eastAsia="Microsoft YaHei"/>
+          <w:color w:val="1E2630"/>
+          <w:sz w:val="21"/>
+        </w:rPr>
+        <w:t>LibVlcPlayer 订阅七类 media player 事件，并在 stop/release 前统一解绑，控制回调生命周期。</w:t>
+      </w:r>
+    </w:p>
+    <w:p>
+      <w:pPr>
+        <w:pStyle w:val="ListBullet"/>
+      </w:pPr>
+      <w:r>
+        <w:rPr>
+          <w:rFonts w:ascii="Microsoft YaHei" w:hAnsi="Microsoft YaHei" w:eastAsia="Microsoft YaHei"/>
+          <w:color w:val="1E2630"/>
+          <w:sz w:val="21"/>
+        </w:rPr>
+        <w:t>事件回调只在锁内复制 std::function，在锁外执行，避免 UI 回调反向进入播放器时死锁。</w:t>
+      </w:r>
+    </w:p>
+    <w:p>
+      <w:pPr>
+        <w:pStyle w:val="ListBullet"/>
+      </w:pPr>
+      <w:r>
+        <w:rPr>
+          <w:rFonts w:ascii="Microsoft YaHei" w:hAnsi="Microsoft YaHei" w:eastAsia="Microsoft YaHei"/>
+          <w:color w:val="1E2630"/>
+          <w:sz w:val="21"/>
+        </w:rPr>
+        <w:t>QtClientController 使用 queued invoke 回到主线程，并用 lifecycle generation 丢弃旧播放器迟到事件。</w:t>
+      </w:r>
+    </w:p>
+    <w:p>
+      <w:pPr>
+        <w:pStyle w:val="ListBullet"/>
+      </w:pPr>
+      <w:r>
+        <w:rPr>
+          <w:rFonts w:ascii="Microsoft YaHei" w:hAnsi="Microsoft YaHei" w:eastAsia="Microsoft YaHei"/>
+          <w:color w:val="1E2630"/>
+          <w:sz w:val="21"/>
+        </w:rPr>
+        <w:t>媒体失败后主动离开房间，防止黑屏客户端继续发送无意义的 REPORT 并污染同步指标。</w:t>
+      </w:r>
+    </w:p>
+    <w:p>
+      <w:pPr>
+        <w:pStyle w:val="ListBullet"/>
+      </w:pPr>
+      <w:r>
+        <w:rPr>
+          <w:rFonts w:ascii="Microsoft YaHei" w:hAnsi="Microsoft YaHei" w:eastAsia="Microsoft YaHei"/>
+          <w:color w:val="1E2630"/>
+          <w:sz w:val="21"/>
+        </w:rPr>
+        <w:t>Qt 视频区域展示打开、缓冲百分比、失败和播放结束；错误不再表现为无法解释的黑屏。</w:t>
+      </w:r>
+    </w:p>
+    <w:p>
+      <w:pPr>
+        <w:spacing w:before="0" w:after="120" w:line="300" w:lineRule="auto"/>
+      </w:pPr>
+      <w:r>
+        <w:rPr>
+          <w:rFonts w:ascii="Microsoft YaHei" w:hAnsi="Microsoft YaHei" w:eastAsia="Microsoft YaHei"/>
+          <w:color w:val="1E2630"/>
+          <w:sz w:val="21"/>
+        </w:rPr>
+        <w:t>验证分为两层：MockPlayer 回归测试锁住播放器事件抽象；Windows/libVLC 集成测试打开一个不存在的媒体并等待异步 Error，确认第三方库线程到 PlayerEvent 的真实转换链路。Windows 两项测试与 Linux 核心测试均通过。CMake 同时兼容 Anaconda Qt 的非标准 _conda DLL 命名，构建后按 imported target 精确复制 Qt Core、Gui 和 Widgets 运行库。</w:t>
+      </w:r>
+    </w:p>
+    <w:p>
+      <w:pPr>
         <w:pStyle w:val="Heading1"/>
       </w:pPr>
       <w:r>
@@ -6162,6 +6316,19 @@
     </w:p>
     <w:p>
       <w:pPr>
+        <w:spacing w:before="0" w:after="120" w:line="300" w:lineRule="auto"/>
+      </w:pPr>
+      <w:r>
+        <w:rPr>
+          <w:rFonts w:ascii="Microsoft YaHei" w:hAnsi="Microsoft YaHei" w:eastAsia="Microsoft YaHei"/>
+          <w:color w:val="1E2630"/>
+          <w:sz w:val="21"/>
+        </w:rPr>
+        <w:t>第七段可以这样说明异步错误治理：最初 openMedia 返回成功后，错误 URL 仍会留下黑屏，因为 libVLC 的网络和解码错误发生在内部线程。我在 PlayerController 层抽象 Opening、Buffering、Error 等事件，LibVlcPlayer 负责订阅和生命周期解绑，QtClientController 再通过 queued invoke 回到主线程。同时用 generation 隔离旧会话迟到事件，并在播放失败后离开房间，避免无效进度污染同步测量。</w:t>
+      </w:r>
+    </w:p>
+    <w:p>
+      <w:pPr>
         <w:pStyle w:val="Heading1"/>
       </w:pPr>
       <w:r>
@@ -6230,6 +6397,45 @@
           <w:color w:val="1E2630"/>
           <w:sz w:val="21"/>
         </w:rPr>
+        <w:t>libvlc_event_attach/detach：异步第三方回调的订阅、线程边界和对象生命周期。</w:t>
+      </w:r>
+    </w:p>
+    <w:p>
+      <w:pPr>
+        <w:pStyle w:val="ListNumber"/>
+      </w:pPr>
+      <w:r>
+        <w:rPr>
+          <w:rFonts w:ascii="Microsoft YaHei" w:hAnsi="Microsoft YaHei" w:eastAsia="Microsoft YaHei"/>
+          <w:color w:val="1E2630"/>
+          <w:sz w:val="21"/>
+        </w:rPr>
+        <w:t>PlayerEvent 抽象：为什么底层事件要先翻译成领域类型，再交给 Qt 展示。</w:t>
+      </w:r>
+    </w:p>
+    <w:p>
+      <w:pPr>
+        <w:pStyle w:val="ListNumber"/>
+      </w:pPr>
+      <w:r>
+        <w:rPr>
+          <w:rFonts w:ascii="Microsoft YaHei" w:hAnsi="Microsoft YaHei" w:eastAsia="Microsoft YaHei"/>
+          <w:color w:val="1E2630"/>
+          <w:sz w:val="21"/>
+        </w:rPr>
+        <w:t>lifecycleGeneration：如何阻止旧播放器排队中的回调影响一次新的连接。</w:t>
+      </w:r>
+    </w:p>
+    <w:p>
+      <w:pPr>
+        <w:pStyle w:val="ListNumber"/>
+      </w:pPr>
+      <w:r>
+        <w:rPr>
+          <w:rFonts w:ascii="Microsoft YaHei" w:hAnsi="Microsoft YaHei" w:eastAsia="Microsoft YaHei"/>
+          <w:color w:val="1E2630"/>
+          <w:sz w:val="21"/>
+        </w:rPr>
         <w:t>CMake 的可选目标、find_package、AUTOMOC 和 POST_BUILD runtime 部署。</w:t>
       </w:r>
     </w:p>
@@ -6459,7 +6665,7 @@
           <w:color w:val="1E2630"/>
           <w:sz w:val="21"/>
         </w:rPr>
-        <w:t>提交媒体会话身份阶段，并同步部署新版 server 与 client 做切换影片回归。</w:t>
+        <w:t>设计专用校正协议：携带目标 client、room epoch、目标毫秒位置和命令 id，并要求应用结果回执。</w:t>
       </w:r>
     </w:p>
     <w:p>
@@ -6472,7 +6678,7 @@
           <w:color w:val="1E2630"/>
           <w:sz w:val="21"/>
         </w:rPr>
-        <w:t>打包完整 Qt/VLC runtime 目录，交给第二台电脑做真实用户验收。</w:t>
+        <w:t>项目功能闭环后统一部署新版 server，并把完整 Qt/VLC runtime 目录交给第二台电脑验收。</w:t>
       </w:r>
     </w:p>
     <w:p>
@@ -6486,19 +6692,6 @@
           <w:sz w:val="21"/>
         </w:rPr>
         <w:t>用两台真实设备采集 read_only 建议日志，统计建议频率、方向正确率和误触发场景。</w:t>
-      </w:r>
-    </w:p>
-    <w:p>
-      <w:pPr>
-        <w:pStyle w:val="ListNumber"/>
-      </w:pPr>
-      <w:r>
-        <w:rPr>
-          <w:rFonts w:ascii="Microsoft YaHei" w:hAnsi="Microsoft YaHei" w:eastAsia="Microsoft YaHei"/>
-          <w:color w:val="1E2630"/>
-          <w:sz w:val="21"/>
-        </w:rPr>
-        <w:t>设计专用校正协议：携带目标 client、room epoch、目标毫秒位置和命令 id，并要求应用结果回执。</w:t>
       </w:r>
     </w:p>
     <w:p>
@@ -6600,7 +6793,7 @@
           <w:color w:val="1E2630"/>
           <w:sz w:val="21"/>
         </w:rPr>
-        <w:t>Qt 桌面客户端已作为 81ec949 发布。当前在独立分支补齐媒体 JOIN 握手、活跃房间一致性检查和空房间状态重置。下一步完成 Windows/Linux 回归并部署新版 server/client，验证切换影片不会继承旧进度；随后把完整运行目录交给第二台电脑测试，再用异地日志校准阈值并打开最小校正闭环。</w:t>
+        <w:t>媒体会话身份已作为 10a19af 发布，本阶段已补齐 libVLC 异步打开、缓冲、失败和结束反馈，并用生命周期编号隔离旧播放器事件。下一步进入最小自动校正协议与执行回执；待功能闭环，再统一部署云端并用第二台电脑完成真实用户验收。</w:t>
       </w:r>
     </w:p>
     <w:sectPr>

</xml_diff>

<commit_message>
feat: close guarded sync correction loop
</commit_message>
<xml_diff>
--- a/docs/SyncCinema_Engineering_Journal.docx
+++ b/docs/SyncCinema_Engineering_Journal.docx
@@ -5917,7 +5917,7 @@
           <w:color w:val="1E2630"/>
           <w:sz w:val="21"/>
         </w:rPr>
-        <w:t>只读校正建议仍未闭环执行；UI 不会自动 seek 用户播放器。</w:t>
+        <w:t>自动硬 seek 已形成代码闭环，但尚未部署公网 server 并用两台真实电脑验证校正频率、方向和用户体感。</w:t>
       </w:r>
     </w:p>
     <w:p>
@@ -6230,6 +6230,230 @@
     </w:p>
     <w:p>
       <w:pPr>
+        <w:pStyle w:val="Heading2"/>
+      </w:pPr>
+      <w:r>
+        <w:t>7.11 最小自动同步校正闭环</w:t>
+      </w:r>
+    </w:p>
+    <w:p>
+      <w:pPr>
+        <w:spacing w:before="0" w:after="120" w:line="300" w:lineRule="auto"/>
+      </w:pPr>
+      <w:r>
+        <w:rPr>
+          <w:rFonts w:ascii="Microsoft YaHei" w:hAnsi="Microsoft YaHei" w:eastAsia="Microsoft YaHei"/>
+          <w:color w:val="1E2630"/>
+          <w:sz w:val="21"/>
+        </w:rPr>
+        <w:t>只读 correction_advice 已经能判断谁落后、偏差是否持续，但它无法改变真实播放器。直接把 would_seek_forward 改成 player.seek 又不安全：多个 client 同时操作时，本地先执行会让每台设备看到不同顺序；旧窗口产生的校正也可能在一次新的 PAUSE/SEEK 后误伤播放器。因此本阶段先建立权威控制顺序和可确认的命令生命周期，再启用最保守的单向硬 seek。</w:t>
+      </w:r>
+    </w:p>
+    <w:p>
+      <w:pPr>
+        <w:spacing w:before="80" w:after="160" w:line="264" w:lineRule="auto"/>
+        <w:shd w:fill="F7F8FA"/>
+        <w:ind w:left="180" w:right="180"/>
+      </w:pPr>
+      <w:r>
+        <w:rPr>
+          <w:rFonts w:ascii="Consolas" w:hAnsi="Consolas" w:eastAsia="Consolas"/>
+          <w:color w:val="1E2630"/>
+          <w:sz w:val="17"/>
+        </w:rPr>
+        <w:t>client user command: PLAY / PAUSE / SEEK</w:t>
+        <w:br/>
+      </w:r>
+      <w:r>
+        <w:rPr>
+          <w:rFonts w:ascii="Consolas" w:hAnsi="Consolas" w:eastAsia="Consolas"/>
+          <w:color w:val="1E2630"/>
+          <w:sz w:val="17"/>
+        </w:rPr>
+        <w:t xml:space="preserve">  -&gt; server Room allocates control_epoch</w:t>
+        <w:br/>
+      </w:r>
+      <w:r>
+        <w:rPr>
+          <w:rFonts w:ascii="Consolas" w:hAnsi="Consolas" w:eastAsia="Consolas"/>
+          <w:color w:val="1E2630"/>
+          <w:sz w:val="17"/>
+        </w:rPr>
+        <w:t xml:space="preserve">  -&gt; server broadcasts CONTROL &lt;epoch&gt; ... to every client</w:t>
+        <w:br/>
+      </w:r>
+      <w:r>
+        <w:rPr>
+          <w:rFonts w:ascii="Consolas" w:hAnsi="Consolas" w:eastAsia="Consolas"/>
+          <w:color w:val="1E2630"/>
+          <w:sz w:val="17"/>
+        </w:rPr>
+        <w:t xml:space="preserve">  -&gt; clients execute the same authoritative order</w:t>
+        <w:br/>
+      </w:r>
+      <w:r>
+        <w:rPr>
+          <w:rFonts w:ascii="Consolas" w:hAnsi="Consolas" w:eastAsia="Consolas"/>
+          <w:color w:val="1E2630"/>
+          <w:sz w:val="17"/>
+        </w:rPr>
+        <w:br/>
+      </w:r>
+      <w:r>
+        <w:rPr>
+          <w:rFonts w:ascii="Consolas" w:hAnsi="Consolas" w:eastAsia="Consolas"/>
+          <w:color w:val="1E2630"/>
+          <w:sz w:val="17"/>
+        </w:rPr>
+        <w:t>REPORT windows -&gt; SyncCorrectionProposal</w:t>
+        <w:br/>
+      </w:r>
+      <w:r>
+        <w:rPr>
+          <w:rFonts w:ascii="Consolas" w:hAnsi="Consolas" w:eastAsia="Consolas"/>
+          <w:color w:val="1E2630"/>
+          <w:sz w:val="17"/>
+        </w:rPr>
+        <w:t xml:space="preserve">  -&gt; CORRECT &lt;command_id&gt; &lt;epoch&gt; &lt;state&gt; &lt;forward_ms&gt;</w:t>
+        <w:br/>
+      </w:r>
+      <w:r>
+        <w:rPr>
+          <w:rFonts w:ascii="Consolas" w:hAnsi="Consolas" w:eastAsia="Consolas"/>
+          <w:color w:val="1E2630"/>
+          <w:sz w:val="17"/>
+        </w:rPr>
+        <w:t xml:space="preserve">  -&gt; target client validates and seeks forward</w:t>
+        <w:br/>
+      </w:r>
+      <w:r>
+        <w:rPr>
+          <w:rFonts w:ascii="Consolas" w:hAnsi="Consolas" w:eastAsia="Consolas"/>
+          <w:color w:val="1E2630"/>
+          <w:sz w:val="17"/>
+        </w:rPr>
+        <w:t xml:space="preserve">  -&gt; CORRECT_RESULT &lt;command_id&gt; &lt;epoch&gt; &lt;status&gt; &lt;position_ms&gt; &lt;reason&gt;</w:t>
+      </w:r>
+    </w:p>
+    <w:p>
+      <w:pPr>
+        <w:pStyle w:val="ListBullet"/>
+      </w:pPr>
+      <w:r>
+        <w:rPr>
+          <w:rFonts w:ascii="Microsoft YaHei" w:hAnsi="Microsoft YaHei" w:eastAsia="Microsoft YaHei"/>
+          <w:color w:val="1E2630"/>
+          <w:sz w:val="21"/>
+        </w:rPr>
+        <w:t>普通控制不再由发起端立即本地执行，而是等待 server 回显 CONTROL；epoch 连续才执行，出现缺口则断开，避免明知状态已分叉仍继续播放。</w:t>
+      </w:r>
+    </w:p>
+    <w:p>
+      <w:pPr>
+        <w:pStyle w:val="ListBullet"/>
+      </w:pPr>
+      <w:r>
+        <w:rPr>
+          <w:rFonts w:ascii="Microsoft YaHei" w:hAnsi="Microsoft YaHei" w:eastAsia="Microsoft YaHei"/>
+          <w:color w:val="1E2630"/>
+          <w:sz w:val="21"/>
+        </w:rPr>
+        <w:t>SyncMetricsCollector 一次 REPORT 最多选择一个提案，并按目标 client 冷却；三人以上房间不会因不同 pair 连续校正同一落后端。</w:t>
+      </w:r>
+    </w:p>
+    <w:p>
+      <w:pPr>
+        <w:pStyle w:val="ListBullet"/>
+      </w:pPr>
+      <w:r>
+        <w:rPr>
+          <w:rFonts w:ascii="Microsoft YaHei" w:hAnsi="Microsoft YaHei" w:eastAsia="Microsoft YaHei"/>
+          <w:color w:val="1E2630"/>
+          <w:sz w:val="21"/>
+        </w:rPr>
+        <w:t>SyncCorrectionCoordinator 分配单调 command id，维护 10 秒 pending 表，严格匹配目标 client 与 epoch；错误来源、旧 epoch 和重复 ACK 都不能消费真实命令。</w:t>
+      </w:r>
+    </w:p>
+    <w:p>
+      <w:pPr>
+        <w:pStyle w:val="ListBullet"/>
+      </w:pPr>
+      <w:r>
+        <w:rPr>
+          <w:rFonts w:ascii="Microsoft YaHei" w:hAnsi="Microsoft YaHei" w:eastAsia="Microsoft YaHei"/>
+          <w:color w:val="1E2630"/>
+          <w:sz w:val="21"/>
+        </w:rPr>
+        <w:t>SyncCorrectionExecutor 在 playerMutex 内复核 epoch、播放状态、seekable、目标范围和媒体时长，只允许落后端向前 seek；所有成功或拒绝路径都返回稳定 reason。</w:t>
+      </w:r>
+    </w:p>
+    <w:p>
+      <w:pPr>
+        <w:pStyle w:val="ListBullet"/>
+      </w:pPr>
+      <w:r>
+        <w:rPr>
+          <w:rFonts w:ascii="Microsoft YaHei" w:hAnsi="Microsoft YaHei" w:eastAsia="Microsoft YaHei"/>
+          <w:color w:val="1E2630"/>
+          <w:sz w:val="21"/>
+        </w:rPr>
+        <w:t>新的用户控制会使旧 epoch pending 命令失效；同一目标只允许一条未确认命令，发送失败不进入冷却，ACK 丢失也不会叠加 seek。</w:t>
+      </w:r>
+    </w:p>
+    <w:p>
+      <w:pPr>
+        <w:pStyle w:val="ListBullet"/>
+      </w:pPr>
+      <w:r>
+        <w:rPr>
+          <w:rFonts w:ascii="Microsoft YaHei" w:hAnsi="Microsoft YaHei" w:eastAsia="Microsoft YaHei"/>
+          <w:color w:val="1E2630"/>
+          <w:sz w:val="21"/>
+        </w:rPr>
+        <w:t>REPORT 协议显式携带 client 已应用的 control epoch；server 只接受与当前 Room epoch 完全一致的样本，防止网络中迟到的旧进度进入新窗口并误触发校正。</w:t>
+      </w:r>
+    </w:p>
+    <w:p>
+      <w:pPr>
+        <w:pStyle w:val="ListBullet"/>
+      </w:pPr>
+      <w:r>
+        <w:rPr>
+          <w:rFonts w:ascii="Microsoft YaHei" w:hAnsi="Microsoft YaHei" w:eastAsia="Microsoft YaHei"/>
+          <w:color w:val="1E2630"/>
+          <w:sz w:val="21"/>
+        </w:rPr>
+        <w:t>心跳、JOIN、断开和主动校正发送共用连接顺序锁，避免旧 socket 关闭并复用后被心跳线程误发；所有 server-side metric 行共用一把日志锁。</w:t>
+      </w:r>
+    </w:p>
+    <w:p>
+      <w:pPr>
+        <w:pStyle w:val="ListBullet"/>
+      </w:pPr>
+      <w:r>
+        <w:rPr>
+          <w:rFonts w:ascii="Microsoft YaHei" w:hAnsi="Microsoft YaHei" w:eastAsia="Microsoft YaHei"/>
+          <w:color w:val="1E2630"/>
+          <w:sz w:val="21"/>
+        </w:rPr>
+        <w:t>Qt、CLI 和播放器集成测试共享一个 SyncCinemaVlcRuntime 构建目标，由它统一复制 DLL 与 plugins；避免 Ninja 并行构建时多个 POST_BUILD 同时写同一目录而偶发 Permission denied。</w:t>
+      </w:r>
+    </w:p>
+    <w:p>
+      <w:pPr>
+        <w:spacing w:before="0" w:after="120" w:line="300" w:lineRule="auto"/>
+      </w:pPr>
+      <w:r>
+        <w:rPr>
+          <w:rFonts w:ascii="Microsoft YaHei" w:hAnsi="Microsoft YaHei" w:eastAsia="Microsoft YaHei"/>
+          <w:color w:val="1E2630"/>
+          <w:sz w:val="21"/>
+        </w:rPr>
+        <w:t>测试新增 CONTROL/CORRECT/CORRECT_RESULT 协议边界、协调器完整生命周期和 MockPlayer 执行器安全门。Windows 完整构建 Qt、CLI、server 与两项测试，CTest 2/2 通过；WSL Linux server 与核心测试通过。本机双 TCP 端烟雾测试还验证了两端收到相同 CONTROL 1 PLAY，旧 epoch REPORT 被明确拒绝，持续约 1.2 秒偏差触发一次定向 CORRECT，server 最终匹配到 APPLIED 回执。本阶段尚未部署云端，因此结论是‘工程闭环与跨平台回归成立’，不能提前声称真实异地同步效果已经改善。</w:t>
+      </w:r>
+    </w:p>
+    <w:p>
+      <w:pPr>
         <w:pStyle w:val="Heading1"/>
       </w:pPr>
       <w:r>
@@ -6285,7 +6509,7 @@
           <w:color w:val="1E2630"/>
           <w:sz w:val="21"/>
         </w:rPr>
-        <w:t>第四段可以这样说明控制安全性：有了相对偏差后我没有直接 seek，而是把测量、决策和执行拆成三层。纯策略层按稳定期、窗口、状态、RTT、阈值、方向一致率、连续异常和冷却逐层放行，只输出 would_seek_forward 及可解释 reason。它只让落后端向前追赶，并通过跨平台单元测试和双客户端集成测试验证 window_not_ready、persistent_skew、cooldown 的状态序列。当前仍是 read_only，先用公网数据验证误触发率，再接入真正的命令执行和回执。</w:t>
+        <w:t>第四段可以这样说明控制安全性：有了相对偏差后我没有直接 seek，而是把测量、决策和执行拆成三层。纯策略层按稳定期、窗口、状态、RTT、阈值、方向一致率、连续异常和冷却逐层放行，先用 read_only 建议验证 window_not_ready、persistent_skew、cooldown 的状态序列，再升级为最小执行闭环。server 用权威 CONTROL epoch 统一普通操作顺序，协调器为校正分配 command id 并匹配 ACK；client 再次验证 epoch、状态和 seek 能力后只让落后端向前追赶。这样旧命令、重复回执和 ACK 丢失都不会造成连续误跳。</w:t>
       </w:r>
     </w:p>
     <w:p>
@@ -6649,14 +6873,6 @@
     </w:p>
     <w:p>
       <w:pPr>
-        <w:pStyle w:val="Heading1"/>
-      </w:pPr>
-      <w:r>
-        <w:t>10. 后续工程路线</w:t>
-      </w:r>
-    </w:p>
-    <w:p>
-      <w:pPr>
         <w:pStyle w:val="ListNumber"/>
       </w:pPr>
       <w:r>
@@ -6665,7 +6881,7 @@
           <w:color w:val="1E2630"/>
           <w:sz w:val="21"/>
         </w:rPr>
-        <w:t>设计专用校正协议：携带目标 client、room epoch、目标毫秒位置和命令 id，并要求应用结果回执。</w:t>
+        <w:t>SyncCorrectionCoordinator：pending 命令、超时、错误 client/epoch、重复 ACK 和断开清理如何构成命令生命周期。</w:t>
       </w:r>
     </w:p>
     <w:p>
@@ -6678,7 +6894,7 @@
           <w:color w:val="1E2630"/>
           <w:sz w:val="21"/>
         </w:rPr>
-        <w:t>项目功能闭环后统一部署新版 server，并把完整 Qt/VLC runtime 目录交给第二台电脑验收。</w:t>
+        <w:t>SyncCorrectionExecutor：为什么把播放器安全门从 Windows 会话层抽出，才能用 MockPlayer 做 Linux/Windows 同一套回归。</w:t>
       </w:r>
     </w:p>
     <w:p>
@@ -6691,7 +6907,7 @@
           <w:color w:val="1E2630"/>
           <w:sz w:val="21"/>
         </w:rPr>
-        <w:t>用两台真实设备采集 read_only 建议日志，统计建议频率、方向正确率和误触发场景。</w:t>
+        <w:t>CONTROL epoch：为什么本地操作也要等待 server 回显，以及 epoch gap 为什么应视为不可继续的协议错误。</w:t>
       </w:r>
     </w:p>
     <w:p>
@@ -6704,7 +6920,7 @@
           <w:color w:val="1E2630"/>
           <w:sz w:val="21"/>
         </w:rPr>
-        <w:t>加入最小闭环硬 seek：server 只向落后端发送，client 再次校验 epoch，执行后上报实际位置；失败时不连续重试。</w:t>
+        <w:t>目标 client 级冷却：为什么多人房间不能只按 pair 冷却。</w:t>
       </w:r>
     </w:p>
     <w:p>
@@ -6717,7 +6933,15 @@
           <w:color w:val="1E2630"/>
           <w:sz w:val="21"/>
         </w:rPr>
-        <w:t>为普通控制广播加入 epoch/命令 id，完善重连后的过期消息过滤和幂等语义。</w:t>
+        <w:t>MetricLogger：当指标跨多个 cpp 产生时，为什么每个类各自一把日志锁仍然不够。</w:t>
+      </w:r>
+    </w:p>
+    <w:p>
+      <w:pPr>
+        <w:pStyle w:val="Heading1"/>
+      </w:pPr>
+      <w:r>
+        <w:t>10. 后续工程路线</w:t>
       </w:r>
     </w:p>
     <w:p>
@@ -6730,7 +6954,59 @@
           <w:color w:val="1E2630"/>
           <w:sz w:val="21"/>
         </w:rPr>
-        <w:t>云端闭环稳定后，再研究 250-750 ms 小偏差的温和校正；暂不贸然引入倍速控制。</w:t>
+        <w:t>提交并推送最小自动校正闭环，随后统一部署新版 Linux server，避免客户端与旧协议 server 混用。</w:t>
+      </w:r>
+    </w:p>
+    <w:p>
+      <w:pPr>
+        <w:pStyle w:val="ListNumber"/>
+      </w:pPr>
+      <w:r>
+        <w:rPr>
+          <w:rFonts w:ascii="Microsoft YaHei" w:hAnsi="Microsoft YaHei" w:eastAsia="Microsoft YaHei"/>
+          <w:color w:val="1E2630"/>
+          <w:sz w:val="21"/>
+        </w:rPr>
+        <w:t>用两台真实电脑完成同媒体、相同公网 server 的验收，采集 correction_decision、correction_command、correction_execution 和 correction_result 全链路日志。</w:t>
+      </w:r>
+    </w:p>
+    <w:p>
+      <w:pPr>
+        <w:pStyle w:val="ListNumber"/>
+      </w:pPr>
+      <w:r>
+        <w:rPr>
+          <w:rFonts w:ascii="Microsoft YaHei" w:hAnsi="Microsoft YaHei" w:eastAsia="Microsoft YaHei"/>
+          <w:color w:val="1E2630"/>
+          <w:sz w:val="21"/>
+        </w:rPr>
+        <w:t>制造持续 750 ms 以上落后，验证只校正落后端、ACK 能匹配、5 秒冷却生效，并观察是否出现过冲或反复 seek。</w:t>
+      </w:r>
+    </w:p>
+    <w:p>
+      <w:pPr>
+        <w:pStyle w:val="ListNumber"/>
+      </w:pPr>
+      <w:r>
+        <w:rPr>
+          <w:rFonts w:ascii="Microsoft YaHei" w:hAnsi="Microsoft YaHei" w:eastAsia="Microsoft YaHei"/>
+          <w:color w:val="1E2630"/>
+          <w:sz w:val="21"/>
+        </w:rPr>
+        <w:t>统计校正前后 pair median/P95、命令成功率、拒绝原因和用户可见跳转频率，再决定是否调整阈值。</w:t>
+      </w:r>
+    </w:p>
+    <w:p>
+      <w:pPr>
+        <w:pStyle w:val="ListNumber"/>
+      </w:pPr>
+      <w:r>
+        <w:rPr>
+          <w:rFonts w:ascii="Microsoft YaHei" w:hAnsi="Microsoft YaHei" w:eastAsia="Microsoft YaHei"/>
+          <w:color w:val="1E2630"/>
+          <w:sz w:val="21"/>
+        </w:rPr>
+        <w:t>公网硬 seek 闭环稳定后，再研究 250-750 ms 小偏差的温和校正；暂不贸然引入倍速控制。</w:t>
       </w:r>
     </w:p>
     <w:p>
@@ -6793,7 +7069,7 @@
           <w:color w:val="1E2630"/>
           <w:sz w:val="21"/>
         </w:rPr>
-        <w:t>媒体会话身份已作为 10a19af 发布，本阶段已补齐 libVLC 异步打开、缓冲、失败和结束反馈，并用生命周期编号隔离旧播放器事件。下一步进入最小自动校正协议与执行回执；待功能闭环，再统一部署云端并用第二台电脑完成真实用户验收。</w:t>
+        <w:t>最小自动校正已经完成代码闭环与 Windows/Linux 回归：普通控制具备权威 epoch，server 能定向派发带 command id 的 CORRECT，client 安全执行并返回结构化结果。下一步不再扩功能，而是 review/提交后统一部署云端，用两台真实电脑验证校正方向、频率、回执和体感，再根据数据调整阈值。</w:t>
       </w:r>
     </w:p>
     <w:sectPr>

</xml_diff>